<commit_message>
# feature: Correções no artigo e inserção de imagens
</commit_message>
<xml_diff>
--- a/series_temporais/relatorio/Modelagem e Previsão da Superfície de Água em Belo Horizonte.docx
+++ b/series_temporais/relatorio/Modelagem e Previsão da Superfície de Água em Belo Horizonte.docx
@@ -1,20 +1,11 @@
 
 <file path=word/document.xml><?xml version="1.0" encoding="utf-8"?>
-<w:document xmlns:wpc="http://schemas.microsoft.com/office/word/2010/wordprocessingCanvas" xmlns:cx="http://schemas.microsoft.com/office/drawing/2014/chartex" xmlns:cx1="http://schemas.microsoft.com/office/drawing/2015/9/8/chartex" xmlns:cx2="http://schemas.microsoft.com/office/drawing/2015/10/21/chartex" xmlns:cx3="http://schemas.microsoft.com/office/drawing/2016/5/9/chartex" xmlns:cx4="http://schemas.microsoft.com/office/drawing/2016/5/10/chartex" xmlns:cx5="http://schemas.microsoft.com/office/drawing/2016/5/11/chartex" xmlns:cx6="http://schemas.microsoft.com/office/drawing/2016/5/12/chartex" xmlns:cx7="http://schemas.microsoft.com/office/drawing/2016/5/13/chartex" xmlns:cx8="http://schemas.microsoft.com/office/drawing/2016/5/14/chartex" xmlns:mc="http://schemas.openxmlformats.org/markup-compatibility/2006" xmlns:aink="http://schemas.microsoft.com/office/drawing/2016/ink" xmlns:am3d="http://schemas.microsoft.com/office/drawing/2017/model3d" xmlns:o="urn:schemas-microsoft-com:office:office" xmlns:oel="http://schemas.microsoft.com/office/2019/extlst" xmlns:r="http://schemas.openxmlformats.org/officeDocument/2006/relationships" xmlns:m="http://schemas.openxmlformats.org/officeDocument/2006/math" xmlns:v="urn:schemas-microsoft-com:vml" xmlns:wp14="http://schemas.microsoft.com/office/word/2010/wordprocessingDrawing" xmlns:wp="http://schemas.openxmlformats.org/drawingml/2006/wordprocessingDrawing" xmlns:w10="urn:schemas-microsoft-com:office:word" xmlns:w="http://schemas.openxmlformats.org/wordprocessingml/2006/main" xmlns:w14="http://schemas.microsoft.com/office/word/2010/wordml" xmlns:w15="http://schemas.microsoft.com/office/word/2012/wordml" xmlns:w16cex="http://schemas.microsoft.com/office/word/2018/wordml/cex" xmlns:w16cid="http://schemas.microsoft.com/office/word/2016/wordml/cid" xmlns:w16="http://schemas.microsoft.com/office/word/2018/wordml" xmlns:w16du="http://schemas.microsoft.com/office/word/2023/wordml/word16du" xmlns:w16sdtdh="http://schemas.microsoft.com/office/word/2020/wordml/sdtdatahash" xmlns:w16sdtfl="http://schemas.microsoft.com/office/word/2024/wordml/sdtformatlock" xmlns:w16se="http://schemas.microsoft.com/office/word/2015/wordml/symex" xmlns:wpg="http://schemas.microsoft.com/office/word/2010/wordprocessingGroup" xmlns:wpi="http://schemas.microsoft.com/office/word/2010/wordprocessingInk" xmlns:wne="http://schemas.microsoft.com/office/word/2006/wordml" xmlns:wps="http://schemas.microsoft.com/office/word/2010/wordprocessingShape" mc:Ignorable="w14 w15 w16se w16cid w16 w16cex w16sdtdh w16sdtfl w16du wp14">
+<w:document xmlns:wpc="http://schemas.microsoft.com/office/word/2010/wordprocessingCanvas" xmlns:cx="http://schemas.microsoft.com/office/drawing/2014/chartex" xmlns:cx1="http://schemas.microsoft.com/office/drawing/2015/9/8/chartex" xmlns:cx2="http://schemas.microsoft.com/office/drawing/2015/10/21/chartex" xmlns:cx3="http://schemas.microsoft.com/office/drawing/2016/5/9/chartex" xmlns:cx4="http://schemas.microsoft.com/office/drawing/2016/5/10/chartex" xmlns:cx5="http://schemas.microsoft.com/office/drawing/2016/5/11/chartex" xmlns:cx6="http://schemas.microsoft.com/office/drawing/2016/5/12/chartex" xmlns:cx7="http://schemas.microsoft.com/office/drawing/2016/5/13/chartex" xmlns:cx8="http://schemas.microsoft.com/office/drawing/2016/5/14/chartex" xmlns:mc="http://schemas.openxmlformats.org/markup-compatibility/2006" xmlns:aink="http://schemas.microsoft.com/office/drawing/2016/ink" xmlns:am3d="http://schemas.microsoft.com/office/drawing/2017/model3d" xmlns:o="urn:schemas-microsoft-com:office:office" xmlns:oel="http://schemas.microsoft.com/office/2019/extlst" xmlns:r="http://schemas.openxmlformats.org/officeDocument/2006/relationships" xmlns:m="http://schemas.openxmlformats.org/officeDocument/2006/math" xmlns:v="urn:schemas-microsoft-com:vml" xmlns:wp14="http://schemas.microsoft.com/office/word/2010/wordprocessingDrawing" xmlns:wp="http://schemas.openxmlformats.org/drawingml/2006/wordprocessingDrawing" xmlns:w10="urn:schemas-microsoft-com:office:word" xmlns:w="http://schemas.openxmlformats.org/wordprocessingml/2006/main" xmlns:w14="http://schemas.microsoft.com/office/word/2010/wordml" xmlns:w15="http://schemas.microsoft.com/office/word/2012/wordml" xmlns:w16cex="http://schemas.microsoft.com/office/word/2018/wordml/cex" xmlns:w16cid="http://schemas.microsoft.com/office/word/2016/wordml/cid" xmlns:w16="http://schemas.microsoft.com/office/word/2018/wordml" xmlns:w16sdtdh="http://schemas.microsoft.com/office/word/2020/wordml/sdtdatahash" xmlns:w16se="http://schemas.microsoft.com/office/word/2015/wordml/symex" xmlns:wpg="http://schemas.microsoft.com/office/word/2010/wordprocessingGroup" xmlns:wpi="http://schemas.microsoft.com/office/word/2010/wordprocessingInk" xmlns:wne="http://schemas.microsoft.com/office/word/2006/wordml" xmlns:wps="http://schemas.microsoft.com/office/word/2010/wordprocessingShape" mc:Ignorable="w14 w15 w16se w16cid w16 w16cex w16sdtdh wp14">
   <w:body>
     <w:p>
       <w:pPr>
-        <w:pStyle w:val="Title"/>
+        <w:pStyle w:val="Ttulo"/>
         <w:jc w:val="center"/>
-        <w:rPr>
-          <w:rFonts w:ascii="Times New Roman" w:hAnsi="Times New Roman"/>
-          <w:spacing w:val="0"/>
-          <w:sz w:val="32"/>
-          <w:szCs w:val="32"/>
-          <w:lang w:val="pt-BR"/>
-        </w:rPr>
-      </w:pPr>
-      <w:r>
         <w:rPr>
           <w:rFonts w:ascii="Times New Roman" w:hAnsi="Times New Roman"/>
           <w:b/>
@@ -24,34 +15,36 @@
           <w:szCs w:val="32"/>
           <w:lang w:val="pt-BR"/>
         </w:rPr>
-        <w:t>MODELAGEM E PREVISÃO DA SUPERFÍCIE DE ÁGUA EM BELO HORIZONTE (MG): COMPARAÇÃO ENTRE SUAVIZAÇÃO EXPONENCIAL, ARIMA E ETS</w:t>
-      </w:r>
-    </w:p>
-    <w:p>
-      <w:pPr>
-        <w:spacing w:after="240"/>
-        <w:jc w:val="center"/>
-        <w:rPr>
-          <w:rFonts w:ascii="Times New Roman" w:hAnsi="Times New Roman"/>
-          <w:lang w:val="pt-BR"/>
-        </w:rPr>
       </w:pPr>
       <w:r>
         <w:rPr>
           <w:rFonts w:ascii="Times New Roman" w:hAnsi="Times New Roman"/>
           <w:b/>
           <w:bCs/>
-          <w:lang w:val="pt-BR"/>
-        </w:rPr>
-        <w:t>Ettore Gabriel Braga</w:t>
-      </w:r>
-      <w:r>
-        <w:rPr>
-          <w:rFonts w:ascii="Times New Roman" w:hAnsi="Times New Roman"/>
-          <w:lang w:val="pt-BR"/>
-        </w:rPr>
-        <w:br/>
-      </w:r>
+          <w:spacing w:val="0"/>
+          <w:sz w:val="32"/>
+          <w:szCs w:val="32"/>
+          <w:lang w:val="pt-BR"/>
+        </w:rPr>
+        <w:t>MODELAGEM E PREVISÃO DA SUPERFÍCIE DE ÁGUA EM BELO HORIZONTE (MG): COMPARAÇÃO ENTRE SUAVIZAÇÃO EXPONENCIAL, ARIMA E ETS</w:t>
+      </w:r>
+    </w:p>
+    <w:p>
+      <w:pPr>
+        <w:rPr>
+          <w:lang w:val="pt-BR"/>
+        </w:rPr>
+      </w:pPr>
+    </w:p>
+    <w:p>
+      <w:pPr>
+        <w:spacing w:after="240"/>
+        <w:jc w:val="right"/>
+        <w:rPr>
+          <w:rFonts w:ascii="Times New Roman" w:hAnsi="Times New Roman"/>
+          <w:lang w:val="pt-BR"/>
+        </w:rPr>
+      </w:pPr>
       <w:r>
         <w:rPr>
           <w:rFonts w:ascii="Times New Roman" w:hAnsi="Times New Roman"/>
@@ -59,15 +52,57 @@
           <w:bCs/>
           <w:lang w:val="pt-BR"/>
         </w:rPr>
+        <w:t>Ettore Gabriel Emilio Reis Braga</w:t>
+      </w:r>
+      <w:r>
+        <w:rPr>
+          <w:rFonts w:ascii="Times New Roman" w:hAnsi="Times New Roman"/>
+          <w:b/>
+          <w:bCs/>
+          <w:lang w:val="pt-BR"/>
+        </w:rPr>
+        <w:t>¹</w:t>
+      </w:r>
+      <w:r>
+        <w:rPr>
+          <w:rFonts w:ascii="Times New Roman" w:hAnsi="Times New Roman"/>
+          <w:lang w:val="pt-BR"/>
+        </w:rPr>
+        <w:br/>
+      </w:r>
+      <w:r>
+        <w:rPr>
+          <w:rFonts w:ascii="Times New Roman" w:hAnsi="Times New Roman"/>
+          <w:b/>
+          <w:bCs/>
+          <w:lang w:val="pt-BR"/>
+        </w:rPr>
         <w:t>Sheila Regina Oro</w:t>
       </w:r>
       <w:r>
         <w:rPr>
           <w:rFonts w:ascii="Times New Roman" w:hAnsi="Times New Roman"/>
+          <w:b/>
+          <w:bCs/>
+          <w:lang w:val="pt-BR"/>
+        </w:rPr>
+        <w:t>²</w:t>
+      </w:r>
+      <w:r>
+        <w:rPr>
+          <w:rFonts w:ascii="Times New Roman" w:hAnsi="Times New Roman"/>
           <w:lang w:val="pt-BR"/>
         </w:rPr>
         <w:br/>
-        <w:t>Especialização em Métodos Matemáticos Aplicados – CEMMA</w:t>
+        <w:t xml:space="preserve">Especialização em Métodos Matemáticos Aplicados – </w:t>
+      </w:r>
+      <w:r>
+        <w:rPr>
+          <w:rFonts w:ascii="Times New Roman" w:hAnsi="Times New Roman"/>
+          <w:u w:val="single"/>
+          <w:lang w:val="pt-BR"/>
+        </w:rPr>
+        <w:t>CEMMA</w:t>
       </w:r>
       <w:r>
         <w:rPr>
@@ -75,12 +110,19 @@
           <w:lang w:val="pt-BR"/>
         </w:rPr>
         <w:br/>
-        <w:t>E-mail: seuemail@dominio.com</w:t>
-      </w:r>
-    </w:p>
-    <w:p>
-      <w:pPr>
-        <w:pStyle w:val="Heading1"/>
+        <w:t xml:space="preserve">E-mail: </w:t>
+      </w:r>
+      <w:r>
+        <w:rPr>
+          <w:rFonts w:ascii="Times New Roman" w:hAnsi="Times New Roman"/>
+          <w:lang w:val="pt-BR"/>
+        </w:rPr>
+        <w:t>ettoregabriel@alunos.utfpr.edu.br</w:t>
+      </w:r>
+    </w:p>
+    <w:p>
+      <w:pPr>
+        <w:pStyle w:val="Ttulo1"/>
         <w:rPr>
           <w:rFonts w:ascii="Times New Roman" w:hAnsi="Times New Roman"/>
           <w:color w:val="000000"/>
@@ -115,7 +157,135 @@
           <w:rFonts w:ascii="Times New Roman" w:hAnsi="Times New Roman"/>
           <w:lang w:val="pt-BR"/>
         </w:rPr>
-        <w:t>Este trabalho analisa a série temporal mensal da superfície de água (ha) do município de Belo Horizonte (MG) no período de janeiro de 1985 a dezembro de 2024, totalizando 480 observações provenientes do Projeto MapBiomas Água, Coleção 4. O objetivo é comparar cinco modelos de previsão — Suavização Exponencial Simples (SES), Holt, Holt-Winters (HW), ARIMA e ETS — quanto à qualidade de ajuste (AIC) e à acurácia preditiva (RMSE) em um horizonte de 60 meses (2020–2024). O Teste Dickey-Fuller Aumentado confirmou estacionariedade da série (DF = -4,07; p &lt; 0,01). A seleção automática por AIC indicou o modelo ARIMA(3,0,2)(0,1,1)[12] com constante como melhor ajuste na base de treino (AIC = 3094,43). Entretanto, na base de teste, o modelo SES apresentou menor RMSE (51,37 ha), superando o ARIMA (61,72 ha). A discrepância é atribuída a uma ruptura estrutural observada em 2023–2024, na qual a superfície de água atingiu máximas históricas de até 399 ha, extrapolando o padrão aprendido pelos modelos paramétricos. Conclui-se que o modelo de melhor ajuste pelo AIC não é necessariamente o mais acurado na previsão fora da amostra, ressaltando a importância da avaliação por desempenho preditivo em séries com mudanças de regime.</w:t>
+        <w:t xml:space="preserve">Este trabalho analisa a série temporal mensal da superfície de água (ha) do município de Belo Horizonte (MG) no período de janeiro de 1985 a </w:t>
+      </w:r>
+      <w:r>
+        <w:rPr>
+          <w:rFonts w:ascii="Times New Roman" w:hAnsi="Times New Roman"/>
+          <w:lang w:val="pt-BR"/>
+        </w:rPr>
+        <w:t>dezembro</w:t>
+      </w:r>
+      <w:r>
+        <w:rPr>
+          <w:rFonts w:ascii="Times New Roman" w:hAnsi="Times New Roman"/>
+          <w:lang w:val="pt-BR"/>
+        </w:rPr>
+        <w:t xml:space="preserve"> de 2024, totalizando 480 observações provenientes do Projeto MapBiomas Água, Coleção 4. O </w:t>
+      </w:r>
+      <w:r>
+        <w:rPr>
+          <w:rFonts w:ascii="Times New Roman" w:hAnsi="Times New Roman"/>
+          <w:lang w:val="pt-BR"/>
+        </w:rPr>
+        <w:t>objetivo</w:t>
+      </w:r>
+      <w:r>
+        <w:rPr>
+          <w:rFonts w:ascii="Times New Roman" w:hAnsi="Times New Roman"/>
+          <w:lang w:val="pt-BR"/>
+        </w:rPr>
+        <w:t xml:space="preserve"> é comparar cinco modelos de previsão</w:t>
+      </w:r>
+      <w:r>
+        <w:rPr>
+          <w:rFonts w:ascii="Times New Roman" w:hAnsi="Times New Roman"/>
+          <w:lang w:val="pt-BR"/>
+        </w:rPr>
+        <w:t xml:space="preserve">: </w:t>
+      </w:r>
+      <w:r>
+        <w:rPr>
+          <w:rFonts w:ascii="Times New Roman" w:hAnsi="Times New Roman"/>
+          <w:lang w:val="pt-BR"/>
+        </w:rPr>
+        <w:t>Suavização Exponencial Simples (SES), Holt, Holt-Winters (HW), ARIMA e ETS</w:t>
+      </w:r>
+      <w:r>
+        <w:rPr>
+          <w:rFonts w:ascii="Times New Roman" w:hAnsi="Times New Roman"/>
+          <w:lang w:val="pt-BR"/>
+        </w:rPr>
+        <w:t xml:space="preserve">. E avaliar a </w:t>
+      </w:r>
+      <w:r>
+        <w:rPr>
+          <w:rFonts w:ascii="Times New Roman" w:hAnsi="Times New Roman"/>
+          <w:lang w:val="pt-BR"/>
+        </w:rPr>
+        <w:t xml:space="preserve">qualidade de ajuste (AIC) e </w:t>
+      </w:r>
+      <w:r>
+        <w:rPr>
+          <w:rFonts w:ascii="Times New Roman" w:hAnsi="Times New Roman"/>
+          <w:lang w:val="pt-BR"/>
+        </w:rPr>
+        <w:t>medir</w:t>
+      </w:r>
+      <w:r>
+        <w:rPr>
+          <w:rFonts w:ascii="Times New Roman" w:hAnsi="Times New Roman"/>
+          <w:lang w:val="pt-BR"/>
+        </w:rPr>
+        <w:t xml:space="preserve"> </w:t>
+      </w:r>
+      <w:r>
+        <w:rPr>
+          <w:rFonts w:ascii="Times New Roman" w:hAnsi="Times New Roman"/>
+          <w:lang w:val="pt-BR"/>
+        </w:rPr>
+        <w:t xml:space="preserve">a </w:t>
+      </w:r>
+      <w:r>
+        <w:rPr>
+          <w:rFonts w:ascii="Times New Roman" w:hAnsi="Times New Roman"/>
+          <w:lang w:val="pt-BR"/>
+        </w:rPr>
+        <w:t>acurácia preditiva</w:t>
+      </w:r>
+      <w:r>
+        <w:rPr>
+          <w:rFonts w:ascii="Times New Roman" w:hAnsi="Times New Roman"/>
+          <w:lang w:val="pt-BR"/>
+        </w:rPr>
+        <w:t xml:space="preserve"> por meio da métrica de erro quadrático médio</w:t>
+      </w:r>
+      <w:r>
+        <w:rPr>
+          <w:rFonts w:ascii="Times New Roman" w:hAnsi="Times New Roman"/>
+          <w:lang w:val="pt-BR"/>
+        </w:rPr>
+        <w:t xml:space="preserve"> (RMSE) em um horizonte de 60 meses (2020–2024). O Teste Dickey-Fuller Aumentado confirmou estacionariedade da série (DF = -4,07; p &lt; 0,01). A seleção automática por AIC indicou o modelo </w:t>
+      </w:r>
+      <w:proofErr w:type="gramStart"/>
+      <w:r>
+        <w:rPr>
+          <w:rFonts w:ascii="Times New Roman" w:hAnsi="Times New Roman"/>
+          <w:lang w:val="pt-BR"/>
+        </w:rPr>
+        <w:t>ARIMA(</w:t>
+      </w:r>
+      <w:proofErr w:type="gramEnd"/>
+      <w:r>
+        <w:rPr>
+          <w:rFonts w:ascii="Times New Roman" w:hAnsi="Times New Roman"/>
+          <w:lang w:val="pt-BR"/>
+        </w:rPr>
+        <w:t>3,0,2)(0,1,1)</w:t>
+      </w:r>
+      <w:r>
+        <w:rPr>
+          <w:rFonts w:ascii="Times New Roman" w:hAnsi="Times New Roman"/>
+          <w:lang w:val="pt-BR"/>
+        </w:rPr>
+        <w:t>[12]</w:t>
+      </w:r>
+      <w:r>
+        <w:rPr>
+          <w:rFonts w:ascii="Times New Roman" w:hAnsi="Times New Roman"/>
+          <w:lang w:val="pt-BR"/>
+        </w:rPr>
+        <w:t xml:space="preserve"> com constante como melhor ajuste na base de treino (AIC = 3094,43). Entretanto, na base de teste, o modelo SES apresentou menor RMSE (51,37 ha), superando o ARIMA (61,72 ha). A discrepância é atribuída a uma ruptura estrutural observada em 2023–2024, na qual a superfície de água atingiu máximas históricas de até 399 ha, extrapolando o padrão aprendido pelos modelos paramétricos. Conclui-se que o modelo de melhor ajuste pelo AIC não é necessariamente o mais acurado na previsão fora da amostra, ressaltando a importância da avaliação por desempenho preditivo em séries com mudanças de regime.</w:t>
       </w:r>
     </w:p>
     <w:p>
@@ -145,7 +315,7 @@
     </w:p>
     <w:p>
       <w:pPr>
-        <w:pStyle w:val="Heading1"/>
+        <w:pStyle w:val="Ttulo1"/>
         <w:rPr>
           <w:rFonts w:ascii="Times New Roman" w:hAnsi="Times New Roman"/>
           <w:color w:val="000000"/>
@@ -176,84 +346,78 @@
         <w:rPr>
           <w:rFonts w:ascii="Times New Roman" w:hAnsi="Times New Roman"/>
         </w:rPr>
-        <w:t xml:space="preserve">This study analyzes the monthly time series of water surface </w:t>
+        <w:t xml:space="preserve">This study analyzes the monthly time series of water surface area (ha) in the municipality of Belo Horizonte (MG) from January 1985 to December 2024, comprising 480 observations from the </w:t>
+      </w:r>
+      <w:proofErr w:type="spellStart"/>
+      <w:r>
+        <w:rPr>
+          <w:rFonts w:ascii="Times New Roman" w:hAnsi="Times New Roman"/>
+        </w:rPr>
+        <w:t>MapBiomas</w:t>
+      </w:r>
+      <w:proofErr w:type="spellEnd"/>
+      <w:r>
+        <w:rPr>
+          <w:rFonts w:ascii="Times New Roman" w:hAnsi="Times New Roman"/>
+        </w:rPr>
+        <w:t xml:space="preserve"> Water Project, Collection 4. The objective is to compare five forecasting models</w:t>
+      </w:r>
+      <w:r>
+        <w:rPr>
+          <w:rFonts w:ascii="Times New Roman" w:hAnsi="Times New Roman"/>
+        </w:rPr>
+        <w:t>,</w:t>
+      </w:r>
+      <w:r>
+        <w:rPr>
+          <w:rFonts w:ascii="Times New Roman" w:hAnsi="Times New Roman"/>
+        </w:rPr>
+        <w:t xml:space="preserve"> Simple Exponential Smoothing (SES), Holt, Holt-Winters (HW), ARIMA, and ETS in terms of </w:t>
+      </w:r>
+      <w:r>
+        <w:rPr>
+          <w:rFonts w:ascii="Times New Roman" w:hAnsi="Times New Roman"/>
+        </w:rPr>
+        <w:lastRenderedPageBreak/>
+        <w:t xml:space="preserve">goodness-of-fit (AIC) and predictive accuracy (RMSE) over a 60-month horizon (2020–2024). The Augmented Dickey-Fuller test confirmed series stationarity (DF = -4.07; p &lt; 0.01). Automatic AIC selection identified the </w:t>
       </w:r>
       <w:proofErr w:type="gramStart"/>
       <w:r>
         <w:rPr>
           <w:rFonts w:ascii="Times New Roman" w:hAnsi="Times New Roman"/>
         </w:rPr>
-        <w:t>area</w:t>
+        <w:t>ARIMA(</w:t>
       </w:r>
       <w:proofErr w:type="gramEnd"/>
       <w:r>
         <w:rPr>
           <w:rFonts w:ascii="Times New Roman" w:hAnsi="Times New Roman"/>
         </w:rPr>
-        <w:t xml:space="preserve"> (ha) in the municipality of Belo Horizonte (MG) from January 1985 to December 2024, comprising 480 observations from the </w:t>
-      </w:r>
-      <w:proofErr w:type="spellStart"/>
-      <w:r>
-        <w:rPr>
-          <w:rFonts w:ascii="Times New Roman" w:hAnsi="Times New Roman"/>
-        </w:rPr>
-        <w:t>MapBiomas</w:t>
-      </w:r>
-      <w:proofErr w:type="spellEnd"/>
-      <w:r>
-        <w:rPr>
-          <w:rFonts w:ascii="Times New Roman" w:hAnsi="Times New Roman"/>
-        </w:rPr>
-        <w:t xml:space="preserve"> Water Project, Collection 4. The objective is to compare five forecasting models — Simple Exponential Smoothing (SES), Holt, Holt-Winters (HW), ARIMA, and ETS — in terms of goodness-of-fit (AIC) and predictive accuracy (RMSE) over a 60-month horizon (2020–2024). The Augmented Dickey-Fuller test confirmed series stationarity (DF = -4.07; p &lt; 0.01). Automatic AIC selection identified the </w:t>
-      </w:r>
-      <w:proofErr w:type="gramStart"/>
-      <w:r>
-        <w:rPr>
-          <w:rFonts w:ascii="Times New Roman" w:hAnsi="Times New Roman"/>
-        </w:rPr>
-        <w:t>ARIMA(</w:t>
-      </w:r>
-      <w:proofErr w:type="gramEnd"/>
-      <w:r>
-        <w:rPr>
-          <w:rFonts w:ascii="Times New Roman" w:hAnsi="Times New Roman"/>
-        </w:rPr>
-        <w:t>3,0,</w:t>
-      </w:r>
-      <w:proofErr w:type="gramStart"/>
-      <w:r>
-        <w:rPr>
-          <w:rFonts w:ascii="Times New Roman" w:hAnsi="Times New Roman"/>
-        </w:rPr>
-        <w:t>2)(</w:t>
-      </w:r>
-      <w:proofErr w:type="gramEnd"/>
-      <w:r>
-        <w:rPr>
-          <w:rFonts w:ascii="Times New Roman" w:hAnsi="Times New Roman"/>
-        </w:rPr>
-        <w:t>0,1,</w:t>
-      </w:r>
-      <w:proofErr w:type="gramStart"/>
-      <w:r>
-        <w:rPr>
-          <w:rFonts w:ascii="Times New Roman" w:hAnsi="Times New Roman"/>
-        </w:rPr>
-        <w:t>1)[</w:t>
-      </w:r>
-      <w:proofErr w:type="gramEnd"/>
-      <w:r>
-        <w:rPr>
-          <w:rFonts w:ascii="Times New Roman" w:hAnsi="Times New Roman"/>
-        </w:rPr>
-        <w:t xml:space="preserve">12] with drift as the best-fitting </w:t>
-      </w:r>
-      <w:r>
-        <w:rPr>
-          <w:rFonts w:ascii="Times New Roman" w:hAnsi="Times New Roman"/>
-        </w:rPr>
-        <w:lastRenderedPageBreak/>
-        <w:t>model on the training set (AIC = 3094.43). However, on the test set, the SES model achieved the lowest RMSE (51.37 ha), outperforming ARIMA (61.72 ha). This discrepancy is attributed to a structural break observed in 2023–2024, when water surface area reached historical maxima of up to 399 ha, exceeding patterns learned by parametric models. It is concluded that the best AIC model is not necessarily the most accurate for out-of-sample forecasting.</w:t>
+        <w:t>3,0,2)(0,1,1)</w:t>
+      </w:r>
+      <w:r>
+        <w:rPr>
+          <w:rFonts w:ascii="Times New Roman" w:hAnsi="Times New Roman"/>
+        </w:rPr>
+        <w:t>[12]</w:t>
+      </w:r>
+      <w:r>
+        <w:rPr>
+          <w:rFonts w:ascii="Times New Roman" w:hAnsi="Times New Roman"/>
+        </w:rPr>
+        <w:t xml:space="preserve"> with drift as the best-fitting model on the training set (AIC = 3094.43). </w:t>
+      </w:r>
+      <w:r>
+        <w:rPr>
+          <w:rFonts w:ascii="Times New Roman" w:hAnsi="Times New Roman"/>
+        </w:rPr>
+        <w:t>However</w:t>
+      </w:r>
+      <w:r>
+        <w:rPr>
+          <w:rFonts w:ascii="Times New Roman" w:hAnsi="Times New Roman"/>
+        </w:rPr>
+        <w:t>, on the test set, the SES model achieved the lowest RMSE (51.37 ha), outperforming ARIMA (61.72 ha). This discrepancy is attributed to a structural break observed in 2023–2024, when water surface area reached historical maxima of up to 399 ha, exceeding patterns learned by parametric models. It is concluded that the best AIC model is not necessarily the most accurate for out-of-sample forecasting.</w:t>
       </w:r>
     </w:p>
     <w:p>
@@ -280,7 +444,7 @@
     </w:p>
     <w:p>
       <w:pPr>
-        <w:pStyle w:val="Heading1"/>
+        <w:pStyle w:val="Ttulo1"/>
         <w:rPr>
           <w:rFonts w:ascii="Times New Roman" w:hAnsi="Times New Roman"/>
           <w:color w:val="000000"/>
@@ -305,63 +469,214 @@
     <w:p>
       <w:pPr>
         <w:spacing w:after="0" w:line="360" w:lineRule="auto"/>
-        <w:rPr>
-          <w:rFonts w:ascii="Times New Roman" w:hAnsi="Times New Roman"/>
-          <w:lang w:val="pt-BR"/>
-        </w:rPr>
-      </w:pPr>
-      <w:r>
-        <w:rPr>
-          <w:rFonts w:ascii="Times New Roman" w:hAnsi="Times New Roman"/>
-          <w:lang w:val="pt-BR"/>
-        </w:rPr>
-        <w:t>A superfície de água em ambientes urbanos é um indicador sensível de mudanças climáticas, uso do solo e eventos hidrológicos extremos. O monitoramento sistemático desse indicador ao longo do tempo permite identificar tendências, padrões sazonais e anomalias que subsidiam políticas de gestão hídrica e planejamento urbano. Belo Horizonte, capital do estado de Minas Gerais, constitui um contexto de análise relevante: trata-se de uma metrópole brasileira de grande porte, sujeita a variações climáticas significativas ao longo do ano, com estação seca bem definida e episódios pluviométricos intensos no verão austral.</w:t>
+        <w:jc w:val="both"/>
+        <w:rPr>
+          <w:rFonts w:ascii="Times New Roman" w:hAnsi="Times New Roman"/>
+          <w:lang w:val="pt-BR"/>
+        </w:rPr>
+      </w:pPr>
+      <w:r>
+        <w:rPr>
+          <w:rFonts w:ascii="Times New Roman" w:hAnsi="Times New Roman"/>
+          <w:lang w:val="pt-BR"/>
+        </w:rPr>
+        <w:t xml:space="preserve">A superfície de água em ambientes urbanos é um indicador sensível de mudanças climáticas, uso do solo e eventos hidrológicos extremos. O monitoramento sistemático desse indicador ao longo do tempo permite identificar tendências, padrões sazonais e anomalias que subsidiam políticas de gestão hídrica e planejamento urbano. Belo Horizonte, capital do estado de Minas Gerais, constitui um contexto de análise relevante: trata-se de uma metrópole brasileira de grande porte, sujeita a variações climáticas significativas ao </w:t>
+      </w:r>
+      <w:r>
+        <w:rPr>
+          <w:rFonts w:ascii="Times New Roman" w:hAnsi="Times New Roman"/>
+          <w:lang w:val="pt-BR"/>
+        </w:rPr>
+        <w:t>longo</w:t>
+      </w:r>
+      <w:r>
+        <w:rPr>
+          <w:rFonts w:ascii="Times New Roman" w:hAnsi="Times New Roman"/>
+          <w:lang w:val="pt-BR"/>
+        </w:rPr>
+        <w:t xml:space="preserve"> do ano, com estação seca bem definida e episódios pluviométricos intensos no verã</w:t>
+      </w:r>
+      <w:r>
+        <w:rPr>
+          <w:rFonts w:ascii="Times New Roman" w:hAnsi="Times New Roman"/>
+          <w:lang w:val="pt-BR"/>
+        </w:rPr>
+        <w:t>o</w:t>
+      </w:r>
+      <w:r>
+        <w:rPr>
+          <w:rFonts w:ascii="Times New Roman" w:hAnsi="Times New Roman"/>
+          <w:lang w:val="pt-BR"/>
+        </w:rPr>
+        <w:t>.</w:t>
       </w:r>
     </w:p>
     <w:p>
       <w:pPr>
         <w:spacing w:after="0" w:line="360" w:lineRule="auto"/>
-        <w:rPr>
-          <w:lang w:val="pt-BR"/>
-        </w:rPr>
-      </w:pPr>
-      <w:r>
-        <w:rPr>
-          <w:rFonts w:ascii="Times New Roman" w:hAnsi="Times New Roman"/>
-          <w:lang w:val="pt-BR"/>
-        </w:rPr>
-        <w:t>Nesse contexto, técnicas de análise de séries temporais oferecem ferramental adequado para modelar e prever o comportamento de variáveis hidrológicas mensais. A literatura apresenta uma diversidade de abordagens, desde os modelos clássicos de suavização exponencial (HOLT, 1957; WINTERS, 1960) até os modelos autorregressivos integrados de médias móveis (ARIMA), sistematizados por Box, Jenkins e Reinsel (1994), e os modelos de Espaço de Estados (ETS), discutidos por Hyndman e Khandakar (2008). Estudos recentes têm aplicado esses modelos a séries hidrológicas no Brasil, evidenciando tanto o potencial preditivo quanto as limitações frente a eventos extremos (BORGES et al., 2025; GOULART et al., 2024).</w:t>
+        <w:jc w:val="both"/>
+        <w:rPr>
+          <w:lang w:val="pt-BR"/>
+        </w:rPr>
+      </w:pPr>
+      <w:r>
+        <w:rPr>
+          <w:rFonts w:ascii="Times New Roman" w:hAnsi="Times New Roman"/>
+          <w:lang w:val="pt-BR"/>
+        </w:rPr>
+        <w:t xml:space="preserve">Nesse contexto, técnicas de análise de séries temporais oferecem </w:t>
+      </w:r>
+      <w:r>
+        <w:rPr>
+          <w:rFonts w:ascii="Times New Roman" w:hAnsi="Times New Roman"/>
+          <w:lang w:val="pt-BR"/>
+        </w:rPr>
+        <w:t>ferramentas</w:t>
+      </w:r>
+      <w:r>
+        <w:rPr>
+          <w:rFonts w:ascii="Times New Roman" w:hAnsi="Times New Roman"/>
+          <w:lang w:val="pt-BR"/>
+        </w:rPr>
+        <w:t xml:space="preserve"> adequad</w:t>
+      </w:r>
+      <w:r>
+        <w:rPr>
+          <w:rFonts w:ascii="Times New Roman" w:hAnsi="Times New Roman"/>
+          <w:lang w:val="pt-BR"/>
+        </w:rPr>
+        <w:t>as</w:t>
+      </w:r>
+      <w:r>
+        <w:rPr>
+          <w:rFonts w:ascii="Times New Roman" w:hAnsi="Times New Roman"/>
+          <w:lang w:val="pt-BR"/>
+        </w:rPr>
+        <w:t xml:space="preserve"> para modelar e prever o comportamento de variáveis hidrológicas mensais. A literatura apresenta uma diversidade de abordagens, desde os modelos clássicos de suavização exponencial (HOLT, 1957; WINTERS, 1960) até os modelos autorregressivos integrados de médias móveis (ARIMA), sistematizados por Box, Jenkins e Reinsel (1994), e os modelos de Espaço de Estados (ETS), discutidos por Hyndman e Khandakar (2008). Estudos recentes têm aplicado esses modelos a séries hidrológicas no Brasil, evidenciando tanto o potencial preditivo quanto as limitações frente a eventos extremos (</w:t>
+      </w:r>
+      <w:r>
+        <w:rPr>
+          <w:rFonts w:ascii="Times New Roman" w:hAnsi="Times New Roman"/>
+          <w:lang w:val="pt-BR"/>
+        </w:rPr>
+        <w:t>LUCAS, EDMUNDO</w:t>
+      </w:r>
+      <w:r>
+        <w:rPr>
+          <w:rFonts w:ascii="Times New Roman" w:hAnsi="Times New Roman"/>
+          <w:lang w:val="pt-BR"/>
+        </w:rPr>
+        <w:t xml:space="preserve"> et al., 20</w:t>
+      </w:r>
+      <w:r>
+        <w:rPr>
+          <w:rFonts w:ascii="Times New Roman" w:hAnsi="Times New Roman"/>
+          <w:lang w:val="pt-BR"/>
+        </w:rPr>
+        <w:t>09</w:t>
+      </w:r>
+      <w:r>
+        <w:rPr>
+          <w:rFonts w:ascii="Times New Roman" w:hAnsi="Times New Roman"/>
+          <w:lang w:val="pt-BR"/>
+        </w:rPr>
+        <w:t xml:space="preserve">; </w:t>
+      </w:r>
+      <w:r>
+        <w:rPr>
+          <w:rFonts w:ascii="Times New Roman" w:hAnsi="Times New Roman"/>
+          <w:lang w:val="pt-BR"/>
+        </w:rPr>
+        <w:t>CAMINHA, A. R.</w:t>
+      </w:r>
+      <w:r>
+        <w:rPr>
+          <w:rFonts w:ascii="Times New Roman" w:hAnsi="Times New Roman"/>
+          <w:lang w:val="pt-BR"/>
+        </w:rPr>
+        <w:t xml:space="preserve"> et al., 20</w:t>
+      </w:r>
+      <w:r>
+        <w:rPr>
+          <w:rFonts w:ascii="Times New Roman" w:hAnsi="Times New Roman"/>
+          <w:lang w:val="pt-BR"/>
+        </w:rPr>
+        <w:t>25</w:t>
+      </w:r>
+      <w:r>
+        <w:rPr>
+          <w:rFonts w:ascii="Times New Roman" w:hAnsi="Times New Roman"/>
+          <w:lang w:val="pt-BR"/>
+        </w:rPr>
+        <w:t>).</w:t>
       </w:r>
     </w:p>
     <w:p>
       <w:pPr>
         <w:spacing w:after="0" w:line="360" w:lineRule="auto"/>
-        <w:rPr>
-          <w:lang w:val="pt-BR"/>
-        </w:rPr>
-      </w:pPr>
-      <w:r>
-        <w:rPr>
-          <w:rFonts w:ascii="Times New Roman" w:hAnsi="Times New Roman"/>
-          <w:lang w:val="pt-BR"/>
-        </w:rPr>
-        <w:t>Uma questão metodológica central na modelagem de séries temporais é a relação entre a qualidade de ajuste dentro da amostra — habitualmente medida pelo Critério de Informação de Akaike (AIC) (AKAIKE, 1974) — e a acurácia preditiva fora da amostra, medida pelo Erro Quadrático Médio (RMSE) em um conjunto de teste. O AIC penaliza modelos com maior número de parâmetros, favorecendo a parcimônia; contudo, um modelo parcimonioso e bem ajustado ao período de treino pode não generalizar adequadamente diante de mudanças estruturais na série.</w:t>
+        <w:jc w:val="both"/>
+        <w:rPr>
+          <w:lang w:val="pt-BR"/>
+        </w:rPr>
+      </w:pPr>
+      <w:r>
+        <w:rPr>
+          <w:rFonts w:ascii="Times New Roman" w:hAnsi="Times New Roman"/>
+          <w:lang w:val="pt-BR"/>
+        </w:rPr>
+        <w:t xml:space="preserve">Uma questão metodológica central na </w:t>
+      </w:r>
+      <w:r>
+        <w:rPr>
+          <w:rFonts w:ascii="Times New Roman" w:hAnsi="Times New Roman"/>
+          <w:lang w:val="pt-BR"/>
+        </w:rPr>
+        <w:t>modelagem</w:t>
+      </w:r>
+      <w:r>
+        <w:rPr>
+          <w:rFonts w:ascii="Times New Roman" w:hAnsi="Times New Roman"/>
+          <w:lang w:val="pt-BR"/>
+        </w:rPr>
+        <w:t xml:space="preserve"> de séries temporais é a relação entre a qualidade de ajuste dentro da amostra — habitualmente medida pelo Critério de Informação de Akaike (AIC) (AKAIKE, 1974) — e a acurácia preditiva fora da amostra, medida pelo Erro Quadrático Médio (RMSE) em um conjunto de teste. O AIC penaliza modelos com maior número de parâmetros, </w:t>
+      </w:r>
+      <w:r>
+        <w:rPr>
+          <w:rFonts w:ascii="Times New Roman" w:hAnsi="Times New Roman"/>
+          <w:lang w:val="pt-BR"/>
+        </w:rPr>
+        <w:lastRenderedPageBreak/>
+        <w:t xml:space="preserve">favorecendo a parcimônia; contudo, um modelo </w:t>
+      </w:r>
+      <w:r>
+        <w:rPr>
+          <w:rFonts w:ascii="Times New Roman" w:hAnsi="Times New Roman"/>
+          <w:lang w:val="pt-BR"/>
+        </w:rPr>
+        <w:t>conservador</w:t>
+      </w:r>
+      <w:r>
+        <w:rPr>
+          <w:rFonts w:ascii="Times New Roman" w:hAnsi="Times New Roman"/>
+          <w:lang w:val="pt-BR"/>
+        </w:rPr>
+        <w:t xml:space="preserve"> e bem ajustado ao período de treino pode não generalizar adequadamente diante de mudanças estruturais na série.</w:t>
       </w:r>
     </w:p>
     <w:p>
       <w:pPr>
         <w:spacing w:after="0" w:line="360" w:lineRule="auto"/>
-        <w:rPr>
-          <w:rFonts w:ascii="Times New Roman" w:hAnsi="Times New Roman"/>
-          <w:lang w:val="pt-BR"/>
-        </w:rPr>
-      </w:pPr>
-      <w:r>
-        <w:rPr>
-          <w:rFonts w:ascii="Times New Roman" w:hAnsi="Times New Roman"/>
-          <w:lang w:val="pt-BR"/>
-        </w:rPr>
-        <w:lastRenderedPageBreak/>
+        <w:jc w:val="both"/>
+        <w:rPr>
+          <w:rFonts w:ascii="Times New Roman" w:hAnsi="Times New Roman"/>
+          <w:lang w:val="pt-BR"/>
+        </w:rPr>
+      </w:pPr>
+      <w:r>
+        <w:rPr>
+          <w:rFonts w:ascii="Times New Roman" w:hAnsi="Times New Roman"/>
+          <w:lang w:val="pt-BR"/>
+        </w:rPr>
         <w:t xml:space="preserve">Esta é a </w:t>
       </w:r>
       <w:r>
@@ -393,6 +708,7 @@
     <w:p>
       <w:pPr>
         <w:spacing w:after="0" w:line="360" w:lineRule="auto"/>
+        <w:jc w:val="both"/>
         <w:rPr>
           <w:rFonts w:ascii="Times New Roman" w:hAnsi="Times New Roman"/>
           <w:lang w:val="pt-BR"/>
@@ -408,7 +724,7 @@
     </w:p>
     <w:p>
       <w:pPr>
-        <w:pStyle w:val="Heading1"/>
+        <w:pStyle w:val="Ttulo1"/>
         <w:rPr>
           <w:rFonts w:ascii="Times New Roman" w:hAnsi="Times New Roman"/>
           <w:color w:val="000000"/>
@@ -432,7 +748,7 @@
     </w:p>
     <w:p>
       <w:pPr>
-        <w:pStyle w:val="Heading2"/>
+        <w:pStyle w:val="Ttulo2"/>
         <w:rPr>
           <w:rFonts w:ascii="Times New Roman" w:hAnsi="Times New Roman"/>
           <w:color w:val="000000"/>
@@ -457,36 +773,204 @@
     <w:p>
       <w:pPr>
         <w:spacing w:after="0" w:line="360" w:lineRule="auto"/>
-        <w:rPr>
-          <w:lang w:val="pt-BR"/>
-        </w:rPr>
-      </w:pPr>
-      <w:r>
-        <w:rPr>
-          <w:rFonts w:ascii="Times New Roman" w:hAnsi="Times New Roman"/>
-          <w:lang w:val="pt-BR"/>
-        </w:rPr>
-        <w:t>Os dados utilizados provêm do Projeto MapBiomas Água, Coleção 4 (MAPBIOMAS, 2024), que disponibiliza estimativas mensais de área de superfície de água (em hectares) para todos os municípios brasileiros a partir de imagens de sensoriamento remoto Landsat. O mapeamento da superfície de água no Brasil compreende o período de 1985 a 2024, em escala mensal, e utiliza cenas Landsat processadas com modelo espectral de mistura e regras de classificação baseadas em lógica fuzzy. Para Belo Horizonte (código IBGE 3106200), foram obtidas 480 observações mensais, cobrindo o período de janeiro de 1985 a dezembro de 2024.</w:t>
+        <w:jc w:val="both"/>
+        <w:rPr>
+          <w:lang w:val="pt-BR"/>
+        </w:rPr>
+      </w:pPr>
+      <w:r>
+        <w:rPr>
+          <w:rFonts w:ascii="Times New Roman" w:hAnsi="Times New Roman"/>
+          <w:lang w:val="pt-BR"/>
+        </w:rPr>
+        <w:t xml:space="preserve">Os dados utilizados provêm do Projeto MapBiomas Água, Coleção 4 (MAPBIOMAS, 2024), que disponibiliza estimativas mensais de área de superfície de água (em hectares) para todos os municípios brasileiros a partir de imagens de sensoriamento remoto </w:t>
+      </w:r>
+      <w:proofErr w:type="spellStart"/>
+      <w:r>
+        <w:rPr>
+          <w:rFonts w:ascii="Times New Roman" w:hAnsi="Times New Roman"/>
+          <w:lang w:val="pt-BR"/>
+        </w:rPr>
+        <w:t>Landsat</w:t>
+      </w:r>
+      <w:proofErr w:type="spellEnd"/>
+      <w:r>
+        <w:rPr>
+          <w:rFonts w:ascii="Times New Roman" w:hAnsi="Times New Roman"/>
+          <w:lang w:val="pt-BR"/>
+        </w:rPr>
+        <w:t>. Para Belo Horizonte (código IBGE 3106200), foram obtidas 480 observações mensais, cobrindo o período de janeiro de 1985 a dezembro de 2024.</w:t>
       </w:r>
     </w:p>
     <w:p>
       <w:pPr>
         <w:spacing w:after="0" w:line="360" w:lineRule="auto"/>
-        <w:rPr>
-          <w:lang w:val="pt-BR"/>
-        </w:rPr>
-      </w:pPr>
-      <w:r>
-        <w:rPr>
-          <w:rFonts w:ascii="Times New Roman" w:hAnsi="Times New Roman"/>
-          <w:lang w:val="pt-BR"/>
-        </w:rPr>
-        <w:t>A série foi estruturada como objeto de série temporal no software R (R CORE TEAM, 2025) com frequência 12 (mensal), usando a função ts() com início em c(1985, 1). O conjunto foi dividido em base de treino, de janeiro de 1985 a dezembro de 2019, totalizando 420 observações, e base de teste, de janeiro de 2020 a dezembro de 2024, totalizando 60 observações.</w:t>
-      </w:r>
-    </w:p>
-    <w:p>
-      <w:pPr>
-        <w:pStyle w:val="Heading2"/>
+        <w:jc w:val="both"/>
+        <w:rPr>
+          <w:rFonts w:ascii="Times New Roman" w:hAnsi="Times New Roman"/>
+          <w:lang w:val="pt-BR"/>
+        </w:rPr>
+      </w:pPr>
+      <w:r>
+        <w:rPr>
+          <w:rFonts w:ascii="Times New Roman" w:hAnsi="Times New Roman"/>
+          <w:lang w:val="pt-BR"/>
+        </w:rPr>
+        <w:t xml:space="preserve">A série foi estruturada como objeto de série </w:t>
+      </w:r>
+      <w:r>
+        <w:rPr>
+          <w:rFonts w:ascii="Times New Roman" w:hAnsi="Times New Roman"/>
+          <w:lang w:val="pt-BR"/>
+        </w:rPr>
+        <w:t>temporal</w:t>
+      </w:r>
+      <w:r>
+        <w:rPr>
+          <w:rFonts w:ascii="Times New Roman" w:hAnsi="Times New Roman"/>
+          <w:lang w:val="pt-BR"/>
+        </w:rPr>
+        <w:t xml:space="preserve"> no software R (R CORE TEAM, 2025) com frequência 12 (mensal). O conjunto foi dividido em base de treino</w:t>
+      </w:r>
+      <w:r>
+        <w:rPr>
+          <w:rFonts w:ascii="Times New Roman" w:hAnsi="Times New Roman"/>
+          <w:lang w:val="pt-BR"/>
+        </w:rPr>
+        <w:t xml:space="preserve"> e base de testes</w:t>
+      </w:r>
+      <w:r>
+        <w:rPr>
+          <w:rFonts w:ascii="Times New Roman" w:hAnsi="Times New Roman"/>
+          <w:lang w:val="pt-BR"/>
+        </w:rPr>
+        <w:t xml:space="preserve"> com as seguintes configurações:</w:t>
+      </w:r>
+    </w:p>
+    <w:p>
+      <w:pPr>
+        <w:pStyle w:val="PargrafodaLista"/>
+        <w:numPr>
+          <w:ilvl w:val="0"/>
+          <w:numId w:val="1"/>
+        </w:numPr>
+        <w:spacing w:after="0" w:line="360" w:lineRule="auto"/>
+        <w:rPr>
+          <w:rFonts w:ascii="Times New Roman" w:hAnsi="Times New Roman"/>
+          <w:lang w:val="pt-BR"/>
+        </w:rPr>
+      </w:pPr>
+      <w:r>
+        <w:rPr>
+          <w:rFonts w:ascii="Times New Roman" w:hAnsi="Times New Roman"/>
+          <w:b/>
+          <w:bCs/>
+          <w:lang w:val="pt-BR"/>
+        </w:rPr>
+        <w:t>Conjunto de Treino</w:t>
+      </w:r>
+      <w:r>
+        <w:rPr>
+          <w:rFonts w:ascii="Times New Roman" w:hAnsi="Times New Roman"/>
+          <w:lang w:val="pt-BR"/>
+        </w:rPr>
+        <w:t>:</w:t>
+      </w:r>
+      <w:r>
+        <w:rPr>
+          <w:rFonts w:ascii="Times New Roman" w:hAnsi="Times New Roman"/>
+          <w:lang w:val="pt-BR"/>
+        </w:rPr>
+        <w:t xml:space="preserve"> de janeiro de 1985 a dezembro de 2019, totalizando 420 observações</w:t>
+      </w:r>
+      <w:r>
+        <w:rPr>
+          <w:rFonts w:ascii="Times New Roman" w:hAnsi="Times New Roman"/>
+          <w:lang w:val="pt-BR"/>
+        </w:rPr>
+        <w:t xml:space="preserve"> (35 anos);</w:t>
+      </w:r>
+    </w:p>
+    <w:p>
+      <w:pPr>
+        <w:pStyle w:val="PargrafodaLista"/>
+        <w:numPr>
+          <w:ilvl w:val="0"/>
+          <w:numId w:val="1"/>
+        </w:numPr>
+        <w:spacing w:after="0" w:line="360" w:lineRule="auto"/>
+        <w:rPr>
+          <w:lang w:val="pt-BR"/>
+        </w:rPr>
+      </w:pPr>
+      <w:r>
+        <w:rPr>
+          <w:rFonts w:ascii="Times New Roman" w:hAnsi="Times New Roman"/>
+          <w:b/>
+          <w:bCs/>
+          <w:lang w:val="pt-BR"/>
+        </w:rPr>
+        <w:t>Conjunto</w:t>
+      </w:r>
+      <w:r>
+        <w:rPr>
+          <w:rFonts w:ascii="Times New Roman" w:hAnsi="Times New Roman"/>
+          <w:b/>
+          <w:bCs/>
+          <w:lang w:val="pt-BR"/>
+        </w:rPr>
+        <w:t xml:space="preserve"> de </w:t>
+      </w:r>
+      <w:r>
+        <w:rPr>
+          <w:rFonts w:ascii="Times New Roman" w:hAnsi="Times New Roman"/>
+          <w:b/>
+          <w:bCs/>
+          <w:lang w:val="pt-BR"/>
+        </w:rPr>
+        <w:t>T</w:t>
+      </w:r>
+      <w:r>
+        <w:rPr>
+          <w:rFonts w:ascii="Times New Roman" w:hAnsi="Times New Roman"/>
+          <w:b/>
+          <w:bCs/>
+          <w:lang w:val="pt-BR"/>
+        </w:rPr>
+        <w:t>este</w:t>
+      </w:r>
+      <w:r>
+        <w:rPr>
+          <w:rFonts w:ascii="Times New Roman" w:hAnsi="Times New Roman"/>
+          <w:lang w:val="pt-BR"/>
+        </w:rPr>
+        <w:t>:</w:t>
+      </w:r>
+      <w:r>
+        <w:rPr>
+          <w:rFonts w:ascii="Times New Roman" w:hAnsi="Times New Roman"/>
+          <w:lang w:val="pt-BR"/>
+        </w:rPr>
+        <w:t xml:space="preserve"> de janeiro de 2020 a dezembro de 2024, totalizando 60 observações</w:t>
+      </w:r>
+      <w:r>
+        <w:rPr>
+          <w:rFonts w:ascii="Times New Roman" w:hAnsi="Times New Roman"/>
+          <w:lang w:val="pt-BR"/>
+        </w:rPr>
+        <w:t xml:space="preserve"> (5 anos)</w:t>
+      </w:r>
+      <w:r>
+        <w:rPr>
+          <w:rFonts w:ascii="Times New Roman" w:hAnsi="Times New Roman"/>
+          <w:lang w:val="pt-BR"/>
+        </w:rPr>
+        <w:t>.</w:t>
+      </w:r>
+    </w:p>
+    <w:p>
+      <w:pPr>
+        <w:pStyle w:val="Ttulo2"/>
         <w:rPr>
           <w:rFonts w:ascii="Times New Roman" w:hAnsi="Times New Roman"/>
           <w:color w:val="000000"/>
@@ -511,21 +995,87 @@
     <w:p>
       <w:pPr>
         <w:spacing w:after="0" w:line="360" w:lineRule="auto"/>
-        <w:rPr>
-          <w:lang w:val="pt-BR"/>
-        </w:rPr>
-      </w:pPr>
-      <w:r>
-        <w:rPr>
-          <w:rFonts w:ascii="Times New Roman" w:hAnsi="Times New Roman"/>
-          <w:lang w:val="pt-BR"/>
-        </w:rPr>
-        <w:t>A análise exploratória incluiu a inspeção visual da série, o periodograma integrado e a decomposição clássica aditiva. Para avaliar a estacionariedade, foi aplicado o Teste Dickey-Fuller Aumentado (DICKEY; FULLER, 1979). A hipótese nula é a presença de raiz unitária; rejeita-se essa hipótese quando p &lt; 0,05.</w:t>
-      </w:r>
-    </w:p>
-    <w:p>
-      <w:pPr>
-        <w:pStyle w:val="Heading2"/>
+        <w:jc w:val="both"/>
+        <w:rPr>
+          <w:u w:val="single"/>
+          <w:lang w:val="pt-BR"/>
+        </w:rPr>
+      </w:pPr>
+      <w:r>
+        <w:rPr>
+          <w:rFonts w:ascii="Times New Roman" w:hAnsi="Times New Roman"/>
+          <w:lang w:val="pt-BR"/>
+        </w:rPr>
+        <w:t>A análise exploratória incluiu a inspeção visual da série, o periodograma integrado e a decomposição clássica aditiva. Para avaliar a estacionariedade, foi aplicado o Teste Dickey-Fuller Aumentado (DICKEY; FULLER, 1979). A hipótese nula</w:t>
+      </w:r>
+      <w:r>
+        <w:rPr>
+          <w:lang w:val="pt-BR"/>
+        </w:rPr>
+        <w:t xml:space="preserve"> </w:t>
+      </w:r>
+      <w:r>
+        <w:rPr>
+          <w:lang w:val="pt-BR"/>
+        </w:rPr>
+        <w:t>(</w:t>
+      </w:r>
+      <m:oMath>
+        <m:sSub>
+          <m:sSubPr>
+            <m:ctrlPr>
+              <w:rPr>
+                <w:rFonts w:ascii="Cambria Math" w:hAnsi="Cambria Math"/>
+                <w:i/>
+                <w:lang w:val="pt-BR"/>
+              </w:rPr>
+            </m:ctrlPr>
+          </m:sSubPr>
+          <m:e>
+            <m:r>
+              <w:rPr>
+                <w:rFonts w:ascii="Cambria Math" w:hAnsi="Cambria Math"/>
+                <w:lang w:val="pt-BR"/>
+              </w:rPr>
+              <m:t>H</m:t>
+            </m:r>
+          </m:e>
+          <m:sub>
+            <m:r>
+              <w:rPr>
+                <w:rFonts w:ascii="Cambria Math" w:hAnsi="Cambria Math"/>
+                <w:lang w:val="pt-BR"/>
+              </w:rPr>
+              <m:t>0</m:t>
+            </m:r>
+          </m:sub>
+        </m:sSub>
+      </m:oMath>
+      <w:r>
+        <w:rPr>
+          <w:rFonts w:eastAsiaTheme="minorEastAsia"/>
+          <w:lang w:val="pt-BR"/>
+        </w:rPr>
+        <w:t>)</w:t>
+      </w:r>
+      <w:r>
+        <w:rPr>
+          <w:rFonts w:ascii="Times New Roman" w:hAnsi="Times New Roman"/>
+          <w:lang w:val="pt-BR"/>
+        </w:rPr>
+        <w:t xml:space="preserve"> </w:t>
+      </w:r>
+      <w:r>
+        <w:rPr>
+          <w:rFonts w:ascii="Times New Roman" w:hAnsi="Times New Roman"/>
+          <w:lang w:val="pt-BR"/>
+        </w:rPr>
+        <w:t>é a presença de raiz unitária; rejeita-se essa hipótese quando p &lt; 0,05.</w:t>
+      </w:r>
+    </w:p>
+    <w:p>
+      <w:pPr>
+        <w:pStyle w:val="Ttulo2"/>
         <w:rPr>
           <w:rFonts w:ascii="Times New Roman" w:hAnsi="Times New Roman"/>
           <w:color w:val="000000"/>
@@ -544,13 +1094,17 @@
           <w:szCs w:val="24"/>
           <w:lang w:val="pt-BR"/>
         </w:rPr>
+        <w:lastRenderedPageBreak/>
         <w:t>Modelos Utilizados</w:t>
       </w:r>
     </w:p>
     <w:p>
       <w:pPr>
         <w:spacing w:after="0" w:line="360" w:lineRule="auto"/>
-        <w:rPr>
+        <w:jc w:val="both"/>
+        <w:rPr>
+          <w:rFonts w:ascii="Times New Roman" w:hAnsi="Times New Roman"/>
+          <w:u w:val="single"/>
           <w:lang w:val="pt-BR"/>
         </w:rPr>
       </w:pPr>
@@ -561,6 +1115,14 @@
         </w:rPr>
         <w:t>Foram ajustados cinco modelos à base de treino, todos implementados pelo pacote forecast do R (HYNDMAN; KHANDAKAR, 2008): Suavização Exponencial Simples (SES), Holt, Holt-Winters, ARIMA e ETS.</w:t>
       </w:r>
+    </w:p>
+    <w:p>
+      <w:pPr>
+        <w:spacing w:after="0" w:line="360" w:lineRule="auto"/>
+        <w:rPr>
+          <w:lang w:val="pt-BR"/>
+        </w:rPr>
+      </w:pPr>
     </w:p>
     <w:p>
       <w:pPr>
@@ -679,7 +1241,6 @@
           </w:tcPr>
           <w:p>
             <w:r>
-              <w:lastRenderedPageBreak/>
               <w:t>SES</w:t>
             </w:r>
           </w:p>
@@ -976,6 +1537,16 @@
           <w:lang w:val="pt-BR"/>
         </w:rPr>
       </w:pPr>
+    </w:p>
+    <w:p>
+      <w:pPr>
+        <w:spacing w:after="0" w:line="360" w:lineRule="auto"/>
+        <w:jc w:val="both"/>
+        <w:rPr>
+          <w:rFonts w:ascii="Times New Roman" w:hAnsi="Times New Roman"/>
+          <w:lang w:val="pt-BR"/>
+        </w:rPr>
+      </w:pPr>
       <w:r>
         <w:rPr>
           <w:rFonts w:ascii="Times New Roman" w:hAnsi="Times New Roman"/>
@@ -1025,7 +1596,7 @@
     </w:p>
     <w:p>
       <w:pPr>
-        <w:pStyle w:val="Heading2"/>
+        <w:pStyle w:val="Ttulo2"/>
         <w:rPr>
           <w:rFonts w:ascii="Times New Roman" w:hAnsi="Times New Roman"/>
           <w:color w:val="000000"/>
@@ -1050,6 +1621,7 @@
     <w:p>
       <w:pPr>
         <w:spacing w:after="0" w:line="360" w:lineRule="auto"/>
+        <w:jc w:val="both"/>
         <w:rPr>
           <w:rFonts w:ascii="Times New Roman" w:hAnsi="Times New Roman"/>
           <w:lang w:val="pt-BR"/>
@@ -1071,6 +1643,65 @@
         </w:rPr>
         <w:t xml:space="preserve"> foi utilizado o Critério de Informação de Akaike (AIC), em que menores valores indicam melhor equilíbrio entre ajuste e parcimônia. </w:t>
       </w:r>
+    </w:p>
+    <w:p>
+      <w:pPr>
+        <w:spacing w:after="0" w:line="360" w:lineRule="auto"/>
+        <w:rPr>
+          <w:rFonts w:ascii="Times New Roman" w:eastAsiaTheme="minorEastAsia" w:hAnsi="Times New Roman"/>
+          <w:lang w:val="pt-BR"/>
+        </w:rPr>
+      </w:pPr>
+      <m:oMathPara>
+        <m:oMath>
+          <m:r>
+            <w:rPr>
+              <w:rFonts w:ascii="Cambria Math" w:eastAsiaTheme="minorEastAsia" w:hAnsi="Cambria Math"/>
+              <w:lang w:val="pt-BR"/>
+            </w:rPr>
+            <m:t>AIC = 2k - 2ln</m:t>
+          </m:r>
+          <m:acc>
+            <m:accPr>
+              <m:ctrlPr>
+                <w:rPr>
+                  <w:rFonts w:ascii="Cambria Math" w:eastAsiaTheme="minorEastAsia" w:hAnsi="Cambria Math"/>
+                  <w:i/>
+                  <w:lang w:val="pt-BR"/>
+                </w:rPr>
+              </m:ctrlPr>
+            </m:accPr>
+            <m:e>
+              <m:r>
+                <w:rPr>
+                  <w:rFonts w:ascii="Cambria Math" w:eastAsiaTheme="minorEastAsia" w:hAnsi="Cambria Math"/>
+                  <w:lang w:val="pt-BR"/>
+                </w:rPr>
+                <m:t>L</m:t>
+              </m:r>
+            </m:e>
+          </m:acc>
+        </m:oMath>
+      </m:oMathPara>
+    </w:p>
+    <w:p>
+      <w:pPr>
+        <w:spacing w:after="0" w:line="360" w:lineRule="auto"/>
+        <w:rPr>
+          <w:rFonts w:ascii="Times New Roman" w:eastAsiaTheme="minorEastAsia" w:hAnsi="Times New Roman"/>
+          <w:lang w:val="pt-BR"/>
+        </w:rPr>
+      </w:pPr>
+    </w:p>
+    <w:p>
+      <w:pPr>
+        <w:spacing w:after="0" w:line="360" w:lineRule="auto"/>
+        <w:jc w:val="both"/>
+        <w:rPr>
+          <w:rFonts w:ascii="Times New Roman" w:hAnsi="Times New Roman"/>
+          <w:lang w:val="pt-BR"/>
+        </w:rPr>
+      </w:pPr>
       <w:r>
         <w:rPr>
           <w:rFonts w:ascii="Times New Roman" w:hAnsi="Times New Roman"/>
@@ -1090,7 +1721,203 @@
     </w:p>
     <w:p>
       <w:pPr>
-        <w:pStyle w:val="Heading1"/>
+        <w:spacing w:after="0" w:line="360" w:lineRule="auto"/>
+        <w:rPr>
+          <w:rFonts w:ascii="Times New Roman" w:hAnsi="Times New Roman"/>
+          <w:lang w:val="pt-BR"/>
+        </w:rPr>
+      </w:pPr>
+      <m:oMathPara>
+        <m:oMath>
+          <m:r>
+            <w:rPr>
+              <w:rFonts w:ascii="Cambria Math" w:hAnsi="Cambria Math"/>
+              <w:lang w:val="pt-BR"/>
+            </w:rPr>
+            <w:lastRenderedPageBreak/>
+            <m:t xml:space="preserve">RMSE = </m:t>
+          </m:r>
+          <m:rad>
+            <m:radPr>
+              <m:degHide m:val="1"/>
+              <m:ctrlPr>
+                <w:rPr>
+                  <w:rFonts w:ascii="Cambria Math" w:hAnsi="Cambria Math"/>
+                  <w:i/>
+                  <w:lang w:val="pt-BR"/>
+                </w:rPr>
+              </m:ctrlPr>
+            </m:radPr>
+            <m:deg/>
+            <m:e>
+              <m:f>
+                <m:fPr>
+                  <m:ctrlPr>
+                    <w:rPr>
+                      <w:rFonts w:ascii="Cambria Math" w:hAnsi="Cambria Math"/>
+                      <w:i/>
+                      <w:lang w:val="pt-BR"/>
+                    </w:rPr>
+                  </m:ctrlPr>
+                </m:fPr>
+                <m:num>
+                  <m:r>
+                    <w:rPr>
+                      <w:rFonts w:ascii="Cambria Math" w:hAnsi="Cambria Math"/>
+                      <w:lang w:val="pt-BR"/>
+                    </w:rPr>
+                    <m:t>1</m:t>
+                  </m:r>
+                </m:num>
+                <m:den>
+                  <m:r>
+                    <w:rPr>
+                      <w:rFonts w:ascii="Cambria Math" w:hAnsi="Cambria Math"/>
+                      <w:lang w:val="pt-BR"/>
+                    </w:rPr>
+                    <m:t>h</m:t>
+                  </m:r>
+                </m:den>
+              </m:f>
+              <m:nary>
+                <m:naryPr>
+                  <m:chr m:val="∑"/>
+                  <m:limLoc m:val="undOvr"/>
+                  <m:ctrlPr>
+                    <w:rPr>
+                      <w:rFonts w:ascii="Cambria Math" w:hAnsi="Cambria Math"/>
+                      <w:i/>
+                      <w:lang w:val="pt-BR"/>
+                    </w:rPr>
+                  </m:ctrlPr>
+                </m:naryPr>
+                <m:sub>
+                  <m:r>
+                    <w:rPr>
+                      <w:rFonts w:ascii="Cambria Math" w:hAnsi="Cambria Math"/>
+                      <w:lang w:val="pt-BR"/>
+                    </w:rPr>
+                    <m:t>t = 1</m:t>
+                  </m:r>
+                </m:sub>
+                <m:sup>
+                  <m:r>
+                    <w:rPr>
+                      <w:rFonts w:ascii="Cambria Math" w:hAnsi="Cambria Math"/>
+                      <w:lang w:val="pt-BR"/>
+                    </w:rPr>
+                    <m:t>h</m:t>
+                  </m:r>
+                </m:sup>
+                <m:e>
+                  <m:d>
+                    <m:dPr>
+                      <m:ctrlPr>
+                        <w:rPr>
+                          <w:rFonts w:ascii="Cambria Math" w:hAnsi="Cambria Math"/>
+                          <w:i/>
+                          <w:lang w:val="pt-BR"/>
+                        </w:rPr>
+                      </m:ctrlPr>
+                    </m:dPr>
+                    <m:e>
+                      <m:sSub>
+                        <m:sSubPr>
+                          <m:ctrlPr>
+                            <w:rPr>
+                              <w:rFonts w:ascii="Cambria Math" w:hAnsi="Cambria Math"/>
+                              <w:i/>
+                              <w:lang w:val="pt-BR"/>
+                            </w:rPr>
+                          </m:ctrlPr>
+                        </m:sSubPr>
+                        <m:e>
+                          <m:r>
+                            <w:rPr>
+                              <w:rFonts w:ascii="Cambria Math" w:hAnsi="Cambria Math"/>
+                              <w:lang w:val="pt-BR"/>
+                            </w:rPr>
+                            <m:t>y</m:t>
+                          </m:r>
+                        </m:e>
+                        <m:sub>
+                          <m:r>
+                            <w:rPr>
+                              <w:rFonts w:ascii="Cambria Math" w:hAnsi="Cambria Math"/>
+                              <w:lang w:val="pt-BR"/>
+                            </w:rPr>
+                            <m:t>t</m:t>
+                          </m:r>
+                        </m:sub>
+                      </m:sSub>
+                      <m:r>
+                        <w:rPr>
+                          <w:rFonts w:ascii="Cambria Math" w:hAnsi="Cambria Math"/>
+                          <w:lang w:val="pt-BR"/>
+                        </w:rPr>
+                        <m:t xml:space="preserve">- </m:t>
+                      </m:r>
+                      <m:acc>
+                        <m:accPr>
+                          <m:ctrlPr>
+                            <w:rPr>
+                              <w:rFonts w:ascii="Cambria Math" w:hAnsi="Cambria Math"/>
+                              <w:i/>
+                              <w:lang w:val="pt-BR"/>
+                            </w:rPr>
+                          </m:ctrlPr>
+                        </m:accPr>
+                        <m:e>
+                          <m:sSub>
+                            <m:sSubPr>
+                              <m:ctrlPr>
+                                <w:rPr>
+                                  <w:rFonts w:ascii="Cambria Math" w:hAnsi="Cambria Math"/>
+                                  <w:i/>
+                                  <w:lang w:val="pt-BR"/>
+                                </w:rPr>
+                              </m:ctrlPr>
+                            </m:sSubPr>
+                            <m:e>
+                              <m:r>
+                                <w:rPr>
+                                  <w:rFonts w:ascii="Cambria Math" w:hAnsi="Cambria Math"/>
+                                  <w:lang w:val="pt-BR"/>
+                                </w:rPr>
+                                <m:t>y</m:t>
+                              </m:r>
+                            </m:e>
+                            <m:sub>
+                              <m:r>
+                                <w:rPr>
+                                  <w:rFonts w:ascii="Cambria Math" w:hAnsi="Cambria Math"/>
+                                  <w:lang w:val="pt-BR"/>
+                                </w:rPr>
+                                <m:t>t</m:t>
+                              </m:r>
+                            </m:sub>
+                          </m:sSub>
+                        </m:e>
+                      </m:acc>
+                    </m:e>
+                  </m:d>
+                </m:e>
+              </m:nary>
+            </m:e>
+          </m:rad>
+          <m:r>
+            <w:rPr>
+              <w:rFonts w:ascii="Cambria Math" w:hAnsi="Cambria Math"/>
+              <w:lang w:val="pt-BR"/>
+            </w:rPr>
+            <m:t>²</m:t>
+          </m:r>
+        </m:oMath>
+      </m:oMathPara>
+    </w:p>
+    <w:p>
+      <w:pPr>
+        <w:pStyle w:val="Ttulo1"/>
         <w:rPr>
           <w:rFonts w:ascii="Times New Roman" w:hAnsi="Times New Roman"/>
           <w:color w:val="000000"/>
@@ -1114,7 +1941,7 @@
     </w:p>
     <w:p>
       <w:pPr>
-        <w:pStyle w:val="Heading2"/>
+        <w:pStyle w:val="Ttulo2"/>
         <w:rPr>
           <w:rFonts w:ascii="Times New Roman" w:hAnsi="Times New Roman"/>
           <w:color w:val="000000"/>
@@ -1139,17 +1966,25 @@
     <w:p>
       <w:pPr>
         <w:spacing w:after="0" w:line="360" w:lineRule="auto"/>
-        <w:rPr>
-          <w:rFonts w:ascii="Times New Roman" w:hAnsi="Times New Roman"/>
-          <w:lang w:val="pt-BR"/>
-        </w:rPr>
-      </w:pPr>
-      <w:r>
-        <w:rPr>
-          <w:rFonts w:ascii="Times New Roman" w:hAnsi="Times New Roman"/>
-          <w:lang w:val="pt-BR"/>
-        </w:rPr>
-        <w:t xml:space="preserve">Observa-se uma tendência de decrescimento suave no período de 1985 a 2019, com valores médios em torno de 230 a 250 ha e padrão sazonal regular associado às chuvas de verão. A partir de 2022, e especialmente em 2023 e 2024, a série exibe uma </w:t>
+        <w:jc w:val="both"/>
+        <w:rPr>
+          <w:rFonts w:ascii="Times New Roman" w:hAnsi="Times New Roman"/>
+          <w:lang w:val="pt-BR"/>
+        </w:rPr>
+      </w:pPr>
+      <w:r>
+        <w:rPr>
+          <w:rFonts w:ascii="Times New Roman" w:hAnsi="Times New Roman"/>
+          <w:lang w:val="pt-BR"/>
+        </w:rPr>
+        <w:t>A figura 1 apresenta a serie temporal completa e pode-se observar</w:t>
+      </w:r>
+      <w:r>
+        <w:rPr>
+          <w:rFonts w:ascii="Times New Roman" w:hAnsi="Times New Roman"/>
+          <w:lang w:val="pt-BR"/>
+        </w:rPr>
+        <w:t xml:space="preserve"> uma tendência de decrescimento suave no período de 1985 a 2019, com valores médios em torno de 230 a 250 ha e padrão sazonal regular associado às chuvas de verão. A partir de 2022, e especialmente em 2023 e 2024, a série exibe uma </w:t>
       </w:r>
       <w:r>
         <w:rPr>
@@ -1170,16 +2005,142 @@
     </w:p>
     <w:p>
       <w:pPr>
-        <w:spacing w:after="0" w:line="240" w:lineRule="auto"/>
+        <w:spacing w:after="0" w:line="360" w:lineRule="auto"/>
+        <w:jc w:val="both"/>
+        <w:rPr>
+          <w:rFonts w:ascii="Times New Roman" w:hAnsi="Times New Roman"/>
+          <w:lang w:val="pt-BR"/>
+        </w:rPr>
+      </w:pPr>
+    </w:p>
+    <w:p>
+      <w:pPr>
+        <w:pStyle w:val="Legenda"/>
+        <w:keepNext/>
         <w:jc w:val="center"/>
         <w:rPr>
-          <w:rFonts w:ascii="Times New Roman" w:hAnsi="Times New Roman"/>
-          <w:sz w:val="20"/>
-          <w:szCs w:val="20"/>
-          <w:lang w:val="pt-BR"/>
-        </w:rPr>
-      </w:pPr>
-      <w:r>
+          <w:color w:val="auto"/>
+          <w:u w:val="single"/>
+          <w:lang w:val="pt-BR"/>
+        </w:rPr>
+      </w:pPr>
+      <w:r>
+        <w:rPr>
+          <w:color w:val="auto"/>
+          <w:lang w:val="pt-BR"/>
+        </w:rPr>
+        <w:t xml:space="preserve">Figura </w:t>
+      </w:r>
+      <w:r>
+        <w:rPr>
+          <w:color w:val="auto"/>
+        </w:rPr>
+        <w:fldChar w:fldCharType="begin"/>
+      </w:r>
+      <w:r>
+        <w:rPr>
+          <w:color w:val="auto"/>
+          <w:lang w:val="pt-BR"/>
+        </w:rPr>
+        <w:instrText xml:space="preserve"> SEQ Figura \* ARABIC </w:instrText>
+      </w:r>
+      <w:r>
+        <w:rPr>
+          <w:color w:val="auto"/>
+        </w:rPr>
+        <w:fldChar w:fldCharType="separate"/>
+      </w:r>
+      <w:r>
+        <w:rPr>
+          <w:noProof/>
+          <w:color w:val="auto"/>
+          <w:lang w:val="pt-BR"/>
+        </w:rPr>
+        <w:t>1</w:t>
+      </w:r>
+      <w:r>
+        <w:rPr>
+          <w:color w:val="auto"/>
+        </w:rPr>
+        <w:fldChar w:fldCharType="end"/>
+      </w:r>
+      <w:r>
+        <w:rPr>
+          <w:color w:val="auto"/>
+          <w:lang w:val="pt-BR"/>
+        </w:rPr>
+        <w:t xml:space="preserve">: </w:t>
+      </w:r>
+      <w:proofErr w:type="spellStart"/>
+      <w:r>
+        <w:rPr>
+          <w:color w:val="auto"/>
+          <w:lang w:val="pt-BR"/>
+        </w:rPr>
+        <w:t>Superficies</w:t>
+      </w:r>
+      <w:proofErr w:type="spellEnd"/>
+      <w:r>
+        <w:rPr>
+          <w:color w:val="auto"/>
+          <w:lang w:val="pt-BR"/>
+        </w:rPr>
+        <w:t xml:space="preserve"> de água mensal em Belo Horizonte</w:t>
+      </w:r>
+    </w:p>
+    <w:p>
+      <w:pPr>
+        <w:spacing w:after="0" w:line="360" w:lineRule="auto"/>
+        <w:rPr>
+          <w:rFonts w:ascii="Times New Roman" w:hAnsi="Times New Roman"/>
+          <w:lang w:val="pt-BR"/>
+        </w:rPr>
+      </w:pPr>
+      <w:r>
+        <w:rPr>
+          <w:rFonts w:ascii="Times New Roman" w:hAnsi="Times New Roman"/>
+          <w:lang w:val="pt-BR"/>
+        </w:rPr>
+        <w:drawing>
+          <wp:inline distT="0" distB="0" distL="0" distR="0" wp14:anchorId="70FDA86A" wp14:editId="3214AF10">
+            <wp:extent cx="5798820" cy="3009067"/>
+            <wp:effectExtent l="0" t="0" r="0" b="1270"/>
+            <wp:docPr id="1" name="Imagem 1"/>
+            <wp:cNvGraphicFramePr>
+              <a:graphicFrameLocks xmlns:a="http://schemas.openxmlformats.org/drawingml/2006/main" noChangeAspect="1"/>
+            </wp:cNvGraphicFramePr>
+            <a:graphic xmlns:a="http://schemas.openxmlformats.org/drawingml/2006/main">
+              <a:graphicData uri="http://schemas.openxmlformats.org/drawingml/2006/picture">
+                <pic:pic xmlns:pic="http://schemas.openxmlformats.org/drawingml/2006/picture">
+                  <pic:nvPicPr>
+                    <pic:cNvPr id="1" name=""/>
+                    <pic:cNvPicPr/>
+                  </pic:nvPicPr>
+                  <pic:blipFill>
+                    <a:blip r:embed="rId5"/>
+                    <a:stretch>
+                      <a:fillRect/>
+                    </a:stretch>
+                  </pic:blipFill>
+                  <pic:spPr>
+                    <a:xfrm>
+                      <a:off x="0" y="0"/>
+                      <a:ext cx="5802933" cy="3011201"/>
+                    </a:xfrm>
+                    <a:prstGeom prst="rect">
+                      <a:avLst/>
+                    </a:prstGeom>
+                  </pic:spPr>
+                </pic:pic>
+              </a:graphicData>
+            </a:graphic>
+          </wp:inline>
+        </w:drawing>
+      </w:r>
+    </w:p>
+    <w:p>
+      <w:pPr>
+        <w:spacing w:after="0" w:line="360" w:lineRule="auto"/>
         <w:rPr>
           <w:rFonts w:ascii="Times New Roman" w:hAnsi="Times New Roman"/>
           <w:i/>
@@ -1188,107 +2149,399 @@
           <w:szCs w:val="20"/>
           <w:lang w:val="pt-BR"/>
         </w:rPr>
-        <w:t>[Inserir Figura 1 aqui: Superfície de água mensal em Belo Horizonte/MG (1985–2024) — arquivo 01_serie_completa.png]</w:t>
-      </w:r>
+      </w:pPr>
     </w:p>
     <w:p>
       <w:pPr>
         <w:spacing w:after="0" w:line="360" w:lineRule="auto"/>
-        <w:rPr>
-          <w:rFonts w:ascii="Times New Roman" w:hAnsi="Times New Roman"/>
-          <w:lang w:val="pt-BR"/>
-        </w:rPr>
-      </w:pPr>
-      <w:r>
-        <w:rPr>
-          <w:rFonts w:ascii="Times New Roman" w:hAnsi="Times New Roman"/>
-          <w:lang w:val="pt-BR"/>
-        </w:rPr>
-        <w:t>As estatísticas descritivas da série completa são: média = 276,07 ha; desvio padrão = 44,27 ha; mínimo = 213,33 ha; máximo = 399,18 ha; mediana = 258,01 ha. A diferença entre média e mediana reflete a assimetria introduzida pelos picos extremos de 2023 e 2024.</w:t>
+        <w:jc w:val="both"/>
+        <w:rPr>
+          <w:rFonts w:ascii="Times New Roman" w:hAnsi="Times New Roman"/>
+          <w:lang w:val="pt-BR"/>
+        </w:rPr>
+      </w:pPr>
+      <w:proofErr w:type="gramStart"/>
+      <w:r>
+        <w:rPr>
+          <w:rFonts w:ascii="Times New Roman" w:hAnsi="Times New Roman"/>
+          <w:lang w:val="pt-BR"/>
+        </w:rPr>
+        <w:t xml:space="preserve">As estatísticas descritivas da série </w:t>
+      </w:r>
+      <w:r>
+        <w:rPr>
+          <w:rFonts w:ascii="Times New Roman" w:hAnsi="Times New Roman"/>
+          <w:lang w:val="pt-BR"/>
+        </w:rPr>
+        <w:t xml:space="preserve">temporal </w:t>
+      </w:r>
+      <w:r>
+        <w:rPr>
+          <w:rFonts w:ascii="Times New Roman" w:hAnsi="Times New Roman"/>
+          <w:lang w:val="pt-BR"/>
+        </w:rPr>
+        <w:t>completa</w:t>
+      </w:r>
+      <w:proofErr w:type="gramEnd"/>
+      <w:r>
+        <w:rPr>
+          <w:rFonts w:ascii="Times New Roman" w:hAnsi="Times New Roman"/>
+          <w:lang w:val="pt-BR"/>
+        </w:rPr>
+        <w:t xml:space="preserve"> são: média = 276,07 ha; desvio padrão = 44,27 ha; mínimo = 213,33 ha; máximo = 399,18 ha; mediana = 258,01 ha. A diferença entre média e mediana reflete a assimetria introduzida pelos picos extremos de 2023 e 2024.</w:t>
       </w:r>
     </w:p>
     <w:p>
       <w:pPr>
         <w:spacing w:after="0" w:line="360" w:lineRule="auto"/>
-        <w:rPr>
-          <w:rFonts w:ascii="Times New Roman" w:hAnsi="Times New Roman"/>
-          <w:lang w:val="pt-BR"/>
-        </w:rPr>
-      </w:pPr>
-      <w:r>
-        <w:rPr>
-          <w:rFonts w:ascii="Times New Roman" w:hAnsi="Times New Roman"/>
-          <w:lang w:val="pt-BR"/>
-        </w:rPr>
-        <w:t>O periodograma integrado revela picos nas frequências correspondentes a ciclos anuais e semianuais, confirmando sazonalidade com período de 12 meses.</w:t>
-      </w:r>
-    </w:p>
-    <w:p>
-      <w:pPr>
-        <w:spacing w:after="0" w:line="240" w:lineRule="auto"/>
+        <w:jc w:val="both"/>
+        <w:rPr>
+          <w:rFonts w:ascii="Times New Roman" w:hAnsi="Times New Roman"/>
+          <w:u w:val="single"/>
+          <w:lang w:val="pt-BR"/>
+        </w:rPr>
+      </w:pPr>
+      <w:r>
+        <w:rPr>
+          <w:rFonts w:ascii="Times New Roman" w:hAnsi="Times New Roman"/>
+          <w:lang w:val="pt-BR"/>
+        </w:rPr>
+        <w:t>O periodograma integrado</w:t>
+      </w:r>
+      <w:r>
+        <w:rPr>
+          <w:rFonts w:ascii="Times New Roman" w:hAnsi="Times New Roman"/>
+          <w:lang w:val="pt-BR"/>
+        </w:rPr>
+        <w:t>, apresentado pela figura 2,</w:t>
+      </w:r>
+      <w:r>
+        <w:rPr>
+          <w:rFonts w:ascii="Times New Roman" w:hAnsi="Times New Roman"/>
+          <w:lang w:val="pt-BR"/>
+        </w:rPr>
+        <w:t xml:space="preserve"> revela picos nas frequências correspondentes a ciclos anuais e semianuais, confirmando sazonalidade com período de 12 meses.</w:t>
+      </w:r>
+    </w:p>
+    <w:p>
+      <w:pPr>
+        <w:pStyle w:val="Legenda"/>
+        <w:keepNext/>
         <w:jc w:val="center"/>
         <w:rPr>
-          <w:rFonts w:ascii="Times New Roman" w:hAnsi="Times New Roman"/>
-          <w:sz w:val="20"/>
-          <w:szCs w:val="20"/>
-          <w:lang w:val="pt-BR"/>
-        </w:rPr>
-      </w:pPr>
+          <w:color w:val="auto"/>
+          <w:lang w:val="pt-BR"/>
+        </w:rPr>
+      </w:pPr>
+      <w:r>
+        <w:rPr>
+          <w:color w:val="auto"/>
+          <w:lang w:val="pt-BR"/>
+        </w:rPr>
+        <w:lastRenderedPageBreak/>
+        <w:t xml:space="preserve">Figura </w:t>
+      </w:r>
+      <w:r>
+        <w:rPr>
+          <w:color w:val="auto"/>
+        </w:rPr>
+        <w:fldChar w:fldCharType="begin"/>
+      </w:r>
+      <w:r>
+        <w:rPr>
+          <w:color w:val="auto"/>
+          <w:lang w:val="pt-BR"/>
+        </w:rPr>
+        <w:instrText xml:space="preserve"> SEQ Figura \* ARABIC </w:instrText>
+      </w:r>
+      <w:r>
+        <w:rPr>
+          <w:color w:val="auto"/>
+        </w:rPr>
+        <w:fldChar w:fldCharType="separate"/>
+      </w:r>
+      <w:r>
+        <w:rPr>
+          <w:noProof/>
+          <w:color w:val="auto"/>
+          <w:lang w:val="pt-BR"/>
+        </w:rPr>
+        <w:t>2</w:t>
+      </w:r>
+      <w:r>
+        <w:rPr>
+          <w:color w:val="auto"/>
+        </w:rPr>
+        <w:fldChar w:fldCharType="end"/>
+      </w:r>
+      <w:r>
+        <w:rPr>
+          <w:color w:val="auto"/>
+          <w:lang w:val="pt-BR"/>
+        </w:rPr>
+        <w:t xml:space="preserve">: </w:t>
+      </w:r>
+      <w:proofErr w:type="spellStart"/>
+      <w:r>
+        <w:rPr>
+          <w:color w:val="auto"/>
+          <w:lang w:val="pt-BR"/>
+        </w:rPr>
+        <w:t>Periodograma</w:t>
+      </w:r>
+      <w:proofErr w:type="spellEnd"/>
+      <w:r>
+        <w:rPr>
+          <w:color w:val="auto"/>
+          <w:lang w:val="pt-BR"/>
+        </w:rPr>
+        <w:t xml:space="preserve"> integrado da série temporal</w:t>
+      </w:r>
+    </w:p>
+    <w:p>
+      <w:pPr>
+        <w:spacing w:after="0" w:line="360" w:lineRule="auto"/>
+        <w:jc w:val="center"/>
+        <w:rPr>
+          <w:rFonts w:ascii="Times New Roman" w:hAnsi="Times New Roman"/>
+          <w:lang w:val="pt-BR"/>
+        </w:rPr>
+      </w:pPr>
+      <w:r>
+        <w:rPr>
+          <w:rFonts w:ascii="Times New Roman" w:hAnsi="Times New Roman"/>
+          <w:lang w:val="pt-BR"/>
+        </w:rPr>
+        <w:drawing>
+          <wp:inline distT="0" distB="0" distL="0" distR="0" wp14:anchorId="07F56EBA" wp14:editId="7146709E">
+            <wp:extent cx="3688080" cy="3001688"/>
+            <wp:effectExtent l="0" t="0" r="7620" b="8255"/>
+            <wp:docPr id="2" name="Imagem 2"/>
+            <wp:cNvGraphicFramePr>
+              <a:graphicFrameLocks xmlns:a="http://schemas.openxmlformats.org/drawingml/2006/main" noChangeAspect="1"/>
+            </wp:cNvGraphicFramePr>
+            <a:graphic xmlns:a="http://schemas.openxmlformats.org/drawingml/2006/main">
+              <a:graphicData uri="http://schemas.openxmlformats.org/drawingml/2006/picture">
+                <pic:pic xmlns:pic="http://schemas.openxmlformats.org/drawingml/2006/picture">
+                  <pic:nvPicPr>
+                    <pic:cNvPr id="1" name=""/>
+                    <pic:cNvPicPr/>
+                  </pic:nvPicPr>
+                  <pic:blipFill>
+                    <a:blip r:embed="rId6"/>
+                    <a:stretch>
+                      <a:fillRect/>
+                    </a:stretch>
+                  </pic:blipFill>
+                  <pic:spPr>
+                    <a:xfrm>
+                      <a:off x="0" y="0"/>
+                      <a:ext cx="3712285" cy="3021388"/>
+                    </a:xfrm>
+                    <a:prstGeom prst="rect">
+                      <a:avLst/>
+                    </a:prstGeom>
+                  </pic:spPr>
+                </pic:pic>
+              </a:graphicData>
+            </a:graphic>
+          </wp:inline>
+        </w:drawing>
+      </w:r>
+    </w:p>
+    <w:p>
+      <w:pPr>
+        <w:spacing w:after="0" w:line="360" w:lineRule="auto"/>
+        <w:jc w:val="center"/>
+        <w:rPr>
+          <w:rFonts w:ascii="Times New Roman" w:hAnsi="Times New Roman"/>
+          <w:lang w:val="pt-BR"/>
+        </w:rPr>
+      </w:pPr>
+    </w:p>
+    <w:p>
+      <w:pPr>
+        <w:spacing w:after="0" w:line="360" w:lineRule="auto"/>
+        <w:jc w:val="both"/>
+        <w:rPr>
+          <w:rFonts w:ascii="Times New Roman" w:hAnsi="Times New Roman"/>
+          <w:lang w:val="pt-BR"/>
+        </w:rPr>
+      </w:pPr>
+      <w:r>
+        <w:rPr>
+          <w:rFonts w:ascii="Times New Roman" w:hAnsi="Times New Roman"/>
+          <w:lang w:val="pt-BR"/>
+        </w:rPr>
+        <w:t>A decomposição clássica</w:t>
+      </w:r>
+      <w:r>
+        <w:rPr>
+          <w:rFonts w:ascii="Times New Roman" w:hAnsi="Times New Roman"/>
+          <w:lang w:val="pt-BR"/>
+        </w:rPr>
+        <w:t>, apresentado no gráfico da figura 3,</w:t>
+      </w:r>
+      <w:r>
+        <w:rPr>
+          <w:rFonts w:ascii="Times New Roman" w:hAnsi="Times New Roman"/>
+          <w:lang w:val="pt-BR"/>
+        </w:rPr>
+        <w:t xml:space="preserve"> evidencia a tendência declinante de longo prazo e uma sazonalidade estável ao longo da maior parte do período. O componente residual mostra aumento de amplitude a partir de 2022. </w:t>
+      </w:r>
+    </w:p>
+    <w:p>
+      <w:pPr>
+        <w:spacing w:after="0" w:line="360" w:lineRule="auto"/>
+        <w:jc w:val="both"/>
+        <w:rPr>
+          <w:rFonts w:ascii="Times New Roman" w:hAnsi="Times New Roman"/>
+          <w:lang w:val="pt-BR"/>
+        </w:rPr>
+      </w:pPr>
+      <w:r>
+        <w:rPr>
+          <w:rFonts w:ascii="Times New Roman" w:hAnsi="Times New Roman"/>
+          <w:lang w:val="pt-BR"/>
+        </w:rPr>
+        <w:t>O Teste ADF resultou em DF = -4,07 (lag = 7; p &lt; 0,01), rejeitando a hipótese nula de raiz unitária. A série é, portanto, estacionária ao nível de 1% de significância.</w:t>
+      </w:r>
+      <w:r>
+        <w:rPr>
+          <w:rFonts w:ascii="Times New Roman" w:hAnsi="Times New Roman"/>
+          <w:lang w:val="pt-BR"/>
+        </w:rPr>
+        <w:t xml:space="preserve"> A função de </w:t>
+      </w:r>
+      <w:proofErr w:type="spellStart"/>
+      <w:proofErr w:type="gramStart"/>
       <w:r>
         <w:rPr>
           <w:rFonts w:ascii="Times New Roman" w:hAnsi="Times New Roman"/>
           <w:i/>
           <w:iCs/>
-          <w:sz w:val="20"/>
-          <w:szCs w:val="20"/>
-          <w:lang w:val="pt-BR"/>
-        </w:rPr>
-        <w:lastRenderedPageBreak/>
-        <w:t>[Inserir Figura 2 aqui: Periodograma integrado da série — arquivo 02_periodograma_integrado.png]</w:t>
-      </w:r>
-    </w:p>
-    <w:p>
-      <w:pPr>
-        <w:spacing w:after="0" w:line="360" w:lineRule="auto"/>
-        <w:rPr>
-          <w:rFonts w:ascii="Times New Roman" w:hAnsi="Times New Roman"/>
-          <w:lang w:val="pt-BR"/>
-        </w:rPr>
-      </w:pPr>
-      <w:r>
-        <w:rPr>
-          <w:rFonts w:ascii="Times New Roman" w:hAnsi="Times New Roman"/>
-          <w:lang w:val="pt-BR"/>
-        </w:rPr>
-        <w:t>A decomposição clássica evidencia a tendência declinante de longo prazo e uma sazonalidade estável ao longo da maior parte do período. O componente residual mostra aumento de amplitude a partir de 2022. O Teste ADF resultou em DF = -4,07 (lag = 7; p &lt; 0,01), rejeitando a hipótese nula de raiz unitária. A série é, portanto, estacionária ao nível de 1% de significância.</w:t>
-      </w:r>
-    </w:p>
-    <w:p>
-      <w:pPr>
-        <w:spacing w:after="0" w:line="240" w:lineRule="auto"/>
-        <w:jc w:val="center"/>
-        <w:rPr>
-          <w:rFonts w:ascii="Times New Roman" w:hAnsi="Times New Roman"/>
-          <w:sz w:val="20"/>
-          <w:szCs w:val="20"/>
-          <w:lang w:val="pt-BR"/>
-        </w:rPr>
-      </w:pPr>
+          <w:lang w:val="pt-BR"/>
+        </w:rPr>
+        <w:t>auto.arrima</w:t>
+      </w:r>
+      <w:proofErr w:type="spellEnd"/>
+      <w:proofErr w:type="gramEnd"/>
       <w:r>
         <w:rPr>
           <w:rFonts w:ascii="Times New Roman" w:hAnsi="Times New Roman"/>
           <w:i/>
           <w:iCs/>
-          <w:sz w:val="20"/>
-          <w:szCs w:val="20"/>
-          <w:lang w:val="pt-BR"/>
-        </w:rPr>
-        <w:t>[Inserir Figura 3 aqui: Decomposição clássica aditiva da série temporal — arquivo 03_decomposicao.png]</w:t>
-      </w:r>
-    </w:p>
-    <w:p>
-      <w:pPr>
-        <w:pStyle w:val="Heading2"/>
+          <w:lang w:val="pt-BR"/>
+        </w:rPr>
+        <w:t>()</w:t>
+      </w:r>
+      <w:r>
+        <w:rPr>
+          <w:rFonts w:ascii="Times New Roman" w:hAnsi="Times New Roman"/>
+          <w:lang w:val="pt-BR"/>
+        </w:rPr>
+        <w:t xml:space="preserve"> aplicada captou esse resultado selecionando d = 0 para a componente não sazonal.</w:t>
+      </w:r>
+    </w:p>
+    <w:p>
+      <w:pPr>
+        <w:pStyle w:val="Legenda"/>
+        <w:keepNext/>
+        <w:jc w:val="center"/>
+        <w:rPr>
+          <w:lang w:val="pt-BR"/>
+        </w:rPr>
+      </w:pPr>
+      <w:r>
+        <w:rPr>
+          <w:lang w:val="pt-BR"/>
+        </w:rPr>
+        <w:lastRenderedPageBreak/>
+        <w:t xml:space="preserve">Figura </w:t>
+      </w:r>
+      <w:r>
+        <w:fldChar w:fldCharType="begin"/>
+      </w:r>
+      <w:r>
+        <w:rPr>
+          <w:lang w:val="pt-BR"/>
+        </w:rPr>
+        <w:instrText xml:space="preserve"> SEQ Figura \* ARABIC </w:instrText>
+      </w:r>
+      <w:r>
+        <w:fldChar w:fldCharType="separate"/>
+      </w:r>
+      <w:r>
+        <w:rPr>
+          <w:noProof/>
+          <w:lang w:val="pt-BR"/>
+        </w:rPr>
+        <w:t>3</w:t>
+      </w:r>
+      <w:r>
+        <w:fldChar w:fldCharType="end"/>
+      </w:r>
+      <w:r>
+        <w:rPr>
+          <w:lang w:val="pt-BR"/>
+        </w:rPr>
+        <w:t>: Decomposição da série Temporal</w:t>
+      </w:r>
+    </w:p>
+    <w:p>
+      <w:pPr>
+        <w:spacing w:after="0" w:line="360" w:lineRule="auto"/>
+        <w:jc w:val="center"/>
+        <w:rPr>
+          <w:rFonts w:ascii="Times New Roman" w:hAnsi="Times New Roman"/>
+          <w:lang w:val="pt-BR"/>
+        </w:rPr>
+      </w:pPr>
+      <w:r>
+        <w:rPr>
+          <w:rFonts w:ascii="Times New Roman" w:hAnsi="Times New Roman"/>
+          <w:lang w:val="pt-BR"/>
+        </w:rPr>
+        <w:drawing>
+          <wp:inline distT="0" distB="0" distL="0" distR="0" wp14:anchorId="50F81A96" wp14:editId="61F1765B">
+            <wp:extent cx="5943600" cy="3888740"/>
+            <wp:effectExtent l="0" t="0" r="0" b="0"/>
+            <wp:docPr id="3" name="Imagem 3"/>
+            <wp:cNvGraphicFramePr>
+              <a:graphicFrameLocks xmlns:a="http://schemas.openxmlformats.org/drawingml/2006/main" noChangeAspect="1"/>
+            </wp:cNvGraphicFramePr>
+            <a:graphic xmlns:a="http://schemas.openxmlformats.org/drawingml/2006/main">
+              <a:graphicData uri="http://schemas.openxmlformats.org/drawingml/2006/picture">
+                <pic:pic xmlns:pic="http://schemas.openxmlformats.org/drawingml/2006/picture">
+                  <pic:nvPicPr>
+                    <pic:cNvPr id="1" name=""/>
+                    <pic:cNvPicPr/>
+                  </pic:nvPicPr>
+                  <pic:blipFill>
+                    <a:blip r:embed="rId7"/>
+                    <a:stretch>
+                      <a:fillRect/>
+                    </a:stretch>
+                  </pic:blipFill>
+                  <pic:spPr>
+                    <a:xfrm>
+                      <a:off x="0" y="0"/>
+                      <a:ext cx="5943600" cy="3888740"/>
+                    </a:xfrm>
+                    <a:prstGeom prst="rect">
+                      <a:avLst/>
+                    </a:prstGeom>
+                  </pic:spPr>
+                </pic:pic>
+              </a:graphicData>
+            </a:graphic>
+          </wp:inline>
+        </w:drawing>
+      </w:r>
+    </w:p>
+    <w:p>
+      <w:pPr>
+        <w:pStyle w:val="Ttulo2"/>
         <w:rPr>
           <w:rFonts w:ascii="Times New Roman" w:hAnsi="Times New Roman"/>
           <w:color w:val="000000"/>
@@ -1313,6 +2566,7 @@
     <w:p>
       <w:pPr>
         <w:spacing w:after="0" w:line="360" w:lineRule="auto"/>
+        <w:jc w:val="both"/>
         <w:rPr>
           <w:rFonts w:ascii="Times New Roman" w:hAnsi="Times New Roman"/>
           <w:lang w:val="pt-BR"/>
@@ -1325,6 +2579,16 @@
         </w:rPr>
         <w:t>A Tabela 2 apresenta os parâmetros estimados dos cinco modelos ajustados à base de treino.</w:t>
       </w:r>
+    </w:p>
+    <w:p>
+      <w:pPr>
+        <w:spacing w:after="0" w:line="360" w:lineRule="auto"/>
+        <w:jc w:val="both"/>
+        <w:rPr>
+          <w:rFonts w:ascii="Times New Roman" w:hAnsi="Times New Roman"/>
+          <w:lang w:val="pt-BR"/>
+        </w:rPr>
+      </w:pPr>
     </w:p>
     <w:p>
       <w:pPr>
@@ -1605,16 +2869,18 @@
     <w:p>
       <w:pPr>
         <w:spacing w:after="0" w:line="360" w:lineRule="auto"/>
-        <w:rPr>
-          <w:rFonts w:ascii="Times New Roman" w:hAnsi="Times New Roman"/>
-          <w:lang w:val="pt-BR"/>
-        </w:rPr>
-      </w:pPr>
-      <w:r>
-        <w:rPr>
-          <w:rFonts w:ascii="Times New Roman" w:hAnsi="Times New Roman"/>
-          <w:lang w:val="pt-BR"/>
-        </w:rPr>
+        <w:jc w:val="both"/>
+        <w:rPr>
+          <w:rFonts w:ascii="Times New Roman" w:hAnsi="Times New Roman"/>
+          <w:lang w:val="pt-BR"/>
+        </w:rPr>
+      </w:pPr>
+      <w:r>
+        <w:rPr>
+          <w:rFonts w:ascii="Times New Roman" w:hAnsi="Times New Roman"/>
+          <w:lang w:val="pt-BR"/>
+        </w:rPr>
+        <w:lastRenderedPageBreak/>
         <w:t xml:space="preserve">O valor de </w:t>
       </w:r>
       <w:r>
@@ -1628,12 +2894,26 @@
           <w:rFonts w:ascii="Times New Roman" w:hAnsi="Times New Roman"/>
           <w:lang w:val="pt-BR"/>
         </w:rPr>
-        <w:t xml:space="preserve"> praticamente nulo nos modelos Holt e Holt-Winters indica que o componente de tendência tem peso muito reduzido na série de treino. O modelo ARIMA selecionado inclui diferenciação sazonal de ordem 1 e componente sazonal de médias móveis, capturando o ciclo anual. Já o modelo ETS(M,N,M) é compatível com uma estrutura sem tendência e sazonalidade multiplicativa.</w:t>
-      </w:r>
-    </w:p>
-    <w:p>
-      <w:pPr>
-        <w:pStyle w:val="Heading2"/>
+        <w:t xml:space="preserve"> praticamente nulo nos modelos </w:t>
+      </w:r>
+      <w:r>
+        <w:rPr>
+          <w:rFonts w:ascii="Times New Roman" w:hAnsi="Times New Roman"/>
+          <w:lang w:val="pt-BR"/>
+        </w:rPr>
+        <w:t>Holt</w:t>
+      </w:r>
+      <w:r>
+        <w:rPr>
+          <w:rFonts w:ascii="Times New Roman" w:hAnsi="Times New Roman"/>
+          <w:lang w:val="pt-BR"/>
+        </w:rPr>
+        <w:t xml:space="preserve"> e Holt-Winters indica que o componente de tendência tem peso muito reduzido na série de treino. O modelo ARIMA selecionado inclui diferenciação sazonal de ordem 1 e componente sazonal de médias móveis, capturando o ciclo anual. Já o modelo ETS(M,N,M) é compatível com uma estrutura sem tendência e sazonalidade multiplicativa.</w:t>
+      </w:r>
+    </w:p>
+    <w:p>
+      <w:pPr>
+        <w:pStyle w:val="Ttulo2"/>
         <w:rPr>
           <w:rFonts w:ascii="Times New Roman" w:hAnsi="Times New Roman"/>
           <w:color w:val="000000"/>
@@ -1863,7 +3143,6 @@
           </w:tcPr>
           <w:p>
             <w:r>
-              <w:lastRenderedPageBreak/>
               <w:t>3º</w:t>
             </w:r>
           </w:p>
@@ -1984,17 +3263,118 @@
           <w:lang w:val="pt-BR"/>
         </w:rPr>
       </w:pPr>
-      <w:r>
-        <w:rPr>
-          <w:rFonts w:ascii="Times New Roman" w:hAnsi="Times New Roman"/>
-          <w:lang w:val="pt-BR"/>
-        </w:rPr>
-        <w:t>O modelo ARIMA apresentou AIC consideravelmente menor que os demais, indicando melhor ajuste na base de treino. Dentro da família dos modelos de suavização, o ETS superou o Holt-Winters aditivo em termos de ajuste.</w:t>
-      </w:r>
-    </w:p>
-    <w:p>
-      <w:pPr>
-        <w:pStyle w:val="Heading2"/>
+    </w:p>
+    <w:p>
+      <w:pPr>
+        <w:spacing w:after="0" w:line="360" w:lineRule="auto"/>
+        <w:rPr>
+          <w:rFonts w:ascii="Times New Roman" w:hAnsi="Times New Roman"/>
+          <w:lang w:val="pt-BR"/>
+        </w:rPr>
+      </w:pPr>
+      <w:r>
+        <w:rPr>
+          <w:rFonts w:ascii="Times New Roman" w:hAnsi="Times New Roman"/>
+          <w:lang w:val="pt-BR"/>
+        </w:rPr>
+        <w:t>O modelo ARIMA apresentou AIC</w:t>
+      </w:r>
+      <w:r>
+        <w:rPr>
+          <w:rFonts w:ascii="Times New Roman" w:hAnsi="Times New Roman"/>
+          <w:lang w:val="pt-BR"/>
+        </w:rPr>
+        <w:t xml:space="preserve"> de 3094,43 que é</w:t>
+      </w:r>
+      <w:r>
+        <w:rPr>
+          <w:rFonts w:ascii="Times New Roman" w:hAnsi="Times New Roman"/>
+          <w:lang w:val="pt-BR"/>
+        </w:rPr>
+        <w:t xml:space="preserve"> consideravelmente menor que os demais, indicando melhor ajuste na base de treino. Dentro da família dos modelos de suavização, o ETS superou o Holt-Winters aditivo em termos de ajuste.</w:t>
+      </w:r>
+      <w:r>
+        <w:rPr>
+          <w:rFonts w:ascii="Times New Roman" w:hAnsi="Times New Roman"/>
+          <w:lang w:val="pt-BR"/>
+        </w:rPr>
+        <w:t xml:space="preserve"> Segundo </w:t>
+      </w:r>
+      <w:r>
+        <w:rPr>
+          <w:rFonts w:ascii="Times New Roman" w:hAnsi="Times New Roman"/>
+          <w:lang w:val="pt-BR"/>
+        </w:rPr>
+        <w:t>(HYNDMAN; KHANDAKAR, 2008)</w:t>
+      </w:r>
+      <w:r>
+        <w:rPr>
+          <w:rFonts w:ascii="Times New Roman" w:hAnsi="Times New Roman"/>
+          <w:lang w:val="pt-BR"/>
+        </w:rPr>
+        <w:t>, é importante</w:t>
+      </w:r>
+      <w:r>
+        <w:rPr>
+          <w:rFonts w:ascii="Times New Roman" w:hAnsi="Times New Roman"/>
+          <w:lang w:val="pt-BR"/>
+        </w:rPr>
+        <w:t xml:space="preserve"> ressalvar que comparações de AIC entre ARIMA e ETS devem ser</w:t>
+      </w:r>
+      <w:r>
+        <w:rPr>
+          <w:rFonts w:ascii="Times New Roman" w:hAnsi="Times New Roman"/>
+          <w:lang w:val="pt-BR"/>
+        </w:rPr>
+        <w:t xml:space="preserve"> </w:t>
+      </w:r>
+      <w:r>
+        <w:rPr>
+          <w:rFonts w:ascii="Times New Roman" w:hAnsi="Times New Roman"/>
+          <w:lang w:val="pt-BR"/>
+        </w:rPr>
+        <w:t>interpretadas com cautela</w:t>
+      </w:r>
+      <w:r>
+        <w:rPr>
+          <w:rFonts w:ascii="Times New Roman" w:hAnsi="Times New Roman"/>
+          <w:lang w:val="pt-BR"/>
+        </w:rPr>
+        <w:t xml:space="preserve"> pois</w:t>
+      </w:r>
+      <w:r>
+        <w:rPr>
+          <w:rFonts w:ascii="Times New Roman" w:hAnsi="Times New Roman"/>
+          <w:lang w:val="pt-BR"/>
+        </w:rPr>
+        <w:t xml:space="preserve"> modelos com erros multiplicativos operam em escalas distintas da</w:t>
+      </w:r>
+      <w:r>
+        <w:rPr>
+          <w:rFonts w:ascii="Times New Roman" w:hAnsi="Times New Roman"/>
+          <w:lang w:val="pt-BR"/>
+        </w:rPr>
+        <w:t xml:space="preserve"> </w:t>
+      </w:r>
+      <w:r>
+        <w:rPr>
+          <w:rFonts w:ascii="Times New Roman" w:hAnsi="Times New Roman"/>
+          <w:lang w:val="pt-BR"/>
+        </w:rPr>
+        <w:t>log-verossimilhança, podendo tornar a comparação absoluta questionável</w:t>
+      </w:r>
+      <w:r>
+        <w:rPr>
+          <w:rFonts w:ascii="Times New Roman" w:hAnsi="Times New Roman"/>
+          <w:lang w:val="pt-BR"/>
+        </w:rPr>
+        <w:t>.</w:t>
+      </w:r>
+    </w:p>
+    <w:p>
+      <w:pPr>
+        <w:pStyle w:val="Ttulo2"/>
+        <w:jc w:val="both"/>
         <w:rPr>
           <w:rFonts w:ascii="Times New Roman" w:hAnsi="Times New Roman"/>
           <w:color w:val="000000"/>
@@ -2019,6 +3399,7 @@
     <w:p>
       <w:pPr>
         <w:spacing w:after="0" w:line="360" w:lineRule="auto"/>
+        <w:jc w:val="both"/>
         <w:rPr>
           <w:rFonts w:ascii="Times New Roman" w:hAnsi="Times New Roman"/>
           <w:lang w:val="pt-BR"/>
@@ -2183,6 +3564,7 @@
           </w:tcPr>
           <w:p>
             <w:r>
+              <w:lastRenderedPageBreak/>
               <w:t>2º</w:t>
             </w:r>
           </w:p>
@@ -2338,7 +3720,119 @@
     </w:tbl>
     <w:p>
       <w:pPr>
-        <w:pStyle w:val="Heading2"/>
+        <w:rPr>
+          <w:lang w:val="pt-BR"/>
+        </w:rPr>
+      </w:pPr>
+    </w:p>
+    <w:p>
+      <w:pPr>
+        <w:spacing w:line="360" w:lineRule="auto"/>
+        <w:jc w:val="both"/>
+        <w:rPr>
+          <w:rFonts w:ascii="Times New Roman" w:hAnsi="Times New Roman" w:cs="Times New Roman"/>
+          <w:lang w:val="pt-BR"/>
+        </w:rPr>
+      </w:pPr>
+      <w:r>
+        <w:rPr>
+          <w:rFonts w:ascii="Times New Roman" w:hAnsi="Times New Roman" w:cs="Times New Roman"/>
+          <w:lang w:val="pt-BR"/>
+        </w:rPr>
+        <w:t xml:space="preserve">O modelo SES registrou o menor RMSE (51,37 ha), seguido pelo ETS (53,28 </w:t>
+      </w:r>
+      <w:proofErr w:type="spellStart"/>
+      <w:r>
+        <w:rPr>
+          <w:rFonts w:ascii="Times New Roman" w:hAnsi="Times New Roman" w:cs="Times New Roman"/>
+          <w:lang w:val="pt-BR"/>
+        </w:rPr>
+        <w:t>ha</w:t>
+      </w:r>
+      <w:proofErr w:type="spellEnd"/>
+      <w:r>
+        <w:rPr>
+          <w:rFonts w:ascii="Times New Roman" w:hAnsi="Times New Roman" w:cs="Times New Roman"/>
+          <w:lang w:val="pt-BR"/>
+        </w:rPr>
+        <w:t>).</w:t>
+      </w:r>
+      <w:r>
+        <w:rPr>
+          <w:rFonts w:ascii="Times New Roman" w:hAnsi="Times New Roman" w:cs="Times New Roman"/>
+          <w:lang w:val="pt-BR"/>
+        </w:rPr>
+        <w:t xml:space="preserve"> </w:t>
+      </w:r>
+      <w:r>
+        <w:rPr>
+          <w:rFonts w:ascii="Times New Roman" w:hAnsi="Times New Roman" w:cs="Times New Roman"/>
+          <w:lang w:val="pt-BR"/>
+        </w:rPr>
+        <w:t>Notavelmente, o ARIMA</w:t>
+      </w:r>
+      <w:r>
+        <w:rPr>
+          <w:rFonts w:ascii="Times New Roman" w:hAnsi="Times New Roman" w:cs="Times New Roman"/>
+          <w:lang w:val="pt-BR"/>
+        </w:rPr>
+        <w:t xml:space="preserve"> (</w:t>
+      </w:r>
+      <w:r>
+        <w:rPr>
+          <w:rFonts w:ascii="Times New Roman" w:hAnsi="Times New Roman" w:cs="Times New Roman"/>
+          <w:lang w:val="pt-BR"/>
+        </w:rPr>
+        <w:t>melhor modelo por AIC</w:t>
+      </w:r>
+      <w:r>
+        <w:rPr>
+          <w:rFonts w:ascii="Times New Roman" w:hAnsi="Times New Roman" w:cs="Times New Roman"/>
+          <w:lang w:val="pt-BR"/>
+        </w:rPr>
+        <w:t>)</w:t>
+      </w:r>
+      <w:r>
+        <w:rPr>
+          <w:rFonts w:ascii="Times New Roman" w:hAnsi="Times New Roman" w:cs="Times New Roman"/>
+          <w:lang w:val="pt-BR"/>
+        </w:rPr>
+        <w:t xml:space="preserve"> ocupou o último lugar em RMSE</w:t>
+      </w:r>
+      <w:r>
+        <w:rPr>
+          <w:rFonts w:ascii="Times New Roman" w:hAnsi="Times New Roman" w:cs="Times New Roman"/>
+          <w:lang w:val="pt-BR"/>
+        </w:rPr>
+        <w:t xml:space="preserve"> </w:t>
+      </w:r>
+      <w:r>
+        <w:rPr>
+          <w:rFonts w:ascii="Times New Roman" w:hAnsi="Times New Roman" w:cs="Times New Roman"/>
+          <w:lang w:val="pt-BR"/>
+        </w:rPr>
+        <w:t xml:space="preserve">(61,72 </w:t>
+      </w:r>
+      <w:proofErr w:type="spellStart"/>
+      <w:r>
+        <w:rPr>
+          <w:rFonts w:ascii="Times New Roman" w:hAnsi="Times New Roman" w:cs="Times New Roman"/>
+          <w:lang w:val="pt-BR"/>
+        </w:rPr>
+        <w:t>ha</w:t>
+      </w:r>
+      <w:proofErr w:type="spellEnd"/>
+      <w:r>
+        <w:rPr>
+          <w:rFonts w:ascii="Times New Roman" w:hAnsi="Times New Roman" w:cs="Times New Roman"/>
+          <w:lang w:val="pt-BR"/>
+        </w:rPr>
+        <w:t>).</w:t>
+      </w:r>
+    </w:p>
+    <w:p>
+      <w:pPr>
+        <w:pStyle w:val="Ttulo2"/>
         <w:rPr>
           <w:rFonts w:ascii="Times New Roman" w:hAnsi="Times New Roman"/>
           <w:color w:val="000000"/>
@@ -2363,8 +3857,10 @@
     <w:p>
       <w:pPr>
         <w:spacing w:after="0" w:line="360" w:lineRule="auto"/>
-        <w:rPr>
-          <w:rFonts w:ascii="Times New Roman" w:hAnsi="Times New Roman"/>
+        <w:jc w:val="both"/>
+        <w:rPr>
+          <w:rFonts w:ascii="Times New Roman" w:hAnsi="Times New Roman"/>
+          <w:u w:val="single"/>
           <w:lang w:val="pt-BR"/>
         </w:rPr>
       </w:pPr>
@@ -2382,21 +3878,156 @@
           <w:rFonts w:ascii="Times New Roman" w:hAnsi="Times New Roman"/>
           <w:lang w:val="pt-BR"/>
         </w:rPr>
-        <w:t xml:space="preserve"> Observa-se que todos os cinco modelos previram valores próximos ao nível médio da série de treino ao longo do horizonte de 60 meses. Contudo, os valores reais seguiram trajetória distinta, com elevação abrupta em 2023 e 2024.</w:t>
+        <w:t xml:space="preserve"> </w:t>
+      </w:r>
+      <w:r>
+        <w:rPr>
+          <w:rFonts w:ascii="Times New Roman" w:hAnsi="Times New Roman"/>
+          <w:lang w:val="pt-BR"/>
+        </w:rPr>
+        <w:t>A Figura 4 compara a previsão do modelo SES com os valores reais no período de teste</w:t>
+      </w:r>
+      <w:r>
+        <w:rPr>
+          <w:rFonts w:ascii="Times New Roman" w:hAnsi="Times New Roman"/>
+          <w:lang w:val="pt-BR"/>
+        </w:rPr>
+        <w:t xml:space="preserve">. </w:t>
+      </w:r>
+      <w:r>
+        <w:rPr>
+          <w:rFonts w:ascii="Times New Roman" w:hAnsi="Times New Roman"/>
+          <w:lang w:val="pt-BR"/>
+        </w:rPr>
+        <w:t xml:space="preserve">Observa-se que todos os cinco modelos previram valores próximos ao nível médio da série de treino ao longo do horizonte de 60 meses. </w:t>
+      </w:r>
+      <w:r>
+        <w:rPr>
+          <w:rFonts w:ascii="Times New Roman" w:hAnsi="Times New Roman"/>
+          <w:lang w:val="pt-BR"/>
+        </w:rPr>
+        <w:t>Contudo</w:t>
+      </w:r>
+      <w:r>
+        <w:rPr>
+          <w:rFonts w:ascii="Times New Roman" w:hAnsi="Times New Roman"/>
+          <w:lang w:val="pt-BR"/>
+        </w:rPr>
+        <w:t>, os valores reais seguiram trajetória distinta, com elevação abrupta em 2023 e 2024.</w:t>
+      </w:r>
+    </w:p>
+    <w:p>
+      <w:pPr>
+        <w:pStyle w:val="Legenda"/>
+        <w:keepNext/>
+        <w:jc w:val="center"/>
+        <w:rPr>
+          <w:color w:val="auto"/>
+          <w:lang w:val="pt-BR"/>
+        </w:rPr>
+      </w:pPr>
+      <w:r>
+        <w:rPr>
+          <w:color w:val="auto"/>
+          <w:lang w:val="pt-BR"/>
+        </w:rPr>
+        <w:t xml:space="preserve">Figura </w:t>
+      </w:r>
+      <w:r>
+        <w:rPr>
+          <w:color w:val="auto"/>
+        </w:rPr>
+        <w:fldChar w:fldCharType="begin"/>
+      </w:r>
+      <w:r>
+        <w:rPr>
+          <w:color w:val="auto"/>
+          <w:lang w:val="pt-BR"/>
+        </w:rPr>
+        <w:instrText xml:space="preserve"> SEQ Figura \* ARABIC </w:instrText>
+      </w:r>
+      <w:r>
+        <w:rPr>
+          <w:color w:val="auto"/>
+        </w:rPr>
+        <w:fldChar w:fldCharType="separate"/>
+      </w:r>
+      <w:r>
+        <w:rPr>
+          <w:noProof/>
+          <w:color w:val="auto"/>
+          <w:lang w:val="pt-BR"/>
+        </w:rPr>
+        <w:t>4</w:t>
+      </w:r>
+      <w:r>
+        <w:rPr>
+          <w:color w:val="auto"/>
+        </w:rPr>
+        <w:fldChar w:fldCharType="end"/>
+      </w:r>
+      <w:r>
+        <w:rPr>
+          <w:color w:val="auto"/>
+          <w:lang w:val="pt-BR"/>
+        </w:rPr>
+        <w:t>: Previsão SES versus valores reais no período de teste (2020–2024)</w:t>
+      </w:r>
+    </w:p>
+    <w:p>
+      <w:pPr>
+        <w:spacing w:after="0" w:line="360" w:lineRule="auto"/>
+        <w:rPr>
+          <w:rFonts w:ascii="Times New Roman" w:hAnsi="Times New Roman"/>
+          <w:lang w:val="pt-BR"/>
+        </w:rPr>
+      </w:pPr>
+      <w:r>
+        <w:rPr>
+          <w:rFonts w:ascii="Times New Roman" w:hAnsi="Times New Roman"/>
+          <w:lang w:val="pt-BR"/>
+        </w:rPr>
+        <w:drawing>
+          <wp:inline distT="0" distB="0" distL="0" distR="0" wp14:anchorId="5DBA4B06" wp14:editId="1CB6A7B7">
+            <wp:extent cx="5943600" cy="3213735"/>
+            <wp:effectExtent l="0" t="0" r="0" b="5715"/>
+            <wp:docPr id="4" name="Imagem 4"/>
+            <wp:cNvGraphicFramePr>
+              <a:graphicFrameLocks xmlns:a="http://schemas.openxmlformats.org/drawingml/2006/main" noChangeAspect="1"/>
+            </wp:cNvGraphicFramePr>
+            <a:graphic xmlns:a="http://schemas.openxmlformats.org/drawingml/2006/main">
+              <a:graphicData uri="http://schemas.openxmlformats.org/drawingml/2006/picture">
+                <pic:pic xmlns:pic="http://schemas.openxmlformats.org/drawingml/2006/picture">
+                  <pic:nvPicPr>
+                    <pic:cNvPr id="1" name=""/>
+                    <pic:cNvPicPr/>
+                  </pic:nvPicPr>
+                  <pic:blipFill>
+                    <a:blip r:embed="rId8"/>
+                    <a:stretch>
+                      <a:fillRect/>
+                    </a:stretch>
+                  </pic:blipFill>
+                  <pic:spPr>
+                    <a:xfrm>
+                      <a:off x="0" y="0"/>
+                      <a:ext cx="5943600" cy="3213735"/>
+                    </a:xfrm>
+                    <a:prstGeom prst="rect">
+                      <a:avLst/>
+                    </a:prstGeom>
+                  </pic:spPr>
+                </pic:pic>
+              </a:graphicData>
+            </a:graphic>
+          </wp:inline>
+        </w:drawing>
       </w:r>
     </w:p>
     <w:p>
       <w:pPr>
         <w:spacing w:after="0" w:line="240" w:lineRule="auto"/>
         <w:jc w:val="center"/>
-        <w:rPr>
-          <w:rFonts w:ascii="Times New Roman" w:hAnsi="Times New Roman"/>
-          <w:sz w:val="20"/>
-          <w:szCs w:val="20"/>
-          <w:lang w:val="pt-BR"/>
-        </w:rPr>
-      </w:pPr>
-      <w:r>
         <w:rPr>
           <w:rFonts w:ascii="Times New Roman" w:hAnsi="Times New Roman"/>
           <w:i/>
@@ -2405,21 +4036,12 @@
           <w:szCs w:val="20"/>
           <w:lang w:val="pt-BR"/>
         </w:rPr>
-        <w:t>[Inserir Figura 4 aqui: Previsão SES versus valores reais no período de teste (2020–2024) — arquivo 14_previsao_melhor_modelo.png]</w:t>
-      </w:r>
+      </w:pPr>
     </w:p>
     <w:p>
       <w:pPr>
         <w:spacing w:after="0" w:line="240" w:lineRule="auto"/>
         <w:jc w:val="center"/>
-        <w:rPr>
-          <w:rFonts w:ascii="Times New Roman" w:hAnsi="Times New Roman"/>
-          <w:sz w:val="20"/>
-          <w:szCs w:val="20"/>
-          <w:lang w:val="pt-BR"/>
-        </w:rPr>
-      </w:pPr>
-      <w:r>
         <w:rPr>
           <w:rFonts w:ascii="Times New Roman" w:hAnsi="Times New Roman"/>
           <w:i/>
@@ -2428,7 +4050,124 @@
           <w:szCs w:val="20"/>
           <w:lang w:val="pt-BR"/>
         </w:rPr>
-        <w:t>[Inserir Figura 5 aqui: Comparativo de todos os modelos versus valores reais (2020–2024) — arquivo 15_comparativo_modelos.png]</w:t>
+      </w:pPr>
+    </w:p>
+    <w:p>
+      <w:pPr>
+        <w:pStyle w:val="Legenda"/>
+        <w:keepNext/>
+        <w:jc w:val="center"/>
+        <w:rPr>
+          <w:color w:val="auto"/>
+          <w:lang w:val="pt-BR"/>
+        </w:rPr>
+      </w:pPr>
+      <w:r>
+        <w:rPr>
+          <w:color w:val="auto"/>
+          <w:lang w:val="pt-BR"/>
+        </w:rPr>
+        <w:lastRenderedPageBreak/>
+        <w:t xml:space="preserve">Figura </w:t>
+      </w:r>
+      <w:r>
+        <w:rPr>
+          <w:color w:val="auto"/>
+        </w:rPr>
+        <w:fldChar w:fldCharType="begin"/>
+      </w:r>
+      <w:r>
+        <w:rPr>
+          <w:color w:val="auto"/>
+          <w:lang w:val="pt-BR"/>
+        </w:rPr>
+        <w:instrText xml:space="preserve"> SEQ Figura \* ARABIC </w:instrText>
+      </w:r>
+      <w:r>
+        <w:rPr>
+          <w:color w:val="auto"/>
+        </w:rPr>
+        <w:fldChar w:fldCharType="separate"/>
+      </w:r>
+      <w:r>
+        <w:rPr>
+          <w:noProof/>
+          <w:color w:val="auto"/>
+          <w:lang w:val="pt-BR"/>
+        </w:rPr>
+        <w:t>5</w:t>
+      </w:r>
+      <w:r>
+        <w:rPr>
+          <w:color w:val="auto"/>
+        </w:rPr>
+        <w:fldChar w:fldCharType="end"/>
+      </w:r>
+      <w:r>
+        <w:rPr>
+          <w:color w:val="auto"/>
+          <w:lang w:val="pt-BR"/>
+        </w:rPr>
+        <w:t>: Comparativo de todos os modelos versus valores reais (2020-2024)</w:t>
+      </w:r>
+    </w:p>
+    <w:p>
+      <w:pPr>
+        <w:spacing w:after="0" w:line="240" w:lineRule="auto"/>
+        <w:jc w:val="center"/>
+        <w:rPr>
+          <w:rFonts w:ascii="Times New Roman" w:hAnsi="Times New Roman"/>
+          <w:i/>
+          <w:iCs/>
+          <w:sz w:val="20"/>
+          <w:szCs w:val="20"/>
+          <w:lang w:val="pt-BR"/>
+        </w:rPr>
+      </w:pPr>
+      <w:r>
+        <w:rPr>
+          <w:rFonts w:ascii="Times New Roman" w:hAnsi="Times New Roman"/>
+          <w:i/>
+          <w:iCs/>
+          <w:sz w:val="20"/>
+          <w:szCs w:val="20"/>
+          <w:lang w:val="pt-BR"/>
+        </w:rPr>
+        <w:drawing>
+          <wp:inline distT="0" distB="0" distL="0" distR="0" wp14:anchorId="01CEE762" wp14:editId="3ECD8653">
+            <wp:extent cx="5943600" cy="2994660"/>
+            <wp:effectExtent l="0" t="0" r="0" b="0"/>
+            <wp:docPr id="6" name="Imagem 6"/>
+            <wp:cNvGraphicFramePr>
+              <a:graphicFrameLocks xmlns:a="http://schemas.openxmlformats.org/drawingml/2006/main" noChangeAspect="1"/>
+            </wp:cNvGraphicFramePr>
+            <a:graphic xmlns:a="http://schemas.openxmlformats.org/drawingml/2006/main">
+              <a:graphicData uri="http://schemas.openxmlformats.org/drawingml/2006/picture">
+                <pic:pic xmlns:pic="http://schemas.openxmlformats.org/drawingml/2006/picture">
+                  <pic:nvPicPr>
+                    <pic:cNvPr id="1" name=""/>
+                    <pic:cNvPicPr/>
+                  </pic:nvPicPr>
+                  <pic:blipFill>
+                    <a:blip r:embed="rId9"/>
+                    <a:stretch>
+                      <a:fillRect/>
+                    </a:stretch>
+                  </pic:blipFill>
+                  <pic:spPr>
+                    <a:xfrm>
+                      <a:off x="0" y="0"/>
+                      <a:ext cx="5943600" cy="2994660"/>
+                    </a:xfrm>
+                    <a:prstGeom prst="rect">
+                      <a:avLst/>
+                    </a:prstGeom>
+                  </pic:spPr>
+                </pic:pic>
+              </a:graphicData>
+            </a:graphic>
+          </wp:inline>
+        </w:drawing>
       </w:r>
     </w:p>
     <w:p>
@@ -2436,28 +4175,49 @@
         <w:spacing w:after="0" w:line="360" w:lineRule="auto"/>
         <w:rPr>
           <w:rFonts w:ascii="Times New Roman" w:hAnsi="Times New Roman"/>
-          <w:lang w:val="pt-BR"/>
-        </w:rPr>
-      </w:pPr>
-      <w:r>
-        <w:rPr>
-          <w:rFonts w:ascii="Times New Roman" w:hAnsi="Times New Roman"/>
-          <w:lang w:val="pt-BR"/>
-        </w:rPr>
-        <w:t xml:space="preserve">A ruptura estrutural observada em 2023 e 2024 é o principal fator explicativo da discrepância entre AIC e RMSE. Os picos históricos registrados extrapolam o regime aprendido pelos modelos na fase de treino. Nesse cenário, o SES mostrou-se mais eficaz por sua simplicidade </w:t>
-      </w:r>
-      <w:r>
-        <w:rPr>
-          <w:rFonts w:ascii="Times New Roman" w:hAnsi="Times New Roman"/>
-          <w:lang w:val="pt-BR"/>
-        </w:rPr>
-        <w:lastRenderedPageBreak/>
-        <w:t>estrutural, enquanto o ARIMA, embora superior em ajuste na amostra, apresentou menor capacidade de generalização fora da amostra.</w:t>
-      </w:r>
-    </w:p>
-    <w:p>
-      <w:pPr>
-        <w:pStyle w:val="Heading1"/>
+          <w:i/>
+          <w:iCs/>
+          <w:sz w:val="20"/>
+          <w:szCs w:val="20"/>
+          <w:lang w:val="pt-BR"/>
+        </w:rPr>
+      </w:pPr>
+    </w:p>
+    <w:p>
+      <w:pPr>
+        <w:spacing w:after="0" w:line="360" w:lineRule="auto"/>
+        <w:jc w:val="both"/>
+        <w:rPr>
+          <w:rFonts w:ascii="Times New Roman" w:hAnsi="Times New Roman"/>
+          <w:u w:val="single"/>
+          <w:lang w:val="pt-BR"/>
+        </w:rPr>
+      </w:pPr>
+      <w:r>
+        <w:rPr>
+          <w:rFonts w:ascii="Times New Roman" w:hAnsi="Times New Roman"/>
+          <w:lang w:val="pt-BR"/>
+        </w:rPr>
+        <w:t xml:space="preserve">A ruptura estrutural observada em 2023 e 2024 é o principal fator explicativo da discrepância entre AIC e RMSE. Os picos históricos registrados extrapolam o regime aprendido pelos modelos na fase de treino. Nesse cenário, o SES mostrou-se mais eficaz por sua simplicidade estrutural, enquanto o ARIMA, embora superior em ajuste na amostra, apresentou menor capacidade de generalização fora da </w:t>
+      </w:r>
+      <w:r>
+        <w:rPr>
+          <w:rFonts w:ascii="Times New Roman" w:hAnsi="Times New Roman"/>
+          <w:lang w:val="pt-BR"/>
+        </w:rPr>
+        <w:t>amostra</w:t>
+      </w:r>
+      <w:r>
+        <w:rPr>
+          <w:rFonts w:ascii="Times New Roman" w:hAnsi="Times New Roman"/>
+          <w:lang w:val="pt-BR"/>
+        </w:rPr>
+        <w:t>.</w:t>
+      </w:r>
+    </w:p>
+    <w:p>
+      <w:pPr>
+        <w:pStyle w:val="Ttulo1"/>
         <w:rPr>
           <w:rFonts w:ascii="Times New Roman" w:hAnsi="Times New Roman"/>
           <w:color w:val="000000"/>
@@ -2482,38 +4242,134 @@
     <w:p>
       <w:pPr>
         <w:spacing w:after="0" w:line="360" w:lineRule="auto"/>
-        <w:rPr>
-          <w:rFonts w:ascii="Times New Roman" w:hAnsi="Times New Roman"/>
-          <w:lang w:val="pt-BR"/>
-        </w:rPr>
-      </w:pPr>
-      <w:r>
-        <w:rPr>
-          <w:rFonts w:ascii="Times New Roman" w:hAnsi="Times New Roman"/>
-          <w:lang w:val="pt-BR"/>
-        </w:rPr>
-        <w:t>Este trabalho comparou cinco modelos de séries temporais para a previsão da superfície de água mensal em Belo Horizonte (MG) no período de 2020 a 2024, utilizando dados do Projeto MapBiomas Água, Coleção 4. A questão central — se o melhor modelo em AIC também seria o melhor em RMSE — foi respondida negativamente: o ARIMA(3,0,2)(0,1,1)[12] com constante, selecionado pelo AIC como melhor ajuste à base de treino, apresentou o maior RMSE na base de teste, enquanto o modelo SES, mais simples, obteve o menor RMSE.</w:t>
+        <w:jc w:val="both"/>
+        <w:rPr>
+          <w:rFonts w:ascii="Times New Roman" w:hAnsi="Times New Roman"/>
+          <w:lang w:val="pt-BR"/>
+        </w:rPr>
+      </w:pPr>
+      <w:r>
+        <w:rPr>
+          <w:rFonts w:ascii="Times New Roman" w:hAnsi="Times New Roman"/>
+          <w:lang w:val="pt-BR"/>
+        </w:rPr>
+        <w:t>Este trabalho comparou cinco modelos de séries temporais para a previsão da superfície de água mensal em Belo Horizonte (MG) no período de 2020 a 2024, utilizando dados do Projeto MapBiomas Água, Coleção 4. A questão central</w:t>
+      </w:r>
+      <w:r>
+        <w:rPr>
+          <w:rFonts w:ascii="Times New Roman" w:hAnsi="Times New Roman"/>
+          <w:lang w:val="pt-BR"/>
+        </w:rPr>
+        <w:t xml:space="preserve">, </w:t>
+      </w:r>
+      <w:r>
+        <w:rPr>
+          <w:rFonts w:ascii="Times New Roman" w:hAnsi="Times New Roman"/>
+          <w:lang w:val="pt-BR"/>
+        </w:rPr>
+        <w:t>se o melhor modelo em AIC também seria o melhor em RMSE</w:t>
+      </w:r>
+      <w:r>
+        <w:rPr>
+          <w:rFonts w:ascii="Times New Roman" w:hAnsi="Times New Roman"/>
+          <w:lang w:val="pt-BR"/>
+        </w:rPr>
+        <w:t>,</w:t>
+      </w:r>
+      <w:r>
+        <w:rPr>
+          <w:rFonts w:ascii="Times New Roman" w:hAnsi="Times New Roman"/>
+          <w:lang w:val="pt-BR"/>
+        </w:rPr>
+        <w:t xml:space="preserve"> foi respondida negativamente: o ARIMA(3,0,2)(0,1,1)[12] com constante, selecionado pelo AIC como melhor ajuste à base de treino</w:t>
+      </w:r>
+      <w:r>
+        <w:rPr>
+          <w:rFonts w:ascii="Times New Roman" w:hAnsi="Times New Roman"/>
+          <w:lang w:val="pt-BR"/>
+        </w:rPr>
+        <w:t xml:space="preserve"> (AIC = 3094,43)</w:t>
+      </w:r>
+      <w:r>
+        <w:rPr>
+          <w:rFonts w:ascii="Times New Roman" w:hAnsi="Times New Roman"/>
+          <w:lang w:val="pt-BR"/>
+        </w:rPr>
+        <w:t>, apresentou o maior RMSE na base de teste</w:t>
+      </w:r>
+      <w:r>
+        <w:rPr>
+          <w:rFonts w:ascii="Times New Roman" w:hAnsi="Times New Roman"/>
+          <w:lang w:val="pt-BR"/>
+        </w:rPr>
+        <w:t xml:space="preserve"> (61,72 ha)</w:t>
+      </w:r>
+      <w:r>
+        <w:rPr>
+          <w:rFonts w:ascii="Times New Roman" w:hAnsi="Times New Roman"/>
+          <w:lang w:val="pt-BR"/>
+        </w:rPr>
+        <w:t>, enquanto o modelo SES, mais simples, obteve o menor RMSE</w:t>
+      </w:r>
+      <w:r>
+        <w:rPr>
+          <w:rFonts w:ascii="Times New Roman" w:hAnsi="Times New Roman"/>
+          <w:lang w:val="pt-BR"/>
+        </w:rPr>
+        <w:t xml:space="preserve"> (51,37 </w:t>
+      </w:r>
+      <w:proofErr w:type="spellStart"/>
+      <w:r>
+        <w:rPr>
+          <w:rFonts w:ascii="Times New Roman" w:hAnsi="Times New Roman"/>
+          <w:lang w:val="pt-BR"/>
+        </w:rPr>
+        <w:t>ha</w:t>
+      </w:r>
+      <w:proofErr w:type="spellEnd"/>
+      <w:r>
+        <w:rPr>
+          <w:rFonts w:ascii="Times New Roman" w:hAnsi="Times New Roman"/>
+          <w:lang w:val="pt-BR"/>
+        </w:rPr>
+        <w:t>)</w:t>
+      </w:r>
+      <w:r>
+        <w:rPr>
+          <w:rFonts w:ascii="Times New Roman" w:hAnsi="Times New Roman"/>
+          <w:lang w:val="pt-BR"/>
+        </w:rPr>
+        <w:t>.</w:t>
       </w:r>
     </w:p>
     <w:p>
       <w:pPr>
         <w:spacing w:after="0" w:line="360" w:lineRule="auto"/>
-        <w:rPr>
-          <w:rFonts w:ascii="Times New Roman" w:hAnsi="Times New Roman"/>
-          <w:lang w:val="pt-BR"/>
-        </w:rPr>
-      </w:pPr>
-      <w:r>
-        <w:rPr>
-          <w:rFonts w:ascii="Times New Roman" w:hAnsi="Times New Roman"/>
-          <w:lang w:val="pt-BR"/>
-        </w:rPr>
-        <w:t>Esse resultado reforça uma lição fundamental da análise preditiva: a qualidade do ajuste dentro da amostra não garante acurácia fora da amostra, especialmente em presença de quebras estruturais. Para trabalhos futuros, recomenda-se investigar as causas hidrometeorológicas dos picos observados em 2023 e 2024, aplicar modelos com detecção automática de quebras estruturais e incorporar variáveis exógenas, como precipitação e temperatura, em modelos mais robustos.</w:t>
-      </w:r>
-    </w:p>
-    <w:p>
-      <w:pPr>
-        <w:pStyle w:val="Heading1"/>
+        <w:jc w:val="both"/>
+        <w:rPr>
+          <w:rFonts w:ascii="Times New Roman" w:hAnsi="Times New Roman"/>
+          <w:lang w:val="pt-BR"/>
+        </w:rPr>
+      </w:pPr>
+      <w:r>
+        <w:rPr>
+          <w:rFonts w:ascii="Times New Roman" w:hAnsi="Times New Roman"/>
+          <w:lang w:val="pt-BR"/>
+        </w:rPr>
+        <w:t xml:space="preserve">Esse resultado reforça uma lição fundamental da análise preditiva: a qualidade do ajuste dentro da amostra não garante acurácia fora da amostra, especialmente em presença de quebras estruturais. Para trabalhos futuros, recomenda-se investigar as causas hidrometeorológicas dos picos </w:t>
+      </w:r>
+      <w:r>
+        <w:rPr>
+          <w:rFonts w:ascii="Times New Roman" w:hAnsi="Times New Roman"/>
+          <w:lang w:val="pt-BR"/>
+        </w:rPr>
+        <w:lastRenderedPageBreak/>
+        <w:t>observados em 2023 e 2024, aplicar modelos com detecção automática de quebras estruturais e incorporar variáveis como precipitação e temperatura, em modelos mais robustos.</w:t>
+      </w:r>
+    </w:p>
+    <w:p>
+      <w:pPr>
+        <w:pStyle w:val="Ttulo1"/>
         <w:rPr>
           <w:rFonts w:ascii="Times New Roman" w:hAnsi="Times New Roman"/>
           <w:color w:val="000000"/>
@@ -2538,6 +4394,7 @@
     <w:p>
       <w:pPr>
         <w:spacing w:after="0" w:line="240" w:lineRule="auto"/>
+        <w:jc w:val="both"/>
         <w:rPr>
           <w:rFonts w:ascii="Times New Roman" w:hAnsi="Times New Roman"/>
         </w:rPr>
@@ -2566,172 +4423,198 @@
     <w:p>
       <w:pPr>
         <w:spacing w:after="0" w:line="240" w:lineRule="auto"/>
-        <w:rPr>
-          <w:rFonts w:ascii="Times New Roman" w:hAnsi="Times New Roman"/>
-          <w:lang w:val="pt-BR"/>
-        </w:rPr>
-      </w:pPr>
-      <w:r>
-        <w:rPr>
-          <w:rFonts w:ascii="Times New Roman" w:hAnsi="Times New Roman"/>
-        </w:rPr>
-        <w:t xml:space="preserve">BORGES, P. A. et al. </w:t>
-      </w:r>
-      <w:r>
-        <w:rPr>
-          <w:rFonts w:ascii="Times New Roman" w:hAnsi="Times New Roman"/>
-          <w:lang w:val="pt-BR"/>
-        </w:rPr>
-        <w:t xml:space="preserve">Comparação entre modelos ARIMA e ETS para previsão de precipitação mensal em bacias hidrográficas brasileiras. </w:t>
+        <w:jc w:val="both"/>
+        <w:rPr>
+          <w:rFonts w:ascii="Times New Roman" w:hAnsi="Times New Roman"/>
+        </w:rPr>
+      </w:pPr>
+    </w:p>
+    <w:p>
+      <w:pPr>
+        <w:spacing w:after="0" w:line="240" w:lineRule="auto"/>
+        <w:jc w:val="both"/>
+        <w:rPr>
+          <w:rFonts w:ascii="Times New Roman" w:hAnsi="Times New Roman"/>
+        </w:rPr>
+      </w:pPr>
+      <w:r>
+        <w:rPr>
+          <w:rFonts w:ascii="Times New Roman" w:hAnsi="Times New Roman"/>
+        </w:rPr>
+        <w:t xml:space="preserve">BOX, G. E. P.; JENKINS, G. M.; REINSEL, G. C. </w:t>
       </w:r>
       <w:r>
         <w:rPr>
           <w:rFonts w:ascii="Times New Roman" w:hAnsi="Times New Roman"/>
           <w:i/>
           <w:iCs/>
-          <w:lang w:val="pt-BR"/>
-        </w:rPr>
-        <w:t>Revista Brasileira de Meteorologia</w:t>
-      </w:r>
-      <w:r>
-        <w:rPr>
-          <w:rFonts w:ascii="Times New Roman" w:hAnsi="Times New Roman"/>
-          <w:lang w:val="pt-BR"/>
-        </w:rPr>
-        <w:t>, v. 40, n. 1, p. 45-58, 2025.</w:t>
+        </w:rPr>
+        <w:t>Time series analysis: forecasting and control</w:t>
+      </w:r>
+      <w:r>
+        <w:rPr>
+          <w:rFonts w:ascii="Times New Roman" w:hAnsi="Times New Roman"/>
+        </w:rPr>
+        <w:t xml:space="preserve">. </w:t>
+      </w:r>
+      <w:r>
+        <w:rPr>
+          <w:rFonts w:ascii="Times New Roman" w:hAnsi="Times New Roman"/>
+        </w:rPr>
+        <w:t>3. ed. Englewood Cliffs: Prentice Hall, 1994.</w:t>
       </w:r>
     </w:p>
     <w:p>
       <w:pPr>
         <w:spacing w:after="0" w:line="240" w:lineRule="auto"/>
-        <w:rPr>
-          <w:rFonts w:ascii="Times New Roman" w:hAnsi="Times New Roman"/>
-        </w:rPr>
-      </w:pPr>
-      <w:r>
-        <w:rPr>
-          <w:rFonts w:ascii="Times New Roman" w:hAnsi="Times New Roman"/>
-        </w:rPr>
-        <w:t xml:space="preserve">BOX, G. E. P.; JENKINS, G. M.; REINSEL, G. C. </w:t>
-      </w:r>
+        <w:jc w:val="both"/>
+        <w:rPr>
+          <w:rFonts w:ascii="Times New Roman" w:hAnsi="Times New Roman"/>
+        </w:rPr>
+      </w:pPr>
+    </w:p>
+    <w:p>
+      <w:pPr>
+        <w:spacing w:after="0" w:line="240" w:lineRule="auto"/>
+        <w:jc w:val="both"/>
+        <w:rPr>
+          <w:rFonts w:ascii="Times New Roman" w:hAnsi="Times New Roman"/>
+        </w:rPr>
+      </w:pPr>
+      <w:r>
+        <w:rPr>
+          <w:rFonts w:ascii="Times New Roman" w:hAnsi="Times New Roman"/>
+          <w:lang w:val="pt-BR"/>
+        </w:rPr>
+        <w:t>CAMINHA</w:t>
+      </w:r>
+      <w:r>
+        <w:rPr>
+          <w:rFonts w:ascii="Times New Roman" w:hAnsi="Times New Roman"/>
+          <w:lang w:val="pt-BR"/>
+        </w:rPr>
+        <w:t xml:space="preserve">, A. R., Guimarães, L. R., Corrêa, F. V., Souza, G. R. de, Oliveira, L. F. C. de, &amp; </w:t>
+      </w:r>
+      <w:proofErr w:type="spellStart"/>
+      <w:r>
+        <w:rPr>
+          <w:rFonts w:ascii="Times New Roman" w:hAnsi="Times New Roman"/>
+          <w:lang w:val="pt-BR"/>
+        </w:rPr>
+        <w:t>Sáfadi</w:t>
+      </w:r>
+      <w:proofErr w:type="spellEnd"/>
+      <w:r>
+        <w:rPr>
+          <w:rFonts w:ascii="Times New Roman" w:hAnsi="Times New Roman"/>
+          <w:lang w:val="pt-BR"/>
+        </w:rPr>
+        <w:t>, T. (2025). Previsão de precipitação e vazão a partir da modelagem de séries temporais. </w:t>
+      </w:r>
+      <w:proofErr w:type="spellStart"/>
       <w:r>
         <w:rPr>
           <w:rFonts w:ascii="Times New Roman" w:hAnsi="Times New Roman"/>
           <w:i/>
           <w:iCs/>
         </w:rPr>
-        <w:t>Time series analysis: forecasting and control</w:t>
-      </w:r>
-      <w:r>
-        <w:rPr>
-          <w:rFonts w:ascii="Times New Roman" w:hAnsi="Times New Roman"/>
-        </w:rPr>
-        <w:t>. 3. ed. Englewood Cliffs: Prentice Hall, 1994.</w:t>
-      </w:r>
-    </w:p>
-    <w:p>
-      <w:pPr>
-        <w:spacing w:after="0" w:line="240" w:lineRule="auto"/>
-        <w:rPr>
-          <w:rFonts w:ascii="Times New Roman" w:hAnsi="Times New Roman"/>
-        </w:rPr>
-      </w:pPr>
-      <w:r>
-        <w:rPr>
-          <w:rFonts w:ascii="Times New Roman" w:hAnsi="Times New Roman"/>
-        </w:rPr>
-        <w:t xml:space="preserve">DICKEY, D. A.; FULLER, W. A. Distribution of the estimators for autoregressive time series with a unit root. </w:t>
-      </w:r>
+        <w:t>Revista</w:t>
+      </w:r>
+      <w:proofErr w:type="spellEnd"/>
       <w:r>
         <w:rPr>
           <w:rFonts w:ascii="Times New Roman" w:hAnsi="Times New Roman"/>
           <w:i/>
           <w:iCs/>
         </w:rPr>
-        <w:t>Journal of the American Statistical Association</w:t>
-      </w:r>
-      <w:r>
-        <w:rPr>
-          <w:rFonts w:ascii="Times New Roman" w:hAnsi="Times New Roman"/>
-        </w:rPr>
-        <w:t>, v. 74, n. 366, p. 427-431, 1979.</w:t>
-      </w:r>
-    </w:p>
-    <w:p>
-      <w:pPr>
-        <w:spacing w:after="0" w:line="240" w:lineRule="auto"/>
-        <w:rPr>
-          <w:rFonts w:ascii="Times New Roman" w:hAnsi="Times New Roman"/>
-        </w:rPr>
-      </w:pPr>
-      <w:r>
-        <w:rPr>
-          <w:rFonts w:ascii="Times New Roman" w:hAnsi="Times New Roman"/>
-        </w:rPr>
-        <w:t xml:space="preserve">GOULART, L. F. et al. </w:t>
-      </w:r>
-      <w:r>
-        <w:rPr>
-          <w:rFonts w:ascii="Times New Roman" w:hAnsi="Times New Roman"/>
-          <w:lang w:val="pt-BR"/>
-        </w:rPr>
-        <w:t xml:space="preserve">Séries temporais aplicadas à previsão de ocorrências criminais em municípios mineiros: uma abordagem comparativa. </w:t>
-      </w:r>
+        <w:t xml:space="preserve"> </w:t>
+      </w:r>
+      <w:proofErr w:type="spellStart"/>
       <w:r>
         <w:rPr>
           <w:rFonts w:ascii="Times New Roman" w:hAnsi="Times New Roman"/>
           <w:i/>
           <w:iCs/>
         </w:rPr>
-        <w:t xml:space="preserve">Revista de </w:t>
-      </w:r>
-      <w:proofErr w:type="spellStart"/>
+        <w:t>Brasileira</w:t>
+      </w:r>
+      <w:proofErr w:type="spellEnd"/>
       <w:r>
         <w:rPr>
           <w:rFonts w:ascii="Times New Roman" w:hAnsi="Times New Roman"/>
           <w:i/>
           <w:iCs/>
         </w:rPr>
-        <w:t>Estatística</w:t>
-      </w:r>
-      <w:proofErr w:type="spellEnd"/>
+        <w:t xml:space="preserve"> De </w:t>
+      </w:r>
+      <w:proofErr w:type="spellStart"/>
       <w:r>
         <w:rPr>
           <w:rFonts w:ascii="Times New Roman" w:hAnsi="Times New Roman"/>
           <w:i/>
           <w:iCs/>
         </w:rPr>
-        <w:t xml:space="preserve"> </w:t>
-      </w:r>
-      <w:proofErr w:type="spellStart"/>
+        <w:t>Climatologia</w:t>
+      </w:r>
+      <w:proofErr w:type="spellEnd"/>
+      <w:r>
+        <w:rPr>
+          <w:rFonts w:ascii="Times New Roman" w:hAnsi="Times New Roman"/>
+        </w:rPr>
+        <w:t>, </w:t>
+      </w:r>
       <w:r>
         <w:rPr>
           <w:rFonts w:ascii="Times New Roman" w:hAnsi="Times New Roman"/>
           <w:i/>
           <w:iCs/>
         </w:rPr>
-        <w:t>Aplicada</w:t>
-      </w:r>
-      <w:proofErr w:type="spellEnd"/>
-      <w:r>
-        <w:rPr>
-          <w:rFonts w:ascii="Times New Roman" w:hAnsi="Times New Roman"/>
-        </w:rPr>
-        <w:t>, v. 12, n. 3, p. 120-138, 2024.</w:t>
+        <w:t>36</w:t>
+      </w:r>
+      <w:r>
+        <w:rPr>
+          <w:rFonts w:ascii="Times New Roman" w:hAnsi="Times New Roman"/>
+        </w:rPr>
+        <w:t xml:space="preserve">(21), 264–290. </w:t>
+      </w:r>
+      <w:hyperlink r:id="rId10" w:history="1">
+        <w:r>
+          <w:rPr>
+            <w:rStyle w:val="Hyperlink"/>
+            <w:rFonts w:ascii="Times New Roman" w:hAnsi="Times New Roman"/>
+          </w:rPr>
+          <w:t>https://doi.org/10.55761/abclima.v36i21.18885</w:t>
+        </w:r>
+      </w:hyperlink>
+      <w:r>
+        <w:rPr>
+          <w:rFonts w:ascii="Times New Roman" w:hAnsi="Times New Roman"/>
+        </w:rPr>
+        <w:t>.</w:t>
       </w:r>
     </w:p>
     <w:p>
       <w:pPr>
         <w:spacing w:after="0" w:line="240" w:lineRule="auto"/>
-        <w:rPr>
-          <w:rFonts w:ascii="Times New Roman" w:hAnsi="Times New Roman"/>
-        </w:rPr>
-      </w:pPr>
-      <w:r>
-        <w:rPr>
-          <w:rFonts w:ascii="Times New Roman" w:hAnsi="Times New Roman"/>
-        </w:rPr>
-        <w:t xml:space="preserve">HOLT, C. C. Forecasting seasonals and trends by exponentially weighted moving averages. </w:t>
+        <w:jc w:val="both"/>
+        <w:rPr>
+          <w:rFonts w:ascii="Times New Roman" w:hAnsi="Times New Roman"/>
+        </w:rPr>
+      </w:pPr>
+    </w:p>
+    <w:p>
+      <w:pPr>
+        <w:spacing w:after="0" w:line="240" w:lineRule="auto"/>
+        <w:jc w:val="both"/>
+        <w:rPr>
+          <w:rFonts w:ascii="Times New Roman" w:hAnsi="Times New Roman"/>
+        </w:rPr>
+      </w:pPr>
+      <w:r>
+        <w:rPr>
+          <w:rFonts w:ascii="Times New Roman" w:hAnsi="Times New Roman"/>
+        </w:rPr>
+        <w:t xml:space="preserve">DICKEY, D. A.; FULLER, W. A. Distribution of the estimators for autoregressive time series with a unit root. </w:t>
       </w:r>
       <w:r>
         <w:rPr>
@@ -2739,27 +4622,37 @@
           <w:i/>
           <w:iCs/>
         </w:rPr>
-        <w:t>ONR Memorandum</w:t>
-      </w:r>
-      <w:r>
-        <w:rPr>
-          <w:rFonts w:ascii="Times New Roman" w:hAnsi="Times New Roman"/>
-        </w:rPr>
-        <w:t>, n. 52. Pittsburgh: Carnegie Institute of Technology, 1957.</w:t>
+        <w:t>Journal of the American Statistical Association</w:t>
+      </w:r>
+      <w:r>
+        <w:rPr>
+          <w:rFonts w:ascii="Times New Roman" w:hAnsi="Times New Roman"/>
+        </w:rPr>
+        <w:t>, v. 74, n. 366, p. 427-431, 1979.</w:t>
       </w:r>
     </w:p>
     <w:p>
       <w:pPr>
         <w:spacing w:after="0" w:line="240" w:lineRule="auto"/>
-        <w:rPr>
-          <w:rFonts w:ascii="Times New Roman" w:hAnsi="Times New Roman"/>
-        </w:rPr>
-      </w:pPr>
-      <w:r>
-        <w:rPr>
-          <w:rFonts w:ascii="Times New Roman" w:hAnsi="Times New Roman"/>
-        </w:rPr>
-        <w:t xml:space="preserve">HYNDMAN, R. J.; KHANDAKAR, Y. Automatic time series forecasting: the forecast package for R. </w:t>
+        <w:jc w:val="both"/>
+        <w:rPr>
+          <w:rFonts w:ascii="Times New Roman" w:hAnsi="Times New Roman"/>
+        </w:rPr>
+      </w:pPr>
+    </w:p>
+    <w:p>
+      <w:pPr>
+        <w:spacing w:after="0" w:line="240" w:lineRule="auto"/>
+        <w:jc w:val="both"/>
+        <w:rPr>
+          <w:rFonts w:ascii="Times New Roman" w:hAnsi="Times New Roman"/>
+        </w:rPr>
+      </w:pPr>
+      <w:r>
+        <w:rPr>
+          <w:rFonts w:ascii="Times New Roman" w:hAnsi="Times New Roman"/>
+        </w:rPr>
+        <w:t xml:space="preserve">HOLT, C. C. Forecasting seasonals and trends by exponentially weighted moving averages. </w:t>
       </w:r>
       <w:r>
         <w:rPr>
@@ -2767,49 +4660,191 @@
           <w:i/>
           <w:iCs/>
         </w:rPr>
-        <w:t>Journal of Statistical Software</w:t>
-      </w:r>
-      <w:r>
-        <w:rPr>
-          <w:rFonts w:ascii="Times New Roman" w:hAnsi="Times New Roman"/>
-        </w:rPr>
-        <w:t>, v. 27, n. 3, p. 1-22, 2008. DOI: 10.18637/</w:t>
-      </w:r>
-      <w:proofErr w:type="gramStart"/>
-      <w:r>
-        <w:rPr>
-          <w:rFonts w:ascii="Times New Roman" w:hAnsi="Times New Roman"/>
-        </w:rPr>
-        <w:t>jss.v027.i</w:t>
-      </w:r>
-      <w:proofErr w:type="gramEnd"/>
-      <w:r>
-        <w:rPr>
-          <w:rFonts w:ascii="Times New Roman" w:hAnsi="Times New Roman"/>
-        </w:rPr>
-        <w:t>03.</w:t>
+        <w:t>ONR Memorandum</w:t>
+      </w:r>
+      <w:r>
+        <w:rPr>
+          <w:rFonts w:ascii="Times New Roman" w:hAnsi="Times New Roman"/>
+        </w:rPr>
+        <w:t>, n. 52. Pittsburgh: Carnegie Institute of Technology, 1957.</w:t>
       </w:r>
     </w:p>
     <w:p>
       <w:pPr>
         <w:spacing w:after="0" w:line="240" w:lineRule="auto"/>
-        <w:rPr>
-          <w:rFonts w:ascii="Times New Roman" w:hAnsi="Times New Roman"/>
-          <w:lang w:val="pt-BR"/>
-        </w:rPr>
-      </w:pPr>
-      <w:r>
-        <w:rPr>
-          <w:rFonts w:ascii="Times New Roman" w:hAnsi="Times New Roman"/>
-          <w:lang w:val="pt-BR"/>
-        </w:rPr>
-        <w:t xml:space="preserve">MAPBIOMAS. </w:t>
+        <w:jc w:val="both"/>
+        <w:rPr>
+          <w:rFonts w:ascii="Times New Roman" w:hAnsi="Times New Roman"/>
+        </w:rPr>
+      </w:pPr>
+    </w:p>
+    <w:p>
+      <w:pPr>
+        <w:spacing w:after="0" w:line="240" w:lineRule="auto"/>
+        <w:jc w:val="both"/>
+        <w:rPr>
+          <w:rFonts w:ascii="Times New Roman" w:hAnsi="Times New Roman"/>
+          <w:lang w:val="pt-BR"/>
+        </w:rPr>
+      </w:pPr>
+      <w:r>
+        <w:rPr>
+          <w:rFonts w:ascii="Times New Roman" w:hAnsi="Times New Roman"/>
+        </w:rPr>
+        <w:t xml:space="preserve">HYNDMAN, R. J.; KHANDAKAR, Y. Automatic time series forecasting: the forecast package for R. </w:t>
       </w:r>
       <w:r>
         <w:rPr>
           <w:rFonts w:ascii="Times New Roman" w:hAnsi="Times New Roman"/>
           <w:i/>
           <w:iCs/>
+        </w:rPr>
+        <w:t>Journal of Statistical Software</w:t>
+      </w:r>
+      <w:r>
+        <w:rPr>
+          <w:rFonts w:ascii="Times New Roman" w:hAnsi="Times New Roman"/>
+        </w:rPr>
+        <w:t xml:space="preserve">, v. 27, n. 3, p. 1-22, 2008. </w:t>
+      </w:r>
+      <w:r>
+        <w:rPr>
+          <w:rFonts w:ascii="Times New Roman" w:hAnsi="Times New Roman"/>
+          <w:lang w:val="pt-BR"/>
+        </w:rPr>
+        <w:t>DOI: 10.18637/</w:t>
+      </w:r>
+      <w:proofErr w:type="gramStart"/>
+      <w:r>
+        <w:rPr>
+          <w:rFonts w:ascii="Times New Roman" w:hAnsi="Times New Roman"/>
+          <w:lang w:val="pt-BR"/>
+        </w:rPr>
+        <w:t>jss.v027.i</w:t>
+      </w:r>
+      <w:proofErr w:type="gramEnd"/>
+      <w:r>
+        <w:rPr>
+          <w:rFonts w:ascii="Times New Roman" w:hAnsi="Times New Roman"/>
+          <w:lang w:val="pt-BR"/>
+        </w:rPr>
+        <w:t>03.</w:t>
+      </w:r>
+    </w:p>
+    <w:p>
+      <w:pPr>
+        <w:spacing w:after="0" w:line="240" w:lineRule="auto"/>
+        <w:jc w:val="both"/>
+        <w:rPr>
+          <w:rFonts w:ascii="Times New Roman" w:hAnsi="Times New Roman"/>
+          <w:lang w:val="pt-BR"/>
+        </w:rPr>
+      </w:pPr>
+    </w:p>
+    <w:p>
+      <w:pPr>
+        <w:spacing w:after="0" w:line="240" w:lineRule="auto"/>
+        <w:jc w:val="both"/>
+        <w:rPr>
+          <w:rFonts w:ascii="Times New Roman" w:hAnsi="Times New Roman"/>
+          <w:lang w:val="pt-BR"/>
+        </w:rPr>
+      </w:pPr>
+      <w:r>
+        <w:rPr>
+          <w:rFonts w:ascii="Times New Roman" w:hAnsi="Times New Roman"/>
+        </w:rPr>
+        <w:t xml:space="preserve">HYNDMAN, R. J.; ATHANASOPOULOS, G. Forecasting: Principles and Practice. </w:t>
+      </w:r>
+      <w:r>
+        <w:rPr>
+          <w:rFonts w:ascii="Times New Roman" w:hAnsi="Times New Roman"/>
+          <w:lang w:val="pt-BR"/>
+        </w:rPr>
+        <w:t>3. ed.</w:t>
+      </w:r>
+    </w:p>
+    <w:p>
+      <w:pPr>
+        <w:spacing w:after="0" w:line="240" w:lineRule="auto"/>
+        <w:jc w:val="both"/>
+        <w:rPr>
+          <w:rFonts w:ascii="Times New Roman" w:hAnsi="Times New Roman"/>
+          <w:lang w:val="pt-BR"/>
+        </w:rPr>
+      </w:pPr>
+      <w:r>
+        <w:rPr>
+          <w:rFonts w:ascii="Times New Roman" w:hAnsi="Times New Roman"/>
+          <w:lang w:val="pt-BR"/>
+        </w:rPr>
+        <w:t xml:space="preserve">Melbourne: </w:t>
+      </w:r>
+      <w:proofErr w:type="spellStart"/>
+      <w:r>
+        <w:rPr>
+          <w:rFonts w:ascii="Times New Roman" w:hAnsi="Times New Roman"/>
+          <w:lang w:val="pt-BR"/>
+        </w:rPr>
+        <w:t>OTexts</w:t>
+      </w:r>
+      <w:proofErr w:type="spellEnd"/>
+      <w:r>
+        <w:rPr>
+          <w:rFonts w:ascii="Times New Roman" w:hAnsi="Times New Roman"/>
+          <w:lang w:val="pt-BR"/>
+        </w:rPr>
+        <w:t>, 2021. Disponível em: https://otexts.com/fpp3. Acesso em:</w:t>
+      </w:r>
+    </w:p>
+    <w:p>
+      <w:pPr>
+        <w:spacing w:after="0" w:line="240" w:lineRule="auto"/>
+        <w:jc w:val="both"/>
+        <w:rPr>
+          <w:rFonts w:ascii="Times New Roman" w:hAnsi="Times New Roman"/>
+          <w:lang w:val="pt-BR"/>
+        </w:rPr>
+      </w:pPr>
+      <w:r>
+        <w:rPr>
+          <w:rFonts w:ascii="Times New Roman" w:hAnsi="Times New Roman"/>
+          <w:lang w:val="pt-BR"/>
+        </w:rPr>
+        <w:t>28 maio 2026.</w:t>
+      </w:r>
+    </w:p>
+    <w:p>
+      <w:pPr>
+        <w:spacing w:after="0" w:line="240" w:lineRule="auto"/>
+        <w:jc w:val="both"/>
+        <w:rPr>
+          <w:rFonts w:ascii="Times New Roman" w:hAnsi="Times New Roman"/>
+          <w:lang w:val="pt-BR"/>
+        </w:rPr>
+      </w:pPr>
+    </w:p>
+    <w:p>
+      <w:pPr>
+        <w:spacing w:after="0" w:line="240" w:lineRule="auto"/>
+        <w:jc w:val="both"/>
+        <w:rPr>
+          <w:rFonts w:ascii="Times New Roman" w:hAnsi="Times New Roman"/>
+          <w:lang w:val="pt-BR"/>
+        </w:rPr>
+      </w:pPr>
+      <w:r>
+        <w:rPr>
+          <w:rFonts w:ascii="Times New Roman" w:hAnsi="Times New Roman"/>
+          <w:lang w:val="pt-BR"/>
+        </w:rPr>
+        <w:t xml:space="preserve">MAPBIOMAS. </w:t>
+      </w:r>
+      <w:r>
+        <w:rPr>
+          <w:rFonts w:ascii="Times New Roman" w:hAnsi="Times New Roman"/>
+          <w:i/>
+          <w:iCs/>
           <w:lang w:val="pt-BR"/>
         </w:rPr>
         <w:t>Projeto MapBiomas Água - Coleção 4: mapeamento anual da cobertura de superfície de água no Brasil</w:t>
@@ -2825,16 +4860,63 @@
     <w:p>
       <w:pPr>
         <w:spacing w:after="0" w:line="240" w:lineRule="auto"/>
-        <w:rPr>
-          <w:rFonts w:ascii="Times New Roman" w:hAnsi="Times New Roman"/>
-          <w:lang w:val="pt-BR"/>
-        </w:rPr>
-      </w:pPr>
-      <w:r>
-        <w:rPr>
-          <w:rFonts w:ascii="Times New Roman" w:hAnsi="Times New Roman"/>
-        </w:rPr>
-        <w:lastRenderedPageBreak/>
+        <w:jc w:val="both"/>
+        <w:rPr>
+          <w:rFonts w:ascii="Times New Roman" w:hAnsi="Times New Roman"/>
+          <w:lang w:val="pt-BR"/>
+        </w:rPr>
+      </w:pPr>
+    </w:p>
+    <w:p>
+      <w:pPr>
+        <w:rPr>
+          <w:rFonts w:ascii="Times New Roman" w:hAnsi="Times New Roman"/>
+          <w:lang w:val="pt-BR"/>
+        </w:rPr>
+      </w:pPr>
+      <w:r>
+        <w:rPr>
+          <w:rFonts w:ascii="Times New Roman" w:hAnsi="Times New Roman"/>
+          <w:lang w:val="pt-BR"/>
+        </w:rPr>
+        <w:t>LUCAS</w:t>
+      </w:r>
+      <w:r>
+        <w:rPr>
+          <w:rFonts w:ascii="Times New Roman" w:hAnsi="Times New Roman"/>
+          <w:lang w:val="pt-BR"/>
+        </w:rPr>
+        <w:t xml:space="preserve">, </w:t>
+      </w:r>
+      <w:r>
+        <w:rPr>
+          <w:rFonts w:ascii="Times New Roman" w:hAnsi="Times New Roman"/>
+          <w:lang w:val="pt-BR"/>
+        </w:rPr>
+        <w:t>EDMUNDO</w:t>
+      </w:r>
+      <w:r>
+        <w:rPr>
+          <w:rFonts w:ascii="Times New Roman" w:hAnsi="Times New Roman"/>
+          <w:lang w:val="pt-BR"/>
+        </w:rPr>
+        <w:t xml:space="preserve"> &amp; Sousa, Francisco &amp; Daniel, Fabricio &amp; Lucio, Paulo. (2009). Modelagem hidrológica determinística e estocástica aplicada à região hidrográfica do Xingu- Pará. Revista Brasileira de Meteorologia. 24. 308-322. 10.1590/S0102-77862009000300005.</w:t>
+      </w:r>
+    </w:p>
+    <w:p>
+      <w:pPr>
+        <w:spacing w:after="0" w:line="240" w:lineRule="auto"/>
+        <w:jc w:val="both"/>
+        <w:rPr>
+          <w:rFonts w:ascii="Times New Roman" w:hAnsi="Times New Roman"/>
+          <w:lang w:val="pt-BR"/>
+        </w:rPr>
+      </w:pPr>
+      <w:r>
+        <w:rPr>
+          <w:rFonts w:ascii="Times New Roman" w:hAnsi="Times New Roman"/>
+          <w:lang w:val="pt-BR"/>
+        </w:rPr>
         <w:t xml:space="preserve">R CORE TEAM. </w:t>
       </w:r>
       <w:r>
@@ -2869,8 +4951,129 @@
 </w:document>
 </file>
 
+<file path=word/numbering.xml><?xml version="1.0" encoding="utf-8"?>
+<w:numbering xmlns:wpc="http://schemas.microsoft.com/office/word/2010/wordprocessingCanvas" xmlns:cx="http://schemas.microsoft.com/office/drawing/2014/chartex" xmlns:cx1="http://schemas.microsoft.com/office/drawing/2015/9/8/chartex" xmlns:cx2="http://schemas.microsoft.com/office/drawing/2015/10/21/chartex" xmlns:cx3="http://schemas.microsoft.com/office/drawing/2016/5/9/chartex" xmlns:cx4="http://schemas.microsoft.com/office/drawing/2016/5/10/chartex" xmlns:cx5="http://schemas.microsoft.com/office/drawing/2016/5/11/chartex" xmlns:cx6="http://schemas.microsoft.com/office/drawing/2016/5/12/chartex" xmlns:cx7="http://schemas.microsoft.com/office/drawing/2016/5/13/chartex" xmlns:cx8="http://schemas.microsoft.com/office/drawing/2016/5/14/chartex" xmlns:mc="http://schemas.openxmlformats.org/markup-compatibility/2006" xmlns:aink="http://schemas.microsoft.com/office/drawing/2016/ink" xmlns:am3d="http://schemas.microsoft.com/office/drawing/2017/model3d" xmlns:o="urn:schemas-microsoft-com:office:office" xmlns:oel="http://schemas.microsoft.com/office/2019/extlst" xmlns:r="http://schemas.openxmlformats.org/officeDocument/2006/relationships" xmlns:m="http://schemas.openxmlformats.org/officeDocument/2006/math" xmlns:v="urn:schemas-microsoft-com:vml" xmlns:wp14="http://schemas.microsoft.com/office/word/2010/wordprocessingDrawing" xmlns:wp="http://schemas.openxmlformats.org/drawingml/2006/wordprocessingDrawing" xmlns:w10="urn:schemas-microsoft-com:office:word" xmlns:w="http://schemas.openxmlformats.org/wordprocessingml/2006/main" xmlns:w14="http://schemas.microsoft.com/office/word/2010/wordml" xmlns:w15="http://schemas.microsoft.com/office/word/2012/wordml" xmlns:w16cex="http://schemas.microsoft.com/office/word/2018/wordml/cex" xmlns:w16cid="http://schemas.microsoft.com/office/word/2016/wordml/cid" xmlns:w16="http://schemas.microsoft.com/office/word/2018/wordml" xmlns:w16sdtdh="http://schemas.microsoft.com/office/word/2020/wordml/sdtdatahash" xmlns:w16se="http://schemas.microsoft.com/office/word/2015/wordml/symex" xmlns:wpg="http://schemas.microsoft.com/office/word/2010/wordprocessingGroup" xmlns:wpi="http://schemas.microsoft.com/office/word/2010/wordprocessingInk" xmlns:wne="http://schemas.microsoft.com/office/word/2006/wordml" xmlns:wps="http://schemas.microsoft.com/office/word/2010/wordprocessingShape" mc:Ignorable="w14 w15 w16se w16cid w16 w16cex w16sdtdh wp14">
+  <w:abstractNum w:abstractNumId="0" w15:restartNumberingAfterBreak="0">
+    <w:nsid w:val="63D35990"/>
+    <w:multiLevelType w:val="hybridMultilevel"/>
+    <w:tmpl w:val="85F6BFD0"/>
+    <w:lvl w:ilvl="0" w:tplc="04160001">
+      <w:start w:val="1"/>
+      <w:numFmt w:val="bullet"/>
+      <w:lvlText w:val=""/>
+      <w:lvlJc w:val="left"/>
+      <w:pPr>
+        <w:ind w:left="720" w:hanging="360"/>
+      </w:pPr>
+      <w:rPr>
+        <w:rFonts w:ascii="Symbol" w:hAnsi="Symbol" w:hint="default"/>
+      </w:rPr>
+    </w:lvl>
+    <w:lvl w:ilvl="1" w:tplc="04160003" w:tentative="1">
+      <w:start w:val="1"/>
+      <w:numFmt w:val="bullet"/>
+      <w:lvlText w:val="o"/>
+      <w:lvlJc w:val="left"/>
+      <w:pPr>
+        <w:ind w:left="1440" w:hanging="360"/>
+      </w:pPr>
+      <w:rPr>
+        <w:rFonts w:ascii="Courier New" w:hAnsi="Courier New" w:cs="Courier New" w:hint="default"/>
+      </w:rPr>
+    </w:lvl>
+    <w:lvl w:ilvl="2" w:tplc="04160005" w:tentative="1">
+      <w:start w:val="1"/>
+      <w:numFmt w:val="bullet"/>
+      <w:lvlText w:val=""/>
+      <w:lvlJc w:val="left"/>
+      <w:pPr>
+        <w:ind w:left="2160" w:hanging="360"/>
+      </w:pPr>
+      <w:rPr>
+        <w:rFonts w:ascii="Wingdings" w:hAnsi="Wingdings" w:hint="default"/>
+      </w:rPr>
+    </w:lvl>
+    <w:lvl w:ilvl="3" w:tplc="04160001" w:tentative="1">
+      <w:start w:val="1"/>
+      <w:numFmt w:val="bullet"/>
+      <w:lvlText w:val=""/>
+      <w:lvlJc w:val="left"/>
+      <w:pPr>
+        <w:ind w:left="2880" w:hanging="360"/>
+      </w:pPr>
+      <w:rPr>
+        <w:rFonts w:ascii="Symbol" w:hAnsi="Symbol" w:hint="default"/>
+      </w:rPr>
+    </w:lvl>
+    <w:lvl w:ilvl="4" w:tplc="04160003" w:tentative="1">
+      <w:start w:val="1"/>
+      <w:numFmt w:val="bullet"/>
+      <w:lvlText w:val="o"/>
+      <w:lvlJc w:val="left"/>
+      <w:pPr>
+        <w:ind w:left="3600" w:hanging="360"/>
+      </w:pPr>
+      <w:rPr>
+        <w:rFonts w:ascii="Courier New" w:hAnsi="Courier New" w:cs="Courier New" w:hint="default"/>
+      </w:rPr>
+    </w:lvl>
+    <w:lvl w:ilvl="5" w:tplc="04160005" w:tentative="1">
+      <w:start w:val="1"/>
+      <w:numFmt w:val="bullet"/>
+      <w:lvlText w:val=""/>
+      <w:lvlJc w:val="left"/>
+      <w:pPr>
+        <w:ind w:left="4320" w:hanging="360"/>
+      </w:pPr>
+      <w:rPr>
+        <w:rFonts w:ascii="Wingdings" w:hAnsi="Wingdings" w:hint="default"/>
+      </w:rPr>
+    </w:lvl>
+    <w:lvl w:ilvl="6" w:tplc="04160001" w:tentative="1">
+      <w:start w:val="1"/>
+      <w:numFmt w:val="bullet"/>
+      <w:lvlText w:val=""/>
+      <w:lvlJc w:val="left"/>
+      <w:pPr>
+        <w:ind w:left="5040" w:hanging="360"/>
+      </w:pPr>
+      <w:rPr>
+        <w:rFonts w:ascii="Symbol" w:hAnsi="Symbol" w:hint="default"/>
+      </w:rPr>
+    </w:lvl>
+    <w:lvl w:ilvl="7" w:tplc="04160003" w:tentative="1">
+      <w:start w:val="1"/>
+      <w:numFmt w:val="bullet"/>
+      <w:lvlText w:val="o"/>
+      <w:lvlJc w:val="left"/>
+      <w:pPr>
+        <w:ind w:left="5760" w:hanging="360"/>
+      </w:pPr>
+      <w:rPr>
+        <w:rFonts w:ascii="Courier New" w:hAnsi="Courier New" w:cs="Courier New" w:hint="default"/>
+      </w:rPr>
+    </w:lvl>
+    <w:lvl w:ilvl="8" w:tplc="04160005" w:tentative="1">
+      <w:start w:val="1"/>
+      <w:numFmt w:val="bullet"/>
+      <w:lvlText w:val=""/>
+      <w:lvlJc w:val="left"/>
+      <w:pPr>
+        <w:ind w:left="6480" w:hanging="360"/>
+      </w:pPr>
+      <w:rPr>
+        <w:rFonts w:ascii="Wingdings" w:hAnsi="Wingdings" w:hint="default"/>
+      </w:rPr>
+    </w:lvl>
+  </w:abstractNum>
+  <w:num w:numId="1" w16cid:durableId="1746534441">
+    <w:abstractNumId w:val="0"/>
+  </w:num>
+</w:numbering>
+</file>
+
 <file path=word/styles.xml><?xml version="1.0" encoding="utf-8"?>
-<w:styles xmlns:mc="http://schemas.openxmlformats.org/markup-compatibility/2006" xmlns:r="http://schemas.openxmlformats.org/officeDocument/2006/relationships" xmlns:w="http://schemas.openxmlformats.org/wordprocessingml/2006/main" xmlns:w14="http://schemas.microsoft.com/office/word/2010/wordml" xmlns:w15="http://schemas.microsoft.com/office/word/2012/wordml" xmlns:w16cex="http://schemas.microsoft.com/office/word/2018/wordml/cex" xmlns:w16cid="http://schemas.microsoft.com/office/word/2016/wordml/cid" xmlns:w16="http://schemas.microsoft.com/office/word/2018/wordml" xmlns:w16du="http://schemas.microsoft.com/office/word/2023/wordml/word16du" xmlns:w16sdtdh="http://schemas.microsoft.com/office/word/2020/wordml/sdtdatahash" xmlns:w16sdtfl="http://schemas.microsoft.com/office/word/2024/wordml/sdtformatlock" xmlns:w16se="http://schemas.microsoft.com/office/word/2015/wordml/symex" mc:Ignorable="w14 w15 w16se w16cid w16 w16cex w16sdtdh w16sdtfl w16du">
+<w:styles xmlns:mc="http://schemas.openxmlformats.org/markup-compatibility/2006" xmlns:r="http://schemas.openxmlformats.org/officeDocument/2006/relationships" xmlns:w="http://schemas.openxmlformats.org/wordprocessingml/2006/main" xmlns:w14="http://schemas.microsoft.com/office/word/2010/wordml" xmlns:w15="http://schemas.microsoft.com/office/word/2012/wordml" xmlns:w16cex="http://schemas.microsoft.com/office/word/2018/wordml/cex" xmlns:w16cid="http://schemas.microsoft.com/office/word/2016/wordml/cid" xmlns:w16="http://schemas.microsoft.com/office/word/2018/wordml" xmlns:w16sdtdh="http://schemas.microsoft.com/office/word/2020/wordml/sdtdatahash" xmlns:w16se="http://schemas.microsoft.com/office/word/2015/wordml/symex" mc:Ignorable="w14 w15 w16se w16cid w16 w16cex w16sdtdh">
   <w:docDefaults>
     <w:rPrDefault>
       <w:rPr>
@@ -3270,11 +5473,11 @@
     <w:name w:val="Normal"/>
     <w:qFormat/>
   </w:style>
-  <w:style w:type="paragraph" w:styleId="Heading1">
+  <w:style w:type="paragraph" w:styleId="Ttulo1">
     <w:name w:val="heading 1"/>
     <w:basedOn w:val="Normal"/>
     <w:next w:val="Normal"/>
-    <w:link w:val="Heading1Char"/>
+    <w:link w:val="Ttulo1Char"/>
     <w:uiPriority w:val="9"/>
     <w:qFormat/>
     <w:rsid w:val="003F0F3B"/>
@@ -3291,11 +5494,11 @@
       <w:szCs w:val="40"/>
     </w:rPr>
   </w:style>
-  <w:style w:type="paragraph" w:styleId="Heading2">
+  <w:style w:type="paragraph" w:styleId="Ttulo2">
     <w:name w:val="heading 2"/>
     <w:basedOn w:val="Normal"/>
     <w:next w:val="Normal"/>
-    <w:link w:val="Heading2Char"/>
+    <w:link w:val="Ttulo2Char"/>
     <w:uiPriority w:val="9"/>
     <w:unhideWhenUsed/>
     <w:qFormat/>
@@ -3313,11 +5516,11 @@
       <w:szCs w:val="32"/>
     </w:rPr>
   </w:style>
-  <w:style w:type="paragraph" w:styleId="Heading3">
+  <w:style w:type="paragraph" w:styleId="Ttulo3">
     <w:name w:val="heading 3"/>
     <w:basedOn w:val="Normal"/>
     <w:next w:val="Normal"/>
-    <w:link w:val="Heading3Char"/>
+    <w:link w:val="Ttulo3Char"/>
     <w:uiPriority w:val="9"/>
     <w:semiHidden/>
     <w:unhideWhenUsed/>
@@ -3336,11 +5539,11 @@
       <w:szCs w:val="28"/>
     </w:rPr>
   </w:style>
-  <w:style w:type="paragraph" w:styleId="Heading4">
+  <w:style w:type="paragraph" w:styleId="Ttulo4">
     <w:name w:val="heading 4"/>
     <w:basedOn w:val="Normal"/>
     <w:next w:val="Normal"/>
-    <w:link w:val="Heading4Char"/>
+    <w:link w:val="Ttulo4Char"/>
     <w:uiPriority w:val="9"/>
     <w:semiHidden/>
     <w:unhideWhenUsed/>
@@ -3359,11 +5562,11 @@
       <w:color w:val="0F4761" w:themeColor="accent1" w:themeShade="BF"/>
     </w:rPr>
   </w:style>
-  <w:style w:type="paragraph" w:styleId="Heading5">
+  <w:style w:type="paragraph" w:styleId="Ttulo5">
     <w:name w:val="heading 5"/>
     <w:basedOn w:val="Normal"/>
     <w:next w:val="Normal"/>
-    <w:link w:val="Heading5Char"/>
+    <w:link w:val="Ttulo5Char"/>
     <w:uiPriority w:val="9"/>
     <w:semiHidden/>
     <w:unhideWhenUsed/>
@@ -3380,11 +5583,11 @@
       <w:color w:val="0F4761" w:themeColor="accent1" w:themeShade="BF"/>
     </w:rPr>
   </w:style>
-  <w:style w:type="paragraph" w:styleId="Heading6">
+  <w:style w:type="paragraph" w:styleId="Ttulo6">
     <w:name w:val="heading 6"/>
     <w:basedOn w:val="Normal"/>
     <w:next w:val="Normal"/>
-    <w:link w:val="Heading6Char"/>
+    <w:link w:val="Ttulo6Char"/>
     <w:uiPriority w:val="9"/>
     <w:semiHidden/>
     <w:unhideWhenUsed/>
@@ -3403,11 +5606,11 @@
       <w:color w:val="595959" w:themeColor="text1" w:themeTint="A6"/>
     </w:rPr>
   </w:style>
-  <w:style w:type="paragraph" w:styleId="Heading7">
+  <w:style w:type="paragraph" w:styleId="Ttulo7">
     <w:name w:val="heading 7"/>
     <w:basedOn w:val="Normal"/>
     <w:next w:val="Normal"/>
-    <w:link w:val="Heading7Char"/>
+    <w:link w:val="Ttulo7Char"/>
     <w:uiPriority w:val="9"/>
     <w:semiHidden/>
     <w:unhideWhenUsed/>
@@ -3424,11 +5627,11 @@
       <w:color w:val="595959" w:themeColor="text1" w:themeTint="A6"/>
     </w:rPr>
   </w:style>
-  <w:style w:type="paragraph" w:styleId="Heading8">
+  <w:style w:type="paragraph" w:styleId="Ttulo8">
     <w:name w:val="heading 8"/>
     <w:basedOn w:val="Normal"/>
     <w:next w:val="Normal"/>
-    <w:link w:val="Heading8Char"/>
+    <w:link w:val="Ttulo8Char"/>
     <w:uiPriority w:val="9"/>
     <w:semiHidden/>
     <w:unhideWhenUsed/>
@@ -3447,11 +5650,11 @@
       <w:color w:val="272727" w:themeColor="text1" w:themeTint="D8"/>
     </w:rPr>
   </w:style>
-  <w:style w:type="paragraph" w:styleId="Heading9">
+  <w:style w:type="paragraph" w:styleId="Ttulo9">
     <w:name w:val="heading 9"/>
     <w:basedOn w:val="Normal"/>
     <w:next w:val="Normal"/>
-    <w:link w:val="Heading9Char"/>
+    <w:link w:val="Ttulo9Char"/>
     <w:uiPriority w:val="9"/>
     <w:semiHidden/>
     <w:unhideWhenUsed/>
@@ -3468,13 +5671,12 @@
       <w:color w:val="272727" w:themeColor="text1" w:themeTint="D8"/>
     </w:rPr>
   </w:style>
-  <w:style w:type="character" w:default="1" w:styleId="DefaultParagraphFont">
+  <w:style w:type="character" w:default="1" w:styleId="Fontepargpadro">
     <w:name w:val="Default Paragraph Font"/>
     <w:uiPriority w:val="1"/>
-    <w:semiHidden/>
     <w:unhideWhenUsed/>
   </w:style>
-  <w:style w:type="table" w:default="1" w:styleId="TableNormal">
+  <w:style w:type="table" w:default="1" w:styleId="Tabelanormal">
     <w:name w:val="Normal Table"/>
     <w:uiPriority w:val="99"/>
     <w:semiHidden/>
@@ -3489,16 +5691,16 @@
       </w:tblCellMar>
     </w:tblPr>
   </w:style>
-  <w:style w:type="numbering" w:default="1" w:styleId="NoList">
+  <w:style w:type="numbering" w:default="1" w:styleId="Semlista">
     <w:name w:val="No List"/>
     <w:uiPriority w:val="99"/>
     <w:semiHidden/>
     <w:unhideWhenUsed/>
   </w:style>
-  <w:style w:type="character" w:customStyle="1" w:styleId="Heading1Char">
-    <w:name w:val="Heading 1 Char"/>
-    <w:basedOn w:val="DefaultParagraphFont"/>
-    <w:link w:val="Heading1"/>
+  <w:style w:type="character" w:customStyle="1" w:styleId="Ttulo1Char">
+    <w:name w:val="Título 1 Char"/>
+    <w:basedOn w:val="Fontepargpadro"/>
+    <w:link w:val="Ttulo1"/>
     <w:uiPriority w:val="9"/>
     <w:rsid w:val="003F0F3B"/>
     <w:rPr>
@@ -3508,10 +5710,10 @@
       <w:szCs w:val="40"/>
     </w:rPr>
   </w:style>
-  <w:style w:type="character" w:customStyle="1" w:styleId="Heading2Char">
-    <w:name w:val="Heading 2 Char"/>
-    <w:basedOn w:val="DefaultParagraphFont"/>
-    <w:link w:val="Heading2"/>
+  <w:style w:type="character" w:customStyle="1" w:styleId="Ttulo2Char">
+    <w:name w:val="Título 2 Char"/>
+    <w:basedOn w:val="Fontepargpadro"/>
+    <w:link w:val="Ttulo2"/>
     <w:uiPriority w:val="9"/>
     <w:semiHidden/>
     <w:rsid w:val="003F0F3B"/>
@@ -3522,10 +5724,10 @@
       <w:szCs w:val="32"/>
     </w:rPr>
   </w:style>
-  <w:style w:type="character" w:customStyle="1" w:styleId="Heading3Char">
-    <w:name w:val="Heading 3 Char"/>
-    <w:basedOn w:val="DefaultParagraphFont"/>
-    <w:link w:val="Heading3"/>
+  <w:style w:type="character" w:customStyle="1" w:styleId="Ttulo3Char">
+    <w:name w:val="Título 3 Char"/>
+    <w:basedOn w:val="Fontepargpadro"/>
+    <w:link w:val="Ttulo3"/>
     <w:uiPriority w:val="9"/>
     <w:semiHidden/>
     <w:rsid w:val="003F0F3B"/>
@@ -3536,10 +5738,10 @@
       <w:szCs w:val="28"/>
     </w:rPr>
   </w:style>
-  <w:style w:type="character" w:customStyle="1" w:styleId="Heading4Char">
-    <w:name w:val="Heading 4 Char"/>
-    <w:basedOn w:val="DefaultParagraphFont"/>
-    <w:link w:val="Heading4"/>
+  <w:style w:type="character" w:customStyle="1" w:styleId="Ttulo4Char">
+    <w:name w:val="Título 4 Char"/>
+    <w:basedOn w:val="Fontepargpadro"/>
+    <w:link w:val="Ttulo4"/>
     <w:uiPriority w:val="9"/>
     <w:semiHidden/>
     <w:rsid w:val="003F0F3B"/>
@@ -3550,10 +5752,10 @@
       <w:color w:val="0F4761" w:themeColor="accent1" w:themeShade="BF"/>
     </w:rPr>
   </w:style>
-  <w:style w:type="character" w:customStyle="1" w:styleId="Heading5Char">
-    <w:name w:val="Heading 5 Char"/>
-    <w:basedOn w:val="DefaultParagraphFont"/>
-    <w:link w:val="Heading5"/>
+  <w:style w:type="character" w:customStyle="1" w:styleId="Ttulo5Char">
+    <w:name w:val="Título 5 Char"/>
+    <w:basedOn w:val="Fontepargpadro"/>
+    <w:link w:val="Ttulo5"/>
     <w:uiPriority w:val="9"/>
     <w:semiHidden/>
     <w:rsid w:val="003F0F3B"/>
@@ -3562,10 +5764,10 @@
       <w:color w:val="0F4761" w:themeColor="accent1" w:themeShade="BF"/>
     </w:rPr>
   </w:style>
-  <w:style w:type="character" w:customStyle="1" w:styleId="Heading6Char">
-    <w:name w:val="Heading 6 Char"/>
-    <w:basedOn w:val="DefaultParagraphFont"/>
-    <w:link w:val="Heading6"/>
+  <w:style w:type="character" w:customStyle="1" w:styleId="Ttulo6Char">
+    <w:name w:val="Título 6 Char"/>
+    <w:basedOn w:val="Fontepargpadro"/>
+    <w:link w:val="Ttulo6"/>
     <w:uiPriority w:val="9"/>
     <w:semiHidden/>
     <w:rsid w:val="003F0F3B"/>
@@ -3576,10 +5778,10 @@
       <w:color w:val="595959" w:themeColor="text1" w:themeTint="A6"/>
     </w:rPr>
   </w:style>
-  <w:style w:type="character" w:customStyle="1" w:styleId="Heading7Char">
-    <w:name w:val="Heading 7 Char"/>
-    <w:basedOn w:val="DefaultParagraphFont"/>
-    <w:link w:val="Heading7"/>
+  <w:style w:type="character" w:customStyle="1" w:styleId="Ttulo7Char">
+    <w:name w:val="Título 7 Char"/>
+    <w:basedOn w:val="Fontepargpadro"/>
+    <w:link w:val="Ttulo7"/>
     <w:uiPriority w:val="9"/>
     <w:semiHidden/>
     <w:rsid w:val="003F0F3B"/>
@@ -3588,10 +5790,10 @@
       <w:color w:val="595959" w:themeColor="text1" w:themeTint="A6"/>
     </w:rPr>
   </w:style>
-  <w:style w:type="character" w:customStyle="1" w:styleId="Heading8Char">
-    <w:name w:val="Heading 8 Char"/>
-    <w:basedOn w:val="DefaultParagraphFont"/>
-    <w:link w:val="Heading8"/>
+  <w:style w:type="character" w:customStyle="1" w:styleId="Ttulo8Char">
+    <w:name w:val="Título 8 Char"/>
+    <w:basedOn w:val="Fontepargpadro"/>
+    <w:link w:val="Ttulo8"/>
     <w:uiPriority w:val="9"/>
     <w:semiHidden/>
     <w:rsid w:val="003F0F3B"/>
@@ -3602,10 +5804,10 @@
       <w:color w:val="272727" w:themeColor="text1" w:themeTint="D8"/>
     </w:rPr>
   </w:style>
-  <w:style w:type="character" w:customStyle="1" w:styleId="Heading9Char">
-    <w:name w:val="Heading 9 Char"/>
-    <w:basedOn w:val="DefaultParagraphFont"/>
-    <w:link w:val="Heading9"/>
+  <w:style w:type="character" w:customStyle="1" w:styleId="Ttulo9Char">
+    <w:name w:val="Título 9 Char"/>
+    <w:basedOn w:val="Fontepargpadro"/>
+    <w:link w:val="Ttulo9"/>
     <w:uiPriority w:val="9"/>
     <w:semiHidden/>
     <w:rsid w:val="003F0F3B"/>
@@ -3614,11 +5816,11 @@
       <w:color w:val="272727" w:themeColor="text1" w:themeTint="D8"/>
     </w:rPr>
   </w:style>
-  <w:style w:type="paragraph" w:styleId="Title">
+  <w:style w:type="paragraph" w:styleId="Ttulo">
     <w:name w:val="Title"/>
     <w:basedOn w:val="Normal"/>
     <w:next w:val="Normal"/>
-    <w:link w:val="TitleChar"/>
+    <w:link w:val="TtuloChar"/>
     <w:uiPriority w:val="10"/>
     <w:qFormat/>
     <w:rsid w:val="003F0F3B"/>
@@ -3634,10 +5836,10 @@
       <w:szCs w:val="56"/>
     </w:rPr>
   </w:style>
-  <w:style w:type="character" w:customStyle="1" w:styleId="TitleChar">
-    <w:name w:val="Title Char"/>
-    <w:basedOn w:val="DefaultParagraphFont"/>
-    <w:link w:val="Title"/>
+  <w:style w:type="character" w:customStyle="1" w:styleId="TtuloChar">
+    <w:name w:val="Título Char"/>
+    <w:basedOn w:val="Fontepargpadro"/>
+    <w:link w:val="Ttulo"/>
     <w:uiPriority w:val="10"/>
     <w:rsid w:val="003F0F3B"/>
     <w:rPr>
@@ -3648,11 +5850,11 @@
       <w:szCs w:val="56"/>
     </w:rPr>
   </w:style>
-  <w:style w:type="paragraph" w:styleId="Subtitle">
+  <w:style w:type="paragraph" w:styleId="Subttulo">
     <w:name w:val="Subtitle"/>
     <w:basedOn w:val="Normal"/>
     <w:next w:val="Normal"/>
-    <w:link w:val="SubtitleChar"/>
+    <w:link w:val="SubttuloChar"/>
     <w:uiPriority w:val="11"/>
     <w:qFormat/>
     <w:rsid w:val="003F0F3B"/>
@@ -3669,10 +5871,10 @@
       <w:szCs w:val="28"/>
     </w:rPr>
   </w:style>
-  <w:style w:type="character" w:customStyle="1" w:styleId="SubtitleChar">
-    <w:name w:val="Subtitle Char"/>
-    <w:basedOn w:val="DefaultParagraphFont"/>
-    <w:link w:val="Subtitle"/>
+  <w:style w:type="character" w:customStyle="1" w:styleId="SubttuloChar">
+    <w:name w:val="Subtítulo Char"/>
+    <w:basedOn w:val="Fontepargpadro"/>
+    <w:link w:val="Subttulo"/>
     <w:uiPriority w:val="11"/>
     <w:rsid w:val="003F0F3B"/>
     <w:rPr>
@@ -3683,11 +5885,11 @@
       <w:szCs w:val="28"/>
     </w:rPr>
   </w:style>
-  <w:style w:type="paragraph" w:styleId="Quote">
+  <w:style w:type="paragraph" w:styleId="Citao">
     <w:name w:val="Quote"/>
     <w:basedOn w:val="Normal"/>
     <w:next w:val="Normal"/>
-    <w:link w:val="QuoteChar"/>
+    <w:link w:val="CitaoChar"/>
     <w:uiPriority w:val="29"/>
     <w:qFormat/>
     <w:rsid w:val="003F0F3B"/>
@@ -3701,10 +5903,10 @@
       <w:color w:val="404040" w:themeColor="text1" w:themeTint="BF"/>
     </w:rPr>
   </w:style>
-  <w:style w:type="character" w:customStyle="1" w:styleId="QuoteChar">
-    <w:name w:val="Quote Char"/>
-    <w:basedOn w:val="DefaultParagraphFont"/>
-    <w:link w:val="Quote"/>
+  <w:style w:type="character" w:customStyle="1" w:styleId="CitaoChar">
+    <w:name w:val="Citação Char"/>
+    <w:basedOn w:val="Fontepargpadro"/>
+    <w:link w:val="Citao"/>
     <w:uiPriority w:val="29"/>
     <w:rsid w:val="003F0F3B"/>
     <w:rPr>
@@ -3713,7 +5915,7 @@
       <w:color w:val="404040" w:themeColor="text1" w:themeTint="BF"/>
     </w:rPr>
   </w:style>
-  <w:style w:type="paragraph" w:styleId="ListParagraph">
+  <w:style w:type="paragraph" w:styleId="PargrafodaLista">
     <w:name w:val="List Paragraph"/>
     <w:basedOn w:val="Normal"/>
     <w:uiPriority w:val="34"/>
@@ -3724,9 +5926,9 @@
       <w:contextualSpacing/>
     </w:pPr>
   </w:style>
-  <w:style w:type="character" w:styleId="IntenseEmphasis">
+  <w:style w:type="character" w:styleId="nfaseIntensa">
     <w:name w:val="Intense Emphasis"/>
-    <w:basedOn w:val="DefaultParagraphFont"/>
+    <w:basedOn w:val="Fontepargpadro"/>
     <w:uiPriority w:val="21"/>
     <w:qFormat/>
     <w:rsid w:val="003F0F3B"/>
@@ -3736,11 +5938,11 @@
       <w:color w:val="0F4761" w:themeColor="accent1" w:themeShade="BF"/>
     </w:rPr>
   </w:style>
-  <w:style w:type="paragraph" w:styleId="IntenseQuote">
+  <w:style w:type="paragraph" w:styleId="CitaoIntensa">
     <w:name w:val="Intense Quote"/>
     <w:basedOn w:val="Normal"/>
     <w:next w:val="Normal"/>
-    <w:link w:val="IntenseQuoteChar"/>
+    <w:link w:val="CitaoIntensaChar"/>
     <w:uiPriority w:val="30"/>
     <w:qFormat/>
     <w:rsid w:val="003F0F3B"/>
@@ -3759,10 +5961,10 @@
       <w:color w:val="0F4761" w:themeColor="accent1" w:themeShade="BF"/>
     </w:rPr>
   </w:style>
-  <w:style w:type="character" w:customStyle="1" w:styleId="IntenseQuoteChar">
-    <w:name w:val="Intense Quote Char"/>
-    <w:basedOn w:val="DefaultParagraphFont"/>
-    <w:link w:val="IntenseQuote"/>
+  <w:style w:type="character" w:customStyle="1" w:styleId="CitaoIntensaChar">
+    <w:name w:val="Citação Intensa Char"/>
+    <w:basedOn w:val="Fontepargpadro"/>
+    <w:link w:val="CitaoIntensa"/>
     <w:uiPriority w:val="30"/>
     <w:rsid w:val="003F0F3B"/>
     <w:rPr>
@@ -3771,9 +5973,9 @@
       <w:color w:val="0F4761" w:themeColor="accent1" w:themeShade="BF"/>
     </w:rPr>
   </w:style>
-  <w:style w:type="character" w:styleId="IntenseReference">
+  <w:style w:type="character" w:styleId="RefernciaIntensa">
     <w:name w:val="Intense Reference"/>
-    <w:basedOn w:val="DefaultParagraphFont"/>
+    <w:basedOn w:val="Fontepargpadro"/>
     <w:uiPriority w:val="32"/>
     <w:qFormat/>
     <w:rsid w:val="003F0F3B"/>
@@ -3783,6 +5985,59 @@
       <w:smallCaps/>
       <w:color w:val="0F4761" w:themeColor="accent1" w:themeShade="BF"/>
       <w:spacing w:val="5"/>
+    </w:rPr>
+  </w:style>
+  <w:style w:type="paragraph" w:styleId="Legenda">
+    <w:name w:val="caption"/>
+    <w:basedOn w:val="Normal"/>
+    <w:next w:val="Normal"/>
+    <w:uiPriority w:val="35"/>
+    <w:semiHidden/>
+    <w:unhideWhenUsed/>
+    <w:qFormat/>
+    <w:rsid w:val="00AD7683"/>
+    <w:pPr>
+      <w:spacing w:after="200" w:line="240" w:lineRule="auto"/>
+    </w:pPr>
+    <w:rPr>
+      <w:i/>
+      <w:iCs/>
+      <w:color w:val="0E2841" w:themeColor="text2"/>
+      <w:sz w:val="18"/>
+      <w:szCs w:val="18"/>
+    </w:rPr>
+  </w:style>
+  <w:style w:type="character" w:styleId="TextodoEspaoReservado">
+    <w:name w:val="Placeholder Text"/>
+    <w:basedOn w:val="Fontepargpadro"/>
+    <w:uiPriority w:val="99"/>
+    <w:semiHidden/>
+    <w:rsid w:val="00BC36C0"/>
+    <w:rPr>
+      <w:color w:val="666666"/>
+    </w:rPr>
+  </w:style>
+  <w:style w:type="character" w:styleId="Hyperlink">
+    <w:name w:val="Hyperlink"/>
+    <w:basedOn w:val="Fontepargpadro"/>
+    <w:uiPriority w:val="99"/>
+    <w:unhideWhenUsed/>
+    <w:rsid w:val="00B03C6F"/>
+    <w:rPr>
+      <w:color w:val="467886" w:themeColor="hyperlink"/>
+      <w:u w:val="single"/>
+    </w:rPr>
+  </w:style>
+  <w:style w:type="character" w:styleId="MenoPendente">
+    <w:name w:val="Unresolved Mention"/>
+    <w:basedOn w:val="Fontepargpadro"/>
+    <w:uiPriority w:val="99"/>
+    <w:semiHidden/>
+    <w:unhideWhenUsed/>
+    <w:rsid w:val="00B03C6F"/>
+    <w:rPr>
+      <w:color w:val="605E5C"/>
+      <w:shd w:val="clear" w:color="auto" w:fill="E1DFDD"/>
     </w:rPr>
   </w:style>
 </w:styles>

</xml_diff>

<commit_message>
# Feature: Ajustes de formatação do documento;
</commit_message>
<xml_diff>
--- a/series_temporais/relatorio/Modelagem e Previsão da Superfície de Água em Belo Horizonte.docx
+++ b/series_temporais/relatorio/Modelagem e Previsão da Superfície de Água em Belo Horizonte.docx
@@ -88,37 +88,6 @@
         </w:rPr>
         <w:t>²</w:t>
       </w:r>
-      <w:r>
-        <w:rPr>
-          <w:rFonts w:ascii="Times New Roman" w:hAnsi="Times New Roman"/>
-          <w:lang w:val="pt-BR"/>
-        </w:rPr>
-        <w:br/>
-        <w:t xml:space="preserve">Especialização em Métodos Matemáticos Aplicados – </w:t>
-      </w:r>
-      <w:r>
-        <w:rPr>
-          <w:rFonts w:ascii="Times New Roman" w:hAnsi="Times New Roman"/>
-          <w:u w:val="single"/>
-          <w:lang w:val="pt-BR"/>
-        </w:rPr>
-        <w:t>CEMMA</w:t>
-      </w:r>
-      <w:r>
-        <w:rPr>
-          <w:rFonts w:ascii="Times New Roman" w:hAnsi="Times New Roman"/>
-          <w:lang w:val="pt-BR"/>
-        </w:rPr>
-        <w:br/>
-        <w:t xml:space="preserve">E-mail: </w:t>
-      </w:r>
-      <w:r>
-        <w:rPr>
-          <w:rFonts w:ascii="Times New Roman" w:hAnsi="Times New Roman"/>
-          <w:lang w:val="pt-BR"/>
-        </w:rPr>
-        <w:t>ettoregabriel@alunos.utfpr.edu.br</w:t>
-      </w:r>
     </w:p>
     <w:p>
       <w:pPr>
@@ -255,23 +224,7 @@
           <w:rFonts w:ascii="Times New Roman" w:hAnsi="Times New Roman"/>
           <w:lang w:val="pt-BR"/>
         </w:rPr>
-        <w:t xml:space="preserve"> (RMSE) em um horizonte de 60 meses (2020–2024). O Teste Dickey-Fuller Aumentado confirmou estacionariedade da série (DF = -4,07; p &lt; 0,01). A seleção automática por AIC indicou o modelo </w:t>
-      </w:r>
-      <w:proofErr w:type="gramStart"/>
-      <w:r>
-        <w:rPr>
-          <w:rFonts w:ascii="Times New Roman" w:hAnsi="Times New Roman"/>
-          <w:lang w:val="pt-BR"/>
-        </w:rPr>
-        <w:t>ARIMA(</w:t>
-      </w:r>
-      <w:proofErr w:type="gramEnd"/>
-      <w:r>
-        <w:rPr>
-          <w:rFonts w:ascii="Times New Roman" w:hAnsi="Times New Roman"/>
-          <w:lang w:val="pt-BR"/>
-        </w:rPr>
-        <w:t>3,0,2)(0,1,1)</w:t>
+        <w:t xml:space="preserve"> (RMSE) em um horizonte de 60 meses (2020–2024). O Teste Dickey-Fuller Aumentado confirmou estacionariedade da série (DF = -4,07; p &lt; 0,01). A seleção automática por AIC indicou o modelo ARIMA(3,0,2)(0,1,1)</w:t>
       </w:r>
       <w:r>
         <w:rPr>
@@ -379,21 +332,7 @@
           <w:rFonts w:ascii="Times New Roman" w:hAnsi="Times New Roman"/>
         </w:rPr>
         <w:lastRenderedPageBreak/>
-        <w:t xml:space="preserve">goodness-of-fit (AIC) and predictive accuracy (RMSE) over a 60-month horizon (2020–2024). The Augmented Dickey-Fuller test confirmed series stationarity (DF = -4.07; p &lt; 0.01). Automatic AIC selection identified the </w:t>
-      </w:r>
-      <w:proofErr w:type="gramStart"/>
-      <w:r>
-        <w:rPr>
-          <w:rFonts w:ascii="Times New Roman" w:hAnsi="Times New Roman"/>
-        </w:rPr>
-        <w:t>ARIMA(</w:t>
-      </w:r>
-      <w:proofErr w:type="gramEnd"/>
-      <w:r>
-        <w:rPr>
-          <w:rFonts w:ascii="Times New Roman" w:hAnsi="Times New Roman"/>
-        </w:rPr>
-        <w:t>3,0,2)(0,1,1)</w:t>
+        <w:t>goodness-of-fit (AIC) and predictive accuracy (RMSE) over a 60-month horizon (2020–2024). The Augmented Dickey-Fuller test confirmed series stationarity (DF = -4.07; p &lt; 0.01). Automatic AIC selection identified the ARIMA(3,0,2)(0,1,1)</w:t>
       </w:r>
       <w:r>
         <w:rPr>
@@ -1278,17 +1217,12 @@
           </w:tcPr>
           <w:p>
             <w:proofErr w:type="spellStart"/>
-            <w:proofErr w:type="gramStart"/>
             <w:r>
               <w:t>ses</w:t>
             </w:r>
             <w:proofErr w:type="spellEnd"/>
             <w:r>
-              <w:t>(</w:t>
-            </w:r>
-            <w:proofErr w:type="gramEnd"/>
-            <w:r>
-              <w:t>)</w:t>
+              <w:t>()</w:t>
             </w:r>
           </w:p>
         </w:tc>
@@ -1341,13 +1275,8 @@
             <w:hideMark/>
           </w:tcPr>
           <w:p>
-            <w:proofErr w:type="gramStart"/>
-            <w:r>
-              <w:t>holt(</w:t>
-            </w:r>
-            <w:proofErr w:type="gramEnd"/>
-            <w:r>
-              <w:t>)</w:t>
+            <w:r>
+              <w:t>holt()</w:t>
             </w:r>
           </w:p>
         </w:tc>
@@ -1396,17 +1325,12 @@
           </w:tcPr>
           <w:p>
             <w:proofErr w:type="spellStart"/>
-            <w:proofErr w:type="gramStart"/>
             <w:r>
               <w:t>hw</w:t>
             </w:r>
             <w:proofErr w:type="spellEnd"/>
             <w:r>
-              <w:t>(</w:t>
-            </w:r>
-            <w:proofErr w:type="gramEnd"/>
-            <w:r>
-              <w:t>)</w:t>
+              <w:t>()</w:t>
             </w:r>
           </w:p>
         </w:tc>
@@ -1455,12 +1379,10 @@
           </w:tcPr>
           <w:p>
             <w:proofErr w:type="spellStart"/>
-            <w:proofErr w:type="gramStart"/>
             <w:r>
               <w:t>auto.arima</w:t>
             </w:r>
             <w:proofErr w:type="spellEnd"/>
-            <w:proofErr w:type="gramEnd"/>
             <w:r>
               <w:t>()</w:t>
             </w:r>
@@ -1513,22 +1435,42 @@
           </w:tcPr>
           <w:p>
             <w:proofErr w:type="spellStart"/>
-            <w:proofErr w:type="gramStart"/>
             <w:r>
               <w:t>ets</w:t>
             </w:r>
             <w:proofErr w:type="spellEnd"/>
             <w:r>
-              <w:t>(</w:t>
-            </w:r>
-            <w:proofErr w:type="gramEnd"/>
-            <w:r>
-              <w:t>)</w:t>
+              <w:t>()</w:t>
             </w:r>
           </w:p>
         </w:tc>
       </w:tr>
     </w:tbl>
+    <w:p>
+      <w:pPr>
+        <w:spacing w:after="0" w:line="360" w:lineRule="auto"/>
+        <w:jc w:val="center"/>
+        <w:rPr>
+          <w:rFonts w:ascii="Times New Roman" w:hAnsi="Times New Roman"/>
+          <w:i/>
+          <w:iCs/>
+          <w:sz w:val="20"/>
+          <w:szCs w:val="20"/>
+          <w:lang w:val="pt-BR"/>
+        </w:rPr>
+      </w:pPr>
+      <w:r>
+        <w:rPr>
+          <w:rFonts w:ascii="Times New Roman" w:hAnsi="Times New Roman"/>
+          <w:i/>
+          <w:iCs/>
+          <w:sz w:val="20"/>
+          <w:szCs w:val="20"/>
+          <w:lang w:val="pt-BR"/>
+        </w:rPr>
+        <w:t>Fonte: Autoria própria (2026)</w:t>
+      </w:r>
+    </w:p>
     <w:p>
       <w:pPr>
         <w:spacing w:after="0" w:line="360" w:lineRule="auto"/>
@@ -2020,6 +1962,8 @@
         <w:jc w:val="center"/>
         <w:rPr>
           <w:color w:val="auto"/>
+          <w:sz w:val="20"/>
+          <w:szCs w:val="20"/>
           <w:u w:val="single"/>
           <w:lang w:val="pt-BR"/>
         </w:rPr>
@@ -2027,6 +1971,8 @@
       <w:r>
         <w:rPr>
           <w:color w:val="auto"/>
+          <w:sz w:val="20"/>
+          <w:szCs w:val="20"/>
           <w:lang w:val="pt-BR"/>
         </w:rPr>
         <w:t xml:space="preserve">Figura </w:t>
@@ -2034,12 +1980,16 @@
       <w:r>
         <w:rPr>
           <w:color w:val="auto"/>
+          <w:sz w:val="20"/>
+          <w:szCs w:val="20"/>
         </w:rPr>
         <w:fldChar w:fldCharType="begin"/>
       </w:r>
       <w:r>
         <w:rPr>
           <w:color w:val="auto"/>
+          <w:sz w:val="20"/>
+          <w:szCs w:val="20"/>
           <w:lang w:val="pt-BR"/>
         </w:rPr>
         <w:instrText xml:space="preserve"> SEQ Figura \* ARABIC </w:instrText>
@@ -2047,6 +1997,8 @@
       <w:r>
         <w:rPr>
           <w:color w:val="auto"/>
+          <w:sz w:val="20"/>
+          <w:szCs w:val="20"/>
         </w:rPr>
         <w:fldChar w:fldCharType="separate"/>
       </w:r>
@@ -2054,6 +2006,8 @@
         <w:rPr>
           <w:noProof/>
           <w:color w:val="auto"/>
+          <w:sz w:val="20"/>
+          <w:szCs w:val="20"/>
           <w:lang w:val="pt-BR"/>
         </w:rPr>
         <w:t>1</w:t>
@@ -2061,12 +2015,16 @@
       <w:r>
         <w:rPr>
           <w:color w:val="auto"/>
+          <w:sz w:val="20"/>
+          <w:szCs w:val="20"/>
         </w:rPr>
         <w:fldChar w:fldCharType="end"/>
       </w:r>
       <w:r>
         <w:rPr>
           <w:color w:val="auto"/>
+          <w:sz w:val="20"/>
+          <w:szCs w:val="20"/>
           <w:lang w:val="pt-BR"/>
         </w:rPr>
         <w:t xml:space="preserve">: </w:t>
@@ -2075,6 +2033,8 @@
       <w:r>
         <w:rPr>
           <w:color w:val="auto"/>
+          <w:sz w:val="20"/>
+          <w:szCs w:val="20"/>
           <w:lang w:val="pt-BR"/>
         </w:rPr>
         <w:t>Superficies</w:t>
@@ -2083,6 +2043,8 @@
       <w:r>
         <w:rPr>
           <w:color w:val="auto"/>
+          <w:sz w:val="20"/>
+          <w:szCs w:val="20"/>
           <w:lang w:val="pt-BR"/>
         </w:rPr>
         <w:t xml:space="preserve"> de água mensal em Belo Horizonte</w:t>
@@ -2106,407 +2068,6 @@
             <wp:extent cx="5798820" cy="3009067"/>
             <wp:effectExtent l="0" t="0" r="0" b="1270"/>
             <wp:docPr id="1" name="Imagem 1"/>
-            <wp:cNvGraphicFramePr>
-              <a:graphicFrameLocks xmlns:a="http://schemas.openxmlformats.org/drawingml/2006/main" noChangeAspect="1"/>
-            </wp:cNvGraphicFramePr>
-            <a:graphic xmlns:a="http://schemas.openxmlformats.org/drawingml/2006/main">
-              <a:graphicData uri="http://schemas.openxmlformats.org/drawingml/2006/picture">
-                <pic:pic xmlns:pic="http://schemas.openxmlformats.org/drawingml/2006/picture">
-                  <pic:nvPicPr>
-                    <pic:cNvPr id="1" name=""/>
-                    <pic:cNvPicPr/>
-                  </pic:nvPicPr>
-                  <pic:blipFill>
-                    <a:blip r:embed="rId5"/>
-                    <a:stretch>
-                      <a:fillRect/>
-                    </a:stretch>
-                  </pic:blipFill>
-                  <pic:spPr>
-                    <a:xfrm>
-                      <a:off x="0" y="0"/>
-                      <a:ext cx="5802933" cy="3011201"/>
-                    </a:xfrm>
-                    <a:prstGeom prst="rect">
-                      <a:avLst/>
-                    </a:prstGeom>
-                  </pic:spPr>
-                </pic:pic>
-              </a:graphicData>
-            </a:graphic>
-          </wp:inline>
-        </w:drawing>
-      </w:r>
-    </w:p>
-    <w:p>
-      <w:pPr>
-        <w:spacing w:after="0" w:line="360" w:lineRule="auto"/>
-        <w:rPr>
-          <w:rFonts w:ascii="Times New Roman" w:hAnsi="Times New Roman"/>
-          <w:i/>
-          <w:iCs/>
-          <w:sz w:val="20"/>
-          <w:szCs w:val="20"/>
-          <w:lang w:val="pt-BR"/>
-        </w:rPr>
-      </w:pPr>
-    </w:p>
-    <w:p>
-      <w:pPr>
-        <w:spacing w:after="0" w:line="360" w:lineRule="auto"/>
-        <w:jc w:val="both"/>
-        <w:rPr>
-          <w:rFonts w:ascii="Times New Roman" w:hAnsi="Times New Roman"/>
-          <w:lang w:val="pt-BR"/>
-        </w:rPr>
-      </w:pPr>
-      <w:proofErr w:type="gramStart"/>
-      <w:r>
-        <w:rPr>
-          <w:rFonts w:ascii="Times New Roman" w:hAnsi="Times New Roman"/>
-          <w:lang w:val="pt-BR"/>
-        </w:rPr>
-        <w:t xml:space="preserve">As estatísticas descritivas da série </w:t>
-      </w:r>
-      <w:r>
-        <w:rPr>
-          <w:rFonts w:ascii="Times New Roman" w:hAnsi="Times New Roman"/>
-          <w:lang w:val="pt-BR"/>
-        </w:rPr>
-        <w:t xml:space="preserve">temporal </w:t>
-      </w:r>
-      <w:r>
-        <w:rPr>
-          <w:rFonts w:ascii="Times New Roman" w:hAnsi="Times New Roman"/>
-          <w:lang w:val="pt-BR"/>
-        </w:rPr>
-        <w:t>completa</w:t>
-      </w:r>
-      <w:proofErr w:type="gramEnd"/>
-      <w:r>
-        <w:rPr>
-          <w:rFonts w:ascii="Times New Roman" w:hAnsi="Times New Roman"/>
-          <w:lang w:val="pt-BR"/>
-        </w:rPr>
-        <w:t xml:space="preserve"> são: média = 276,07 ha; desvio padrão = 44,27 ha; mínimo = 213,33 ha; máximo = 399,18 ha; mediana = 258,01 ha. A diferença entre média e mediana reflete a assimetria introduzida pelos picos extremos de 2023 e 2024.</w:t>
-      </w:r>
-    </w:p>
-    <w:p>
-      <w:pPr>
-        <w:spacing w:after="0" w:line="360" w:lineRule="auto"/>
-        <w:jc w:val="both"/>
-        <w:rPr>
-          <w:rFonts w:ascii="Times New Roman" w:hAnsi="Times New Roman"/>
-          <w:u w:val="single"/>
-          <w:lang w:val="pt-BR"/>
-        </w:rPr>
-      </w:pPr>
-      <w:r>
-        <w:rPr>
-          <w:rFonts w:ascii="Times New Roman" w:hAnsi="Times New Roman"/>
-          <w:lang w:val="pt-BR"/>
-        </w:rPr>
-        <w:t>O periodograma integrado</w:t>
-      </w:r>
-      <w:r>
-        <w:rPr>
-          <w:rFonts w:ascii="Times New Roman" w:hAnsi="Times New Roman"/>
-          <w:lang w:val="pt-BR"/>
-        </w:rPr>
-        <w:t>, apresentado pela figura 2,</w:t>
-      </w:r>
-      <w:r>
-        <w:rPr>
-          <w:rFonts w:ascii="Times New Roman" w:hAnsi="Times New Roman"/>
-          <w:lang w:val="pt-BR"/>
-        </w:rPr>
-        <w:t xml:space="preserve"> revela picos nas frequências correspondentes a ciclos anuais e semianuais, confirmando sazonalidade com período de 12 meses.</w:t>
-      </w:r>
-    </w:p>
-    <w:p>
-      <w:pPr>
-        <w:pStyle w:val="Legenda"/>
-        <w:keepNext/>
-        <w:jc w:val="center"/>
-        <w:rPr>
-          <w:color w:val="auto"/>
-          <w:lang w:val="pt-BR"/>
-        </w:rPr>
-      </w:pPr>
-      <w:r>
-        <w:rPr>
-          <w:color w:val="auto"/>
-          <w:lang w:val="pt-BR"/>
-        </w:rPr>
-        <w:lastRenderedPageBreak/>
-        <w:t xml:space="preserve">Figura </w:t>
-      </w:r>
-      <w:r>
-        <w:rPr>
-          <w:color w:val="auto"/>
-        </w:rPr>
-        <w:fldChar w:fldCharType="begin"/>
-      </w:r>
-      <w:r>
-        <w:rPr>
-          <w:color w:val="auto"/>
-          <w:lang w:val="pt-BR"/>
-        </w:rPr>
-        <w:instrText xml:space="preserve"> SEQ Figura \* ARABIC </w:instrText>
-      </w:r>
-      <w:r>
-        <w:rPr>
-          <w:color w:val="auto"/>
-        </w:rPr>
-        <w:fldChar w:fldCharType="separate"/>
-      </w:r>
-      <w:r>
-        <w:rPr>
-          <w:noProof/>
-          <w:color w:val="auto"/>
-          <w:lang w:val="pt-BR"/>
-        </w:rPr>
-        <w:t>2</w:t>
-      </w:r>
-      <w:r>
-        <w:rPr>
-          <w:color w:val="auto"/>
-        </w:rPr>
-        <w:fldChar w:fldCharType="end"/>
-      </w:r>
-      <w:r>
-        <w:rPr>
-          <w:color w:val="auto"/>
-          <w:lang w:val="pt-BR"/>
-        </w:rPr>
-        <w:t xml:space="preserve">: </w:t>
-      </w:r>
-      <w:proofErr w:type="spellStart"/>
-      <w:r>
-        <w:rPr>
-          <w:color w:val="auto"/>
-          <w:lang w:val="pt-BR"/>
-        </w:rPr>
-        <w:t>Periodograma</w:t>
-      </w:r>
-      <w:proofErr w:type="spellEnd"/>
-      <w:r>
-        <w:rPr>
-          <w:color w:val="auto"/>
-          <w:lang w:val="pt-BR"/>
-        </w:rPr>
-        <w:t xml:space="preserve"> integrado da série temporal</w:t>
-      </w:r>
-    </w:p>
-    <w:p>
-      <w:pPr>
-        <w:spacing w:after="0" w:line="360" w:lineRule="auto"/>
-        <w:jc w:val="center"/>
-        <w:rPr>
-          <w:rFonts w:ascii="Times New Roman" w:hAnsi="Times New Roman"/>
-          <w:lang w:val="pt-BR"/>
-        </w:rPr>
-      </w:pPr>
-      <w:r>
-        <w:rPr>
-          <w:rFonts w:ascii="Times New Roman" w:hAnsi="Times New Roman"/>
-          <w:lang w:val="pt-BR"/>
-        </w:rPr>
-        <w:drawing>
-          <wp:inline distT="0" distB="0" distL="0" distR="0" wp14:anchorId="07F56EBA" wp14:editId="7146709E">
-            <wp:extent cx="3688080" cy="3001688"/>
-            <wp:effectExtent l="0" t="0" r="7620" b="8255"/>
-            <wp:docPr id="2" name="Imagem 2"/>
-            <wp:cNvGraphicFramePr>
-              <a:graphicFrameLocks xmlns:a="http://schemas.openxmlformats.org/drawingml/2006/main" noChangeAspect="1"/>
-            </wp:cNvGraphicFramePr>
-            <a:graphic xmlns:a="http://schemas.openxmlformats.org/drawingml/2006/main">
-              <a:graphicData uri="http://schemas.openxmlformats.org/drawingml/2006/picture">
-                <pic:pic xmlns:pic="http://schemas.openxmlformats.org/drawingml/2006/picture">
-                  <pic:nvPicPr>
-                    <pic:cNvPr id="1" name=""/>
-                    <pic:cNvPicPr/>
-                  </pic:nvPicPr>
-                  <pic:blipFill>
-                    <a:blip r:embed="rId6"/>
-                    <a:stretch>
-                      <a:fillRect/>
-                    </a:stretch>
-                  </pic:blipFill>
-                  <pic:spPr>
-                    <a:xfrm>
-                      <a:off x="0" y="0"/>
-                      <a:ext cx="3712285" cy="3021388"/>
-                    </a:xfrm>
-                    <a:prstGeom prst="rect">
-                      <a:avLst/>
-                    </a:prstGeom>
-                  </pic:spPr>
-                </pic:pic>
-              </a:graphicData>
-            </a:graphic>
-          </wp:inline>
-        </w:drawing>
-      </w:r>
-    </w:p>
-    <w:p>
-      <w:pPr>
-        <w:spacing w:after="0" w:line="360" w:lineRule="auto"/>
-        <w:jc w:val="center"/>
-        <w:rPr>
-          <w:rFonts w:ascii="Times New Roman" w:hAnsi="Times New Roman"/>
-          <w:lang w:val="pt-BR"/>
-        </w:rPr>
-      </w:pPr>
-    </w:p>
-    <w:p>
-      <w:pPr>
-        <w:spacing w:after="0" w:line="360" w:lineRule="auto"/>
-        <w:jc w:val="both"/>
-        <w:rPr>
-          <w:rFonts w:ascii="Times New Roman" w:hAnsi="Times New Roman"/>
-          <w:lang w:val="pt-BR"/>
-        </w:rPr>
-      </w:pPr>
-      <w:r>
-        <w:rPr>
-          <w:rFonts w:ascii="Times New Roman" w:hAnsi="Times New Roman"/>
-          <w:lang w:val="pt-BR"/>
-        </w:rPr>
-        <w:t>A decomposição clássica</w:t>
-      </w:r>
-      <w:r>
-        <w:rPr>
-          <w:rFonts w:ascii="Times New Roman" w:hAnsi="Times New Roman"/>
-          <w:lang w:val="pt-BR"/>
-        </w:rPr>
-        <w:t>, apresentado no gráfico da figura 3,</w:t>
-      </w:r>
-      <w:r>
-        <w:rPr>
-          <w:rFonts w:ascii="Times New Roman" w:hAnsi="Times New Roman"/>
-          <w:lang w:val="pt-BR"/>
-        </w:rPr>
-        <w:t xml:space="preserve"> evidencia a tendência declinante de longo prazo e uma sazonalidade estável ao longo da maior parte do período. O componente residual mostra aumento de amplitude a partir de 2022. </w:t>
-      </w:r>
-    </w:p>
-    <w:p>
-      <w:pPr>
-        <w:spacing w:after="0" w:line="360" w:lineRule="auto"/>
-        <w:jc w:val="both"/>
-        <w:rPr>
-          <w:rFonts w:ascii="Times New Roman" w:hAnsi="Times New Roman"/>
-          <w:lang w:val="pt-BR"/>
-        </w:rPr>
-      </w:pPr>
-      <w:r>
-        <w:rPr>
-          <w:rFonts w:ascii="Times New Roman" w:hAnsi="Times New Roman"/>
-          <w:lang w:val="pt-BR"/>
-        </w:rPr>
-        <w:t>O Teste ADF resultou em DF = -4,07 (lag = 7; p &lt; 0,01), rejeitando a hipótese nula de raiz unitária. A série é, portanto, estacionária ao nível de 1% de significância.</w:t>
-      </w:r>
-      <w:r>
-        <w:rPr>
-          <w:rFonts w:ascii="Times New Roman" w:hAnsi="Times New Roman"/>
-          <w:lang w:val="pt-BR"/>
-        </w:rPr>
-        <w:t xml:space="preserve"> A função de </w:t>
-      </w:r>
-      <w:proofErr w:type="spellStart"/>
-      <w:proofErr w:type="gramStart"/>
-      <w:r>
-        <w:rPr>
-          <w:rFonts w:ascii="Times New Roman" w:hAnsi="Times New Roman"/>
-          <w:i/>
-          <w:iCs/>
-          <w:lang w:val="pt-BR"/>
-        </w:rPr>
-        <w:t>auto.arrima</w:t>
-      </w:r>
-      <w:proofErr w:type="spellEnd"/>
-      <w:proofErr w:type="gramEnd"/>
-      <w:r>
-        <w:rPr>
-          <w:rFonts w:ascii="Times New Roman" w:hAnsi="Times New Roman"/>
-          <w:i/>
-          <w:iCs/>
-          <w:lang w:val="pt-BR"/>
-        </w:rPr>
-        <w:t>()</w:t>
-      </w:r>
-      <w:r>
-        <w:rPr>
-          <w:rFonts w:ascii="Times New Roman" w:hAnsi="Times New Roman"/>
-          <w:lang w:val="pt-BR"/>
-        </w:rPr>
-        <w:t xml:space="preserve"> aplicada captou esse resultado selecionando d = 0 para a componente não sazonal.</w:t>
-      </w:r>
-    </w:p>
-    <w:p>
-      <w:pPr>
-        <w:pStyle w:val="Legenda"/>
-        <w:keepNext/>
-        <w:jc w:val="center"/>
-        <w:rPr>
-          <w:lang w:val="pt-BR"/>
-        </w:rPr>
-      </w:pPr>
-      <w:r>
-        <w:rPr>
-          <w:lang w:val="pt-BR"/>
-        </w:rPr>
-        <w:lastRenderedPageBreak/>
-        <w:t xml:space="preserve">Figura </w:t>
-      </w:r>
-      <w:r>
-        <w:fldChar w:fldCharType="begin"/>
-      </w:r>
-      <w:r>
-        <w:rPr>
-          <w:lang w:val="pt-BR"/>
-        </w:rPr>
-        <w:instrText xml:space="preserve"> SEQ Figura \* ARABIC </w:instrText>
-      </w:r>
-      <w:r>
-        <w:fldChar w:fldCharType="separate"/>
-      </w:r>
-      <w:r>
-        <w:rPr>
-          <w:noProof/>
-          <w:lang w:val="pt-BR"/>
-        </w:rPr>
-        <w:t>3</w:t>
-      </w:r>
-      <w:r>
-        <w:fldChar w:fldCharType="end"/>
-      </w:r>
-      <w:r>
-        <w:rPr>
-          <w:lang w:val="pt-BR"/>
-        </w:rPr>
-        <w:t>: Decomposição da série Temporal</w:t>
-      </w:r>
-    </w:p>
-    <w:p>
-      <w:pPr>
-        <w:spacing w:after="0" w:line="360" w:lineRule="auto"/>
-        <w:jc w:val="center"/>
-        <w:rPr>
-          <w:rFonts w:ascii="Times New Roman" w:hAnsi="Times New Roman"/>
-          <w:lang w:val="pt-BR"/>
-        </w:rPr>
-      </w:pPr>
-      <w:r>
-        <w:rPr>
-          <w:rFonts w:ascii="Times New Roman" w:hAnsi="Times New Roman"/>
-          <w:lang w:val="pt-BR"/>
-        </w:rPr>
-        <w:drawing>
-          <wp:inline distT="0" distB="0" distL="0" distR="0" wp14:anchorId="50F81A96" wp14:editId="61F1765B">
-            <wp:extent cx="5943600" cy="3888740"/>
-            <wp:effectExtent l="0" t="0" r="0" b="0"/>
-            <wp:docPr id="3" name="Imagem 3"/>
             <wp:cNvGraphicFramePr>
               <a:graphicFrameLocks xmlns:a="http://schemas.openxmlformats.org/drawingml/2006/main" noChangeAspect="1"/>
             </wp:cNvGraphicFramePr>
@@ -2526,6 +2087,481 @@
                   <pic:spPr>
                     <a:xfrm>
                       <a:off x="0" y="0"/>
+                      <a:ext cx="5802933" cy="3011201"/>
+                    </a:xfrm>
+                    <a:prstGeom prst="rect">
+                      <a:avLst/>
+                    </a:prstGeom>
+                  </pic:spPr>
+                </pic:pic>
+              </a:graphicData>
+            </a:graphic>
+          </wp:inline>
+        </w:drawing>
+      </w:r>
+    </w:p>
+    <w:p>
+      <w:pPr>
+        <w:spacing w:after="0" w:line="360" w:lineRule="auto"/>
+        <w:jc w:val="center"/>
+        <w:rPr>
+          <w:rFonts w:ascii="Times New Roman" w:hAnsi="Times New Roman"/>
+          <w:i/>
+          <w:iCs/>
+          <w:sz w:val="20"/>
+          <w:szCs w:val="20"/>
+          <w:lang w:val="pt-BR"/>
+        </w:rPr>
+      </w:pPr>
+      <w:r>
+        <w:rPr>
+          <w:rFonts w:ascii="Times New Roman" w:hAnsi="Times New Roman"/>
+          <w:i/>
+          <w:iCs/>
+          <w:sz w:val="20"/>
+          <w:szCs w:val="20"/>
+          <w:lang w:val="pt-BR"/>
+        </w:rPr>
+        <w:t>Fonte: Autoria própria (2026)</w:t>
+      </w:r>
+    </w:p>
+    <w:p>
+      <w:pPr>
+        <w:spacing w:after="0" w:line="360" w:lineRule="auto"/>
+        <w:jc w:val="both"/>
+        <w:rPr>
+          <w:rFonts w:ascii="Times New Roman" w:hAnsi="Times New Roman"/>
+          <w:lang w:val="pt-BR"/>
+        </w:rPr>
+      </w:pPr>
+      <w:r>
+        <w:rPr>
+          <w:rFonts w:ascii="Times New Roman" w:hAnsi="Times New Roman"/>
+          <w:lang w:val="pt-BR"/>
+        </w:rPr>
+        <w:t xml:space="preserve">As estatísticas descritivas da série </w:t>
+      </w:r>
+      <w:r>
+        <w:rPr>
+          <w:rFonts w:ascii="Times New Roman" w:hAnsi="Times New Roman"/>
+          <w:lang w:val="pt-BR"/>
+        </w:rPr>
+        <w:t xml:space="preserve">temporal </w:t>
+      </w:r>
+      <w:r>
+        <w:rPr>
+          <w:rFonts w:ascii="Times New Roman" w:hAnsi="Times New Roman"/>
+          <w:lang w:val="pt-BR"/>
+        </w:rPr>
+        <w:t>completa são: média = 276,07 ha; desvio padrão = 44,27 ha; mínimo = 213,33 ha; máximo = 399,18 ha; mediana = 258,01 ha. A diferença entre média e mediana reflete a assimetria introduzida pelos picos extremos de 2023 e 2024.</w:t>
+      </w:r>
+    </w:p>
+    <w:p>
+      <w:pPr>
+        <w:spacing w:after="0" w:line="360" w:lineRule="auto"/>
+        <w:jc w:val="both"/>
+        <w:rPr>
+          <w:rFonts w:ascii="Times New Roman" w:hAnsi="Times New Roman"/>
+          <w:u w:val="single"/>
+          <w:lang w:val="pt-BR"/>
+        </w:rPr>
+      </w:pPr>
+      <w:r>
+        <w:rPr>
+          <w:rFonts w:ascii="Times New Roman" w:hAnsi="Times New Roman"/>
+          <w:lang w:val="pt-BR"/>
+        </w:rPr>
+        <w:t>O periodograma integrado</w:t>
+      </w:r>
+      <w:r>
+        <w:rPr>
+          <w:rFonts w:ascii="Times New Roman" w:hAnsi="Times New Roman"/>
+          <w:lang w:val="pt-BR"/>
+        </w:rPr>
+        <w:t>, apresentado pela figura 2,</w:t>
+      </w:r>
+      <w:r>
+        <w:rPr>
+          <w:rFonts w:ascii="Times New Roman" w:hAnsi="Times New Roman"/>
+          <w:lang w:val="pt-BR"/>
+        </w:rPr>
+        <w:t xml:space="preserve"> revela picos nas frequências correspondentes a ciclos anuais e semianuais, confirmando sazonalidade com período de 12 meses.</w:t>
+      </w:r>
+    </w:p>
+    <w:p>
+      <w:pPr>
+        <w:pStyle w:val="Legenda"/>
+        <w:keepNext/>
+        <w:jc w:val="center"/>
+        <w:rPr>
+          <w:color w:val="auto"/>
+          <w:lang w:val="pt-BR"/>
+        </w:rPr>
+      </w:pPr>
+      <w:r>
+        <w:rPr>
+          <w:color w:val="auto"/>
+          <w:sz w:val="20"/>
+          <w:szCs w:val="20"/>
+          <w:lang w:val="pt-BR"/>
+        </w:rPr>
+        <w:lastRenderedPageBreak/>
+        <w:t xml:space="preserve">Figura </w:t>
+      </w:r>
+      <w:r>
+        <w:rPr>
+          <w:color w:val="auto"/>
+          <w:sz w:val="20"/>
+          <w:szCs w:val="20"/>
+        </w:rPr>
+        <w:fldChar w:fldCharType="begin"/>
+      </w:r>
+      <w:r>
+        <w:rPr>
+          <w:color w:val="auto"/>
+          <w:sz w:val="20"/>
+          <w:szCs w:val="20"/>
+          <w:lang w:val="pt-BR"/>
+        </w:rPr>
+        <w:instrText xml:space="preserve"> SEQ Figura \* ARABIC </w:instrText>
+      </w:r>
+      <w:r>
+        <w:rPr>
+          <w:color w:val="auto"/>
+          <w:sz w:val="20"/>
+          <w:szCs w:val="20"/>
+        </w:rPr>
+        <w:fldChar w:fldCharType="separate"/>
+      </w:r>
+      <w:r>
+        <w:rPr>
+          <w:noProof/>
+          <w:color w:val="auto"/>
+          <w:sz w:val="20"/>
+          <w:szCs w:val="20"/>
+          <w:lang w:val="pt-BR"/>
+        </w:rPr>
+        <w:t>2</w:t>
+      </w:r>
+      <w:r>
+        <w:rPr>
+          <w:color w:val="auto"/>
+          <w:sz w:val="20"/>
+          <w:szCs w:val="20"/>
+        </w:rPr>
+        <w:fldChar w:fldCharType="end"/>
+      </w:r>
+      <w:r>
+        <w:rPr>
+          <w:color w:val="auto"/>
+          <w:sz w:val="20"/>
+          <w:szCs w:val="20"/>
+          <w:lang w:val="pt-BR"/>
+        </w:rPr>
+        <w:t xml:space="preserve">: </w:t>
+      </w:r>
+      <w:proofErr w:type="spellStart"/>
+      <w:r>
+        <w:rPr>
+          <w:color w:val="auto"/>
+          <w:sz w:val="20"/>
+          <w:szCs w:val="20"/>
+          <w:lang w:val="pt-BR"/>
+        </w:rPr>
+        <w:t>Periodograma</w:t>
+      </w:r>
+      <w:proofErr w:type="spellEnd"/>
+      <w:r>
+        <w:rPr>
+          <w:color w:val="auto"/>
+          <w:sz w:val="20"/>
+          <w:szCs w:val="20"/>
+          <w:lang w:val="pt-BR"/>
+        </w:rPr>
+        <w:t xml:space="preserve"> integrado da série temporal</w:t>
+      </w:r>
+    </w:p>
+    <w:p>
+      <w:pPr>
+        <w:spacing w:after="0" w:line="360" w:lineRule="auto"/>
+        <w:jc w:val="center"/>
+        <w:rPr>
+          <w:rFonts w:ascii="Times New Roman" w:hAnsi="Times New Roman"/>
+          <w:lang w:val="pt-BR"/>
+        </w:rPr>
+      </w:pPr>
+      <w:r>
+        <w:rPr>
+          <w:rFonts w:ascii="Times New Roman" w:hAnsi="Times New Roman"/>
+          <w:lang w:val="pt-BR"/>
+        </w:rPr>
+        <w:drawing>
+          <wp:inline distT="0" distB="0" distL="0" distR="0" wp14:anchorId="07F56EBA" wp14:editId="7146709E">
+            <wp:extent cx="3688080" cy="3001688"/>
+            <wp:effectExtent l="0" t="0" r="7620" b="8255"/>
+            <wp:docPr id="2" name="Imagem 2"/>
+            <wp:cNvGraphicFramePr>
+              <a:graphicFrameLocks xmlns:a="http://schemas.openxmlformats.org/drawingml/2006/main" noChangeAspect="1"/>
+            </wp:cNvGraphicFramePr>
+            <a:graphic xmlns:a="http://schemas.openxmlformats.org/drawingml/2006/main">
+              <a:graphicData uri="http://schemas.openxmlformats.org/drawingml/2006/picture">
+                <pic:pic xmlns:pic="http://schemas.openxmlformats.org/drawingml/2006/picture">
+                  <pic:nvPicPr>
+                    <pic:cNvPr id="1" name=""/>
+                    <pic:cNvPicPr/>
+                  </pic:nvPicPr>
+                  <pic:blipFill>
+                    <a:blip r:embed="rId8"/>
+                    <a:stretch>
+                      <a:fillRect/>
+                    </a:stretch>
+                  </pic:blipFill>
+                  <pic:spPr>
+                    <a:xfrm>
+                      <a:off x="0" y="0"/>
+                      <a:ext cx="3712285" cy="3021388"/>
+                    </a:xfrm>
+                    <a:prstGeom prst="rect">
+                      <a:avLst/>
+                    </a:prstGeom>
+                  </pic:spPr>
+                </pic:pic>
+              </a:graphicData>
+            </a:graphic>
+          </wp:inline>
+        </w:drawing>
+      </w:r>
+    </w:p>
+    <w:p>
+      <w:pPr>
+        <w:spacing w:after="0" w:line="360" w:lineRule="auto"/>
+        <w:jc w:val="center"/>
+        <w:rPr>
+          <w:rFonts w:ascii="Times New Roman" w:hAnsi="Times New Roman"/>
+          <w:i/>
+          <w:iCs/>
+          <w:sz w:val="20"/>
+          <w:szCs w:val="20"/>
+          <w:lang w:val="pt-BR"/>
+        </w:rPr>
+      </w:pPr>
+      <w:r>
+        <w:rPr>
+          <w:rFonts w:ascii="Times New Roman" w:hAnsi="Times New Roman"/>
+          <w:i/>
+          <w:iCs/>
+          <w:sz w:val="20"/>
+          <w:szCs w:val="20"/>
+          <w:lang w:val="pt-BR"/>
+        </w:rPr>
+        <w:t>Fonte: Autoria própria (2026)</w:t>
+      </w:r>
+    </w:p>
+    <w:p>
+      <w:pPr>
+        <w:spacing w:after="0" w:line="360" w:lineRule="auto"/>
+        <w:jc w:val="center"/>
+        <w:rPr>
+          <w:rFonts w:ascii="Times New Roman" w:hAnsi="Times New Roman"/>
+          <w:lang w:val="pt-BR"/>
+        </w:rPr>
+      </w:pPr>
+    </w:p>
+    <w:p>
+      <w:pPr>
+        <w:spacing w:after="0" w:line="360" w:lineRule="auto"/>
+        <w:jc w:val="both"/>
+        <w:rPr>
+          <w:rFonts w:ascii="Times New Roman" w:hAnsi="Times New Roman"/>
+          <w:lang w:val="pt-BR"/>
+        </w:rPr>
+      </w:pPr>
+      <w:r>
+        <w:rPr>
+          <w:rFonts w:ascii="Times New Roman" w:hAnsi="Times New Roman"/>
+          <w:lang w:val="pt-BR"/>
+        </w:rPr>
+        <w:t>A decomposição clássica</w:t>
+      </w:r>
+      <w:r>
+        <w:rPr>
+          <w:rFonts w:ascii="Times New Roman" w:hAnsi="Times New Roman"/>
+          <w:lang w:val="pt-BR"/>
+        </w:rPr>
+        <w:t>, apresentado no gráfico da figura 3,</w:t>
+      </w:r>
+      <w:r>
+        <w:rPr>
+          <w:rFonts w:ascii="Times New Roman" w:hAnsi="Times New Roman"/>
+          <w:lang w:val="pt-BR"/>
+        </w:rPr>
+        <w:t xml:space="preserve"> evidencia a tendência declinante de longo prazo e uma sazonalidade estável ao longo da maior parte do período. O componente residual mostra aumento de amplitude a partir de 2022. </w:t>
+      </w:r>
+    </w:p>
+    <w:p>
+      <w:pPr>
+        <w:spacing w:after="0" w:line="360" w:lineRule="auto"/>
+        <w:jc w:val="both"/>
+        <w:rPr>
+          <w:rFonts w:ascii="Times New Roman" w:hAnsi="Times New Roman"/>
+          <w:lang w:val="pt-BR"/>
+        </w:rPr>
+      </w:pPr>
+      <w:r>
+        <w:rPr>
+          <w:rFonts w:ascii="Times New Roman" w:hAnsi="Times New Roman"/>
+          <w:lang w:val="pt-BR"/>
+        </w:rPr>
+        <w:t>O Teste ADF resultou em DF = -4,07 (lag = 7; p &lt; 0,01), rejeitando a hipótese nula de raiz unitária. A série é, portanto, estacionária ao nível de 1% de significância.</w:t>
+      </w:r>
+      <w:r>
+        <w:rPr>
+          <w:rFonts w:ascii="Times New Roman" w:hAnsi="Times New Roman"/>
+          <w:lang w:val="pt-BR"/>
+        </w:rPr>
+        <w:t xml:space="preserve"> A função de </w:t>
+      </w:r>
+      <w:proofErr w:type="spellStart"/>
+      <w:r>
+        <w:rPr>
+          <w:rFonts w:ascii="Times New Roman" w:hAnsi="Times New Roman"/>
+          <w:i/>
+          <w:iCs/>
+          <w:lang w:val="pt-BR"/>
+        </w:rPr>
+        <w:t>auto.arrima</w:t>
+      </w:r>
+      <w:proofErr w:type="spellEnd"/>
+      <w:r>
+        <w:rPr>
+          <w:rFonts w:ascii="Times New Roman" w:hAnsi="Times New Roman"/>
+          <w:i/>
+          <w:iCs/>
+          <w:lang w:val="pt-BR"/>
+        </w:rPr>
+        <w:t>()</w:t>
+      </w:r>
+      <w:r>
+        <w:rPr>
+          <w:rFonts w:ascii="Times New Roman" w:hAnsi="Times New Roman"/>
+          <w:lang w:val="pt-BR"/>
+        </w:rPr>
+        <w:t xml:space="preserve"> aplicada captou esse resultado selecionando d = 0 para a componente não sazonal.</w:t>
+      </w:r>
+    </w:p>
+    <w:p>
+      <w:pPr>
+        <w:pStyle w:val="Legenda"/>
+        <w:keepNext/>
+        <w:jc w:val="center"/>
+        <w:rPr>
+          <w:color w:val="auto"/>
+          <w:sz w:val="20"/>
+          <w:szCs w:val="20"/>
+          <w:lang w:val="pt-BR"/>
+        </w:rPr>
+      </w:pPr>
+      <w:r>
+        <w:rPr>
+          <w:color w:val="auto"/>
+          <w:sz w:val="20"/>
+          <w:szCs w:val="20"/>
+          <w:lang w:val="pt-BR"/>
+        </w:rPr>
+        <w:lastRenderedPageBreak/>
+        <w:t xml:space="preserve">Figura </w:t>
+      </w:r>
+      <w:r>
+        <w:rPr>
+          <w:color w:val="auto"/>
+          <w:sz w:val="20"/>
+          <w:szCs w:val="20"/>
+        </w:rPr>
+        <w:fldChar w:fldCharType="begin"/>
+      </w:r>
+      <w:r>
+        <w:rPr>
+          <w:color w:val="auto"/>
+          <w:sz w:val="20"/>
+          <w:szCs w:val="20"/>
+          <w:lang w:val="pt-BR"/>
+        </w:rPr>
+        <w:instrText xml:space="preserve"> SEQ Figura \* ARABIC </w:instrText>
+      </w:r>
+      <w:r>
+        <w:rPr>
+          <w:color w:val="auto"/>
+          <w:sz w:val="20"/>
+          <w:szCs w:val="20"/>
+        </w:rPr>
+        <w:fldChar w:fldCharType="separate"/>
+      </w:r>
+      <w:r>
+        <w:rPr>
+          <w:noProof/>
+          <w:color w:val="auto"/>
+          <w:sz w:val="20"/>
+          <w:szCs w:val="20"/>
+          <w:lang w:val="pt-BR"/>
+        </w:rPr>
+        <w:t>3</w:t>
+      </w:r>
+      <w:r>
+        <w:rPr>
+          <w:color w:val="auto"/>
+          <w:sz w:val="20"/>
+          <w:szCs w:val="20"/>
+        </w:rPr>
+        <w:fldChar w:fldCharType="end"/>
+      </w:r>
+      <w:r>
+        <w:rPr>
+          <w:color w:val="auto"/>
+          <w:sz w:val="20"/>
+          <w:szCs w:val="20"/>
+          <w:lang w:val="pt-BR"/>
+        </w:rPr>
+        <w:t>: Decomposição da série Temporal</w:t>
+      </w:r>
+    </w:p>
+    <w:p>
+      <w:pPr>
+        <w:spacing w:after="0" w:line="360" w:lineRule="auto"/>
+        <w:jc w:val="center"/>
+        <w:rPr>
+          <w:rFonts w:ascii="Times New Roman" w:hAnsi="Times New Roman"/>
+          <w:lang w:val="pt-BR"/>
+        </w:rPr>
+      </w:pPr>
+      <w:r>
+        <w:rPr>
+          <w:rFonts w:ascii="Times New Roman" w:hAnsi="Times New Roman"/>
+          <w:lang w:val="pt-BR"/>
+        </w:rPr>
+        <w:drawing>
+          <wp:inline distT="0" distB="0" distL="0" distR="0" wp14:anchorId="50F81A96" wp14:editId="61F1765B">
+            <wp:extent cx="5943600" cy="3888740"/>
+            <wp:effectExtent l="0" t="0" r="0" b="0"/>
+            <wp:docPr id="3" name="Imagem 3"/>
+            <wp:cNvGraphicFramePr>
+              <a:graphicFrameLocks xmlns:a="http://schemas.openxmlformats.org/drawingml/2006/main" noChangeAspect="1"/>
+            </wp:cNvGraphicFramePr>
+            <a:graphic xmlns:a="http://schemas.openxmlformats.org/drawingml/2006/main">
+              <a:graphicData uri="http://schemas.openxmlformats.org/drawingml/2006/picture">
+                <pic:pic xmlns:pic="http://schemas.openxmlformats.org/drawingml/2006/picture">
+                  <pic:nvPicPr>
+                    <pic:cNvPr id="1" name=""/>
+                    <pic:cNvPicPr/>
+                  </pic:nvPicPr>
+                  <pic:blipFill>
+                    <a:blip r:embed="rId9"/>
+                    <a:stretch>
+                      <a:fillRect/>
+                    </a:stretch>
+                  </pic:blipFill>
+                  <pic:spPr>
+                    <a:xfrm>
+                      <a:off x="0" y="0"/>
                       <a:ext cx="5943600" cy="3888740"/>
                     </a:xfrm>
                     <a:prstGeom prst="rect">
@@ -2538,6 +2574,41 @@
           </wp:inline>
         </w:drawing>
       </w:r>
+    </w:p>
+    <w:p>
+      <w:pPr>
+        <w:spacing w:after="0" w:line="360" w:lineRule="auto"/>
+        <w:jc w:val="center"/>
+        <w:rPr>
+          <w:rFonts w:ascii="Times New Roman" w:hAnsi="Times New Roman"/>
+          <w:i/>
+          <w:iCs/>
+          <w:sz w:val="20"/>
+          <w:szCs w:val="20"/>
+          <w:lang w:val="pt-BR"/>
+        </w:rPr>
+      </w:pPr>
+      <w:r>
+        <w:rPr>
+          <w:rFonts w:ascii="Times New Roman" w:hAnsi="Times New Roman"/>
+          <w:i/>
+          <w:iCs/>
+          <w:sz w:val="20"/>
+          <w:szCs w:val="20"/>
+          <w:lang w:val="pt-BR"/>
+        </w:rPr>
+        <w:t>Fonte: Autoria própria (2026)</w:t>
+      </w:r>
+    </w:p>
+    <w:p>
+      <w:pPr>
+        <w:spacing w:after="0" w:line="360" w:lineRule="auto"/>
+        <w:jc w:val="center"/>
+        <w:rPr>
+          <w:rFonts w:ascii="Times New Roman" w:hAnsi="Times New Roman"/>
+          <w:lang w:val="pt-BR"/>
+        </w:rPr>
+      </w:pPr>
     </w:p>
     <w:p>
       <w:pPr>
@@ -2840,6 +2911,7 @@
           </w:tcPr>
           <w:p>
             <w:r>
+              <w:lastRenderedPageBreak/>
               <w:t>ETS</w:t>
             </w:r>
           </w:p>
@@ -2852,15 +2924,7 @@
           </w:tcPr>
           <w:p>
             <w:r>
-              <w:t>ETS(</w:t>
-            </w:r>
-            <w:proofErr w:type="gramStart"/>
-            <w:r>
-              <w:t>M,N</w:t>
-            </w:r>
-            <w:proofErr w:type="gramEnd"/>
-            <w:r>
-              <w:t>,M): α = 0,3354; γ = 0,3939; σ = 0,041</w:t>
+              <w:t>ETS(M,N,M): α = 0,3354; γ = 0,3939; σ = 0,041</w:t>
             </w:r>
           </w:p>
         </w:tc>
@@ -2869,18 +2933,52 @@
     <w:p>
       <w:pPr>
         <w:spacing w:after="0" w:line="360" w:lineRule="auto"/>
+        <w:jc w:val="center"/>
+        <w:rPr>
+          <w:rFonts w:ascii="Times New Roman" w:hAnsi="Times New Roman"/>
+          <w:i/>
+          <w:iCs/>
+          <w:sz w:val="20"/>
+          <w:szCs w:val="20"/>
+          <w:lang w:val="pt-BR"/>
+        </w:rPr>
+      </w:pPr>
+      <w:r>
+        <w:rPr>
+          <w:rFonts w:ascii="Times New Roman" w:hAnsi="Times New Roman"/>
+          <w:i/>
+          <w:iCs/>
+          <w:sz w:val="20"/>
+          <w:szCs w:val="20"/>
+          <w:lang w:val="pt-BR"/>
+        </w:rPr>
+        <w:t>Fonte: Autoria própria (2026)</w:t>
+      </w:r>
+    </w:p>
+    <w:p>
+      <w:pPr>
+        <w:spacing w:after="0" w:line="360" w:lineRule="auto"/>
         <w:jc w:val="both"/>
         <w:rPr>
           <w:rFonts w:ascii="Times New Roman" w:hAnsi="Times New Roman"/>
           <w:lang w:val="pt-BR"/>
         </w:rPr>
       </w:pPr>
-      <w:r>
-        <w:rPr>
-          <w:rFonts w:ascii="Times New Roman" w:hAnsi="Times New Roman"/>
-          <w:lang w:val="pt-BR"/>
-        </w:rPr>
-        <w:lastRenderedPageBreak/>
+    </w:p>
+    <w:p>
+      <w:pPr>
+        <w:spacing w:after="0" w:line="360" w:lineRule="auto"/>
+        <w:jc w:val="both"/>
+        <w:rPr>
+          <w:rFonts w:ascii="Times New Roman" w:hAnsi="Times New Roman"/>
+          <w:lang w:val="pt-BR"/>
+        </w:rPr>
+      </w:pPr>
+      <w:r>
+        <w:rPr>
+          <w:rFonts w:ascii="Times New Roman" w:hAnsi="Times New Roman"/>
+          <w:lang w:val="pt-BR"/>
+        </w:rPr>
         <w:t xml:space="preserve">O valor de </w:t>
       </w:r>
       <w:r>
@@ -3258,6 +3356,31 @@
     <w:p>
       <w:pPr>
         <w:spacing w:after="0" w:line="360" w:lineRule="auto"/>
+        <w:jc w:val="center"/>
+        <w:rPr>
+          <w:rFonts w:ascii="Times New Roman" w:hAnsi="Times New Roman"/>
+          <w:i/>
+          <w:iCs/>
+          <w:sz w:val="20"/>
+          <w:szCs w:val="20"/>
+          <w:lang w:val="pt-BR"/>
+        </w:rPr>
+      </w:pPr>
+      <w:r>
+        <w:rPr>
+          <w:rFonts w:ascii="Times New Roman" w:hAnsi="Times New Roman"/>
+          <w:i/>
+          <w:iCs/>
+          <w:sz w:val="20"/>
+          <w:szCs w:val="20"/>
+          <w:lang w:val="pt-BR"/>
+        </w:rPr>
+        <w:t>Fonte: Autoria própria (2026)</w:t>
+      </w:r>
+    </w:p>
+    <w:p>
+      <w:pPr>
+        <w:spacing w:after="0" w:line="360" w:lineRule="auto"/>
         <w:rPr>
           <w:rFonts w:ascii="Times New Roman" w:hAnsi="Times New Roman"/>
           <w:lang w:val="pt-BR"/>
@@ -3433,6 +3556,7 @@
           <w:szCs w:val="20"/>
           <w:lang w:val="pt-BR"/>
         </w:rPr>
+        <w:lastRenderedPageBreak/>
         <w:t>Tabela 4. Comparação dos modelos pelo RMSE — base de teste (2020–2024)</w:t>
       </w:r>
     </w:p>
@@ -3564,7 +3688,6 @@
           </w:tcPr>
           <w:p>
             <w:r>
-              <w:lastRenderedPageBreak/>
               <w:t>2º</w:t>
             </w:r>
           </w:p>
@@ -3720,6 +3843,31 @@
     </w:tbl>
     <w:p>
       <w:pPr>
+        <w:spacing w:after="0" w:line="360" w:lineRule="auto"/>
+        <w:jc w:val="center"/>
+        <w:rPr>
+          <w:rFonts w:ascii="Times New Roman" w:hAnsi="Times New Roman"/>
+          <w:i/>
+          <w:iCs/>
+          <w:sz w:val="20"/>
+          <w:szCs w:val="20"/>
+          <w:lang w:val="pt-BR"/>
+        </w:rPr>
+      </w:pPr>
+      <w:r>
+        <w:rPr>
+          <w:rFonts w:ascii="Times New Roman" w:hAnsi="Times New Roman"/>
+          <w:i/>
+          <w:iCs/>
+          <w:sz w:val="20"/>
+          <w:szCs w:val="20"/>
+          <w:lang w:val="pt-BR"/>
+        </w:rPr>
+        <w:t>Fonte: Autoria própria (2026)</w:t>
+      </w:r>
+    </w:p>
+    <w:p>
+      <w:pPr>
         <w:rPr>
           <w:lang w:val="pt-BR"/>
         </w:rPr>
@@ -3923,25 +4071,34 @@
         <w:jc w:val="center"/>
         <w:rPr>
           <w:color w:val="auto"/>
+          <w:sz w:val="20"/>
+          <w:szCs w:val="20"/>
           <w:lang w:val="pt-BR"/>
         </w:rPr>
       </w:pPr>
       <w:r>
         <w:rPr>
           <w:color w:val="auto"/>
-          <w:lang w:val="pt-BR"/>
-        </w:rPr>
+          <w:sz w:val="20"/>
+          <w:szCs w:val="20"/>
+          <w:lang w:val="pt-BR"/>
+        </w:rPr>
+        <w:lastRenderedPageBreak/>
         <w:t xml:space="preserve">Figura </w:t>
       </w:r>
       <w:r>
         <w:rPr>
           <w:color w:val="auto"/>
+          <w:sz w:val="20"/>
+          <w:szCs w:val="20"/>
         </w:rPr>
         <w:fldChar w:fldCharType="begin"/>
       </w:r>
       <w:r>
         <w:rPr>
           <w:color w:val="auto"/>
+          <w:sz w:val="20"/>
+          <w:szCs w:val="20"/>
           <w:lang w:val="pt-BR"/>
         </w:rPr>
         <w:instrText xml:space="preserve"> SEQ Figura \* ARABIC </w:instrText>
@@ -3949,6 +4106,8 @@
       <w:r>
         <w:rPr>
           <w:color w:val="auto"/>
+          <w:sz w:val="20"/>
+          <w:szCs w:val="20"/>
         </w:rPr>
         <w:fldChar w:fldCharType="separate"/>
       </w:r>
@@ -3956,6 +4115,8 @@
         <w:rPr>
           <w:noProof/>
           <w:color w:val="auto"/>
+          <w:sz w:val="20"/>
+          <w:szCs w:val="20"/>
           <w:lang w:val="pt-BR"/>
         </w:rPr>
         <w:t>4</w:t>
@@ -3963,12 +4124,16 @@
       <w:r>
         <w:rPr>
           <w:color w:val="auto"/>
+          <w:sz w:val="20"/>
+          <w:szCs w:val="20"/>
         </w:rPr>
         <w:fldChar w:fldCharType="end"/>
       </w:r>
       <w:r>
         <w:rPr>
           <w:color w:val="auto"/>
+          <w:sz w:val="20"/>
+          <w:szCs w:val="20"/>
           <w:lang w:val="pt-BR"/>
         </w:rPr>
         <w:t>: Previsão SES versus valores reais no período de teste (2020–2024)</w:t>
@@ -4003,7 +4168,7 @@
                     <pic:cNvPicPr/>
                   </pic:nvPicPr>
                   <pic:blipFill>
-                    <a:blip r:embed="rId8"/>
+                    <a:blip r:embed="rId10"/>
                     <a:stretch>
                       <a:fillRect/>
                     </a:stretch>
@@ -4026,6 +4191,31 @@
     </w:p>
     <w:p>
       <w:pPr>
+        <w:spacing w:after="0" w:line="360" w:lineRule="auto"/>
+        <w:jc w:val="center"/>
+        <w:rPr>
+          <w:rFonts w:ascii="Times New Roman" w:hAnsi="Times New Roman"/>
+          <w:i/>
+          <w:iCs/>
+          <w:sz w:val="20"/>
+          <w:szCs w:val="20"/>
+          <w:lang w:val="pt-BR"/>
+        </w:rPr>
+      </w:pPr>
+      <w:r>
+        <w:rPr>
+          <w:rFonts w:ascii="Times New Roman" w:hAnsi="Times New Roman"/>
+          <w:i/>
+          <w:iCs/>
+          <w:sz w:val="20"/>
+          <w:szCs w:val="20"/>
+          <w:lang w:val="pt-BR"/>
+        </w:rPr>
+        <w:t>Fonte: Autoria própria (2026)</w:t>
+      </w:r>
+    </w:p>
+    <w:p>
+      <w:pPr>
         <w:spacing w:after="0" w:line="240" w:lineRule="auto"/>
         <w:jc w:val="center"/>
         <w:rPr>
@@ -4059,26 +4249,33 @@
         <w:jc w:val="center"/>
         <w:rPr>
           <w:color w:val="auto"/>
+          <w:sz w:val="20"/>
+          <w:szCs w:val="20"/>
           <w:lang w:val="pt-BR"/>
         </w:rPr>
       </w:pPr>
       <w:r>
         <w:rPr>
           <w:color w:val="auto"/>
-          <w:lang w:val="pt-BR"/>
-        </w:rPr>
-        <w:lastRenderedPageBreak/>
+          <w:sz w:val="20"/>
+          <w:szCs w:val="20"/>
+          <w:lang w:val="pt-BR"/>
+        </w:rPr>
         <w:t xml:space="preserve">Figura </w:t>
       </w:r>
       <w:r>
         <w:rPr>
           <w:color w:val="auto"/>
+          <w:sz w:val="20"/>
+          <w:szCs w:val="20"/>
         </w:rPr>
         <w:fldChar w:fldCharType="begin"/>
       </w:r>
       <w:r>
         <w:rPr>
           <w:color w:val="auto"/>
+          <w:sz w:val="20"/>
+          <w:szCs w:val="20"/>
           <w:lang w:val="pt-BR"/>
         </w:rPr>
         <w:instrText xml:space="preserve"> SEQ Figura \* ARABIC </w:instrText>
@@ -4086,6 +4283,8 @@
       <w:r>
         <w:rPr>
           <w:color w:val="auto"/>
+          <w:sz w:val="20"/>
+          <w:szCs w:val="20"/>
         </w:rPr>
         <w:fldChar w:fldCharType="separate"/>
       </w:r>
@@ -4093,6 +4292,8 @@
         <w:rPr>
           <w:noProof/>
           <w:color w:val="auto"/>
+          <w:sz w:val="20"/>
+          <w:szCs w:val="20"/>
           <w:lang w:val="pt-BR"/>
         </w:rPr>
         <w:t>5</w:t>
@@ -4100,12 +4301,16 @@
       <w:r>
         <w:rPr>
           <w:color w:val="auto"/>
+          <w:sz w:val="20"/>
+          <w:szCs w:val="20"/>
         </w:rPr>
         <w:fldChar w:fldCharType="end"/>
       </w:r>
       <w:r>
         <w:rPr>
           <w:color w:val="auto"/>
+          <w:sz w:val="20"/>
+          <w:szCs w:val="20"/>
           <w:lang w:val="pt-BR"/>
         </w:rPr>
         <w:t>: Comparativo de todos os modelos versus valores reais (2020-2024)</w:t>
@@ -4149,7 +4354,7 @@
                     <pic:cNvPicPr/>
                   </pic:nvPicPr>
                   <pic:blipFill>
-                    <a:blip r:embed="rId9"/>
+                    <a:blip r:embed="rId11"/>
                     <a:stretch>
                       <a:fillRect/>
                     </a:stretch>
@@ -4173,6 +4378,7 @@
     <w:p>
       <w:pPr>
         <w:spacing w:after="0" w:line="360" w:lineRule="auto"/>
+        <w:jc w:val="center"/>
         <w:rPr>
           <w:rFonts w:ascii="Times New Roman" w:hAnsi="Times New Roman"/>
           <w:i/>
@@ -4182,6 +4388,30 @@
           <w:lang w:val="pt-BR"/>
         </w:rPr>
       </w:pPr>
+      <w:r>
+        <w:rPr>
+          <w:rFonts w:ascii="Times New Roman" w:hAnsi="Times New Roman"/>
+          <w:i/>
+          <w:iCs/>
+          <w:sz w:val="20"/>
+          <w:szCs w:val="20"/>
+          <w:lang w:val="pt-BR"/>
+        </w:rPr>
+        <w:t>Fonte: Autoria própria (2026)</w:t>
+      </w:r>
+    </w:p>
+    <w:p>
+      <w:pPr>
+        <w:spacing w:after="0" w:line="360" w:lineRule="auto"/>
+        <w:rPr>
+          <w:rFonts w:ascii="Times New Roman" w:hAnsi="Times New Roman"/>
+          <w:i/>
+          <w:iCs/>
+          <w:sz w:val="20"/>
+          <w:szCs w:val="20"/>
+          <w:lang w:val="pt-BR"/>
+        </w:rPr>
+      </w:pPr>
     </w:p>
     <w:p>
       <w:pPr>
@@ -4198,6 +4428,7 @@
           <w:rFonts w:ascii="Times New Roman" w:hAnsi="Times New Roman"/>
           <w:lang w:val="pt-BR"/>
         </w:rPr>
+        <w:lastRenderedPageBreak/>
         <w:t xml:space="preserve">A ruptura estrutural observada em 2023 e 2024 é o principal fator explicativo da discrepância entre AIC e RMSE. Os picos históricos registrados extrapolam o regime aprendido pelos modelos na fase de treino. Nesse cenário, o SES mostrou-se mais eficaz por sua simplicidade estrutural, enquanto o ARIMA, embora superior em ajuste na amostra, apresentou menor capacidade de generalização fora da </w:t>
       </w:r>
       <w:r>
@@ -4356,15 +4587,7 @@
           <w:rFonts w:ascii="Times New Roman" w:hAnsi="Times New Roman"/>
           <w:lang w:val="pt-BR"/>
         </w:rPr>
-        <w:t xml:space="preserve">Esse resultado reforça uma lição fundamental da análise preditiva: a qualidade do ajuste dentro da amostra não garante acurácia fora da amostra, especialmente em presença de quebras estruturais. Para trabalhos futuros, recomenda-se investigar as causas hidrometeorológicas dos picos </w:t>
-      </w:r>
-      <w:r>
-        <w:rPr>
-          <w:rFonts w:ascii="Times New Roman" w:hAnsi="Times New Roman"/>
-          <w:lang w:val="pt-BR"/>
-        </w:rPr>
-        <w:lastRenderedPageBreak/>
-        <w:t>observados em 2023 e 2024, aplicar modelos com detecção automática de quebras estruturais e incorporar variáveis como precipitação e temperatura, em modelos mais robustos.</w:t>
+        <w:t>Esse resultado reforça uma lição fundamental da análise preditiva: a qualidade do ajuste dentro da amostra não garante acurácia fora da amostra, especialmente em presença de quebras estruturais. Para trabalhos futuros, recomenda-se investigar as causas hidrometeorológicas dos picos observados em 2023 e 2024, aplicar modelos com detecção automática de quebras estruturais e incorporar variáveis como precipitação e temperatura, em modelos mais robustos.</w:t>
       </w:r>
     </w:p>
     <w:p>
@@ -4577,7 +4800,7 @@
         </w:rPr>
         <w:t xml:space="preserve">(21), 264–290. </w:t>
       </w:r>
-      <w:hyperlink r:id="rId10" w:history="1">
+      <w:hyperlink r:id="rId12" w:history="1">
         <w:r>
           <w:rPr>
             <w:rStyle w:val="Hyperlink"/>
@@ -4712,23 +4935,7 @@
           <w:rFonts w:ascii="Times New Roman" w:hAnsi="Times New Roman"/>
           <w:lang w:val="pt-BR"/>
         </w:rPr>
-        <w:t>DOI: 10.18637/</w:t>
-      </w:r>
-      <w:proofErr w:type="gramStart"/>
-      <w:r>
-        <w:rPr>
-          <w:rFonts w:ascii="Times New Roman" w:hAnsi="Times New Roman"/>
-          <w:lang w:val="pt-BR"/>
-        </w:rPr>
-        <w:t>jss.v027.i</w:t>
-      </w:r>
-      <w:proofErr w:type="gramEnd"/>
-      <w:r>
-        <w:rPr>
-          <w:rFonts w:ascii="Times New Roman" w:hAnsi="Times New Roman"/>
-          <w:lang w:val="pt-BR"/>
-        </w:rPr>
-        <w:t>03.</w:t>
+        <w:t>DOI: 10.18637/jss.v027.i03.</w:t>
       </w:r>
     </w:p>
     <w:p>
@@ -4942,13 +5149,503 @@
       </w:r>
     </w:p>
     <w:sectPr>
+      <w:headerReference w:type="even" r:id="rId13"/>
+      <w:headerReference w:type="default" r:id="rId14"/>
+      <w:headerReference w:type="first" r:id="rId15"/>
+      <w:footerReference w:type="first" r:id="rId16"/>
       <w:pgSz w:w="12240" w:h="15840"/>
       <w:pgMar w:top="1440" w:right="1440" w:bottom="1440" w:left="1440" w:header="720" w:footer="720" w:gutter="0"/>
       <w:cols w:space="720"/>
+      <w:titlePg/>
       <w:docGrid w:linePitch="360"/>
     </w:sectPr>
   </w:body>
 </w:document>
+</file>
+
+<file path=word/endnotes.xml><?xml version="1.0" encoding="utf-8"?>
+<w:endnotes xmlns:wpc="http://schemas.microsoft.com/office/word/2010/wordprocessingCanvas" xmlns:cx="http://schemas.microsoft.com/office/drawing/2014/chartex" xmlns:cx1="http://schemas.microsoft.com/office/drawing/2015/9/8/chartex" xmlns:cx2="http://schemas.microsoft.com/office/drawing/2015/10/21/chartex" xmlns:cx3="http://schemas.microsoft.com/office/drawing/2016/5/9/chartex" xmlns:cx4="http://schemas.microsoft.com/office/drawing/2016/5/10/chartex" xmlns:cx5="http://schemas.microsoft.com/office/drawing/2016/5/11/chartex" xmlns:cx6="http://schemas.microsoft.com/office/drawing/2016/5/12/chartex" xmlns:cx7="http://schemas.microsoft.com/office/drawing/2016/5/13/chartex" xmlns:cx8="http://schemas.microsoft.com/office/drawing/2016/5/14/chartex" xmlns:mc="http://schemas.openxmlformats.org/markup-compatibility/2006" xmlns:aink="http://schemas.microsoft.com/office/drawing/2016/ink" xmlns:am3d="http://schemas.microsoft.com/office/drawing/2017/model3d" xmlns:o="urn:schemas-microsoft-com:office:office" xmlns:oel="http://schemas.microsoft.com/office/2019/extlst" xmlns:r="http://schemas.openxmlformats.org/officeDocument/2006/relationships" xmlns:m="http://schemas.openxmlformats.org/officeDocument/2006/math" xmlns:v="urn:schemas-microsoft-com:vml" xmlns:wp14="http://schemas.microsoft.com/office/word/2010/wordprocessingDrawing" xmlns:wp="http://schemas.openxmlformats.org/drawingml/2006/wordprocessingDrawing" xmlns:w10="urn:schemas-microsoft-com:office:word" xmlns:w="http://schemas.openxmlformats.org/wordprocessingml/2006/main" xmlns:w14="http://schemas.microsoft.com/office/word/2010/wordml" xmlns:w15="http://schemas.microsoft.com/office/word/2012/wordml" xmlns:w16cex="http://schemas.microsoft.com/office/word/2018/wordml/cex" xmlns:w16cid="http://schemas.microsoft.com/office/word/2016/wordml/cid" xmlns:w16="http://schemas.microsoft.com/office/word/2018/wordml" xmlns:w16sdtdh="http://schemas.microsoft.com/office/word/2020/wordml/sdtdatahash" xmlns:w16se="http://schemas.microsoft.com/office/word/2015/wordml/symex" xmlns:wpg="http://schemas.microsoft.com/office/word/2010/wordprocessingGroup" xmlns:wpi="http://schemas.microsoft.com/office/word/2010/wordprocessingInk" xmlns:wne="http://schemas.microsoft.com/office/word/2006/wordml" xmlns:wps="http://schemas.microsoft.com/office/word/2010/wordprocessingShape" mc:Ignorable="w14 w15 w16se w16cid w16 w16cex w16sdtdh wp14">
+  <w:endnote w:type="separator" w:id="-1">
+    <w:p>
+      <w:pPr>
+        <w:spacing w:after="0" w:line="240" w:lineRule="auto"/>
+      </w:pPr>
+      <w:r>
+        <w:separator/>
+      </w:r>
+    </w:p>
+  </w:endnote>
+  <w:endnote w:type="continuationSeparator" w:id="0">
+    <w:p>
+      <w:pPr>
+        <w:spacing w:after="0" w:line="240" w:lineRule="auto"/>
+      </w:pPr>
+      <w:r>
+        <w:continuationSeparator/>
+      </w:r>
+    </w:p>
+  </w:endnote>
+</w:endnotes>
+</file>
+
+<file path=word/footer1.xml><?xml version="1.0" encoding="utf-8"?>
+<w:ftr xmlns:wpc="http://schemas.microsoft.com/office/word/2010/wordprocessingCanvas" xmlns:cx="http://schemas.microsoft.com/office/drawing/2014/chartex" xmlns:cx1="http://schemas.microsoft.com/office/drawing/2015/9/8/chartex" xmlns:cx2="http://schemas.microsoft.com/office/drawing/2015/10/21/chartex" xmlns:cx3="http://schemas.microsoft.com/office/drawing/2016/5/9/chartex" xmlns:cx4="http://schemas.microsoft.com/office/drawing/2016/5/10/chartex" xmlns:cx5="http://schemas.microsoft.com/office/drawing/2016/5/11/chartex" xmlns:cx6="http://schemas.microsoft.com/office/drawing/2016/5/12/chartex" xmlns:cx7="http://schemas.microsoft.com/office/drawing/2016/5/13/chartex" xmlns:cx8="http://schemas.microsoft.com/office/drawing/2016/5/14/chartex" xmlns:mc="http://schemas.openxmlformats.org/markup-compatibility/2006" xmlns:aink="http://schemas.microsoft.com/office/drawing/2016/ink" xmlns:am3d="http://schemas.microsoft.com/office/drawing/2017/model3d" xmlns:o="urn:schemas-microsoft-com:office:office" xmlns:oel="http://schemas.microsoft.com/office/2019/extlst" xmlns:r="http://schemas.openxmlformats.org/officeDocument/2006/relationships" xmlns:m="http://schemas.openxmlformats.org/officeDocument/2006/math" xmlns:v="urn:schemas-microsoft-com:vml" xmlns:wp14="http://schemas.microsoft.com/office/word/2010/wordprocessingDrawing" xmlns:wp="http://schemas.openxmlformats.org/drawingml/2006/wordprocessingDrawing" xmlns:w10="urn:schemas-microsoft-com:office:word" xmlns:w="http://schemas.openxmlformats.org/wordprocessingml/2006/main" xmlns:w14="http://schemas.microsoft.com/office/word/2010/wordml" xmlns:w15="http://schemas.microsoft.com/office/word/2012/wordml" xmlns:w16cex="http://schemas.microsoft.com/office/word/2018/wordml/cex" xmlns:w16cid="http://schemas.microsoft.com/office/word/2016/wordml/cid" xmlns:w16="http://schemas.microsoft.com/office/word/2018/wordml" xmlns:w16sdtdh="http://schemas.microsoft.com/office/word/2020/wordml/sdtdatahash" xmlns:w16se="http://schemas.microsoft.com/office/word/2015/wordml/symex" xmlns:wpg="http://schemas.microsoft.com/office/word/2010/wordprocessingGroup" xmlns:wpi="http://schemas.microsoft.com/office/word/2010/wordprocessingInk" xmlns:wne="http://schemas.microsoft.com/office/word/2006/wordml" xmlns:wps="http://schemas.microsoft.com/office/word/2010/wordprocessingShape" mc:Ignorable="w14 w15 w16se w16cid w16 w16cex w16sdtdh wp14">
+  <w:sdt>
+    <w:sdtPr>
+      <w:id w:val="286402652"/>
+      <w:docPartObj>
+        <w:docPartGallery w:val="Page Numbers (Bottom of Page)"/>
+        <w:docPartUnique/>
+      </w:docPartObj>
+    </w:sdtPr>
+    <w:sdtContent>
+      <w:p>
+        <w:pPr>
+          <w:pStyle w:val="Rodap"/>
+          <w:jc w:val="right"/>
+        </w:pPr>
+        <w:r>
+          <w:rPr>
+            <w:rFonts w:ascii="Calibri" w:hAnsi="Calibri" w:cs="Calibri"/>
+            <w:sz w:val="22"/>
+            <w:szCs w:val="22"/>
+          </w:rPr>
+          <w:fldChar w:fldCharType="begin"/>
+        </w:r>
+        <w:r>
+          <w:rPr>
+            <w:rFonts w:ascii="Calibri" w:hAnsi="Calibri" w:cs="Calibri"/>
+            <w:sz w:val="22"/>
+            <w:szCs w:val="22"/>
+          </w:rPr>
+          <w:instrText>PAGE   \* MERGEFORMAT</w:instrText>
+        </w:r>
+        <w:r>
+          <w:rPr>
+            <w:rFonts w:ascii="Calibri" w:hAnsi="Calibri" w:cs="Calibri"/>
+            <w:sz w:val="22"/>
+            <w:szCs w:val="22"/>
+          </w:rPr>
+          <w:fldChar w:fldCharType="separate"/>
+        </w:r>
+        <w:r>
+          <w:rPr>
+            <w:rFonts w:ascii="Calibri" w:hAnsi="Calibri" w:cs="Calibri"/>
+            <w:sz w:val="22"/>
+            <w:szCs w:val="22"/>
+            <w:lang w:val="pt-BR"/>
+          </w:rPr>
+          <w:t>2</w:t>
+        </w:r>
+        <w:r>
+          <w:rPr>
+            <w:rFonts w:ascii="Calibri" w:hAnsi="Calibri" w:cs="Calibri"/>
+            <w:sz w:val="22"/>
+            <w:szCs w:val="22"/>
+          </w:rPr>
+          <w:fldChar w:fldCharType="end"/>
+        </w:r>
+      </w:p>
+    </w:sdtContent>
+  </w:sdt>
+  <w:p>
+    <w:pPr>
+      <w:pStyle w:val="Rodap"/>
+      <w:rPr>
+        <w:rFonts w:ascii="Calibri" w:hAnsi="Calibri" w:cs="Calibri"/>
+      </w:rPr>
+    </w:pPr>
+  </w:p>
+</w:ftr>
+</file>
+
+<file path=word/footnotes.xml><?xml version="1.0" encoding="utf-8"?>
+<w:footnotes xmlns:wpc="http://schemas.microsoft.com/office/word/2010/wordprocessingCanvas" xmlns:cx="http://schemas.microsoft.com/office/drawing/2014/chartex" xmlns:cx1="http://schemas.microsoft.com/office/drawing/2015/9/8/chartex" xmlns:cx2="http://schemas.microsoft.com/office/drawing/2015/10/21/chartex" xmlns:cx3="http://schemas.microsoft.com/office/drawing/2016/5/9/chartex" xmlns:cx4="http://schemas.microsoft.com/office/drawing/2016/5/10/chartex" xmlns:cx5="http://schemas.microsoft.com/office/drawing/2016/5/11/chartex" xmlns:cx6="http://schemas.microsoft.com/office/drawing/2016/5/12/chartex" xmlns:cx7="http://schemas.microsoft.com/office/drawing/2016/5/13/chartex" xmlns:cx8="http://schemas.microsoft.com/office/drawing/2016/5/14/chartex" xmlns:mc="http://schemas.openxmlformats.org/markup-compatibility/2006" xmlns:aink="http://schemas.microsoft.com/office/drawing/2016/ink" xmlns:am3d="http://schemas.microsoft.com/office/drawing/2017/model3d" xmlns:o="urn:schemas-microsoft-com:office:office" xmlns:oel="http://schemas.microsoft.com/office/2019/extlst" xmlns:r="http://schemas.openxmlformats.org/officeDocument/2006/relationships" xmlns:m="http://schemas.openxmlformats.org/officeDocument/2006/math" xmlns:v="urn:schemas-microsoft-com:vml" xmlns:wp14="http://schemas.microsoft.com/office/word/2010/wordprocessingDrawing" xmlns:wp="http://schemas.openxmlformats.org/drawingml/2006/wordprocessingDrawing" xmlns:w10="urn:schemas-microsoft-com:office:word" xmlns:w="http://schemas.openxmlformats.org/wordprocessingml/2006/main" xmlns:w14="http://schemas.microsoft.com/office/word/2010/wordml" xmlns:w15="http://schemas.microsoft.com/office/word/2012/wordml" xmlns:w16cex="http://schemas.microsoft.com/office/word/2018/wordml/cex" xmlns:w16cid="http://schemas.microsoft.com/office/word/2016/wordml/cid" xmlns:w16="http://schemas.microsoft.com/office/word/2018/wordml" xmlns:w16sdtdh="http://schemas.microsoft.com/office/word/2020/wordml/sdtdatahash" xmlns:w16se="http://schemas.microsoft.com/office/word/2015/wordml/symex" xmlns:wpg="http://schemas.microsoft.com/office/word/2010/wordprocessingGroup" xmlns:wpi="http://schemas.microsoft.com/office/word/2010/wordprocessingInk" xmlns:wne="http://schemas.microsoft.com/office/word/2006/wordml" xmlns:wps="http://schemas.microsoft.com/office/word/2010/wordprocessingShape" mc:Ignorable="w14 w15 w16se w16cid w16 w16cex w16sdtdh wp14">
+  <w:footnote w:type="separator" w:id="-1">
+    <w:p>
+      <w:pPr>
+        <w:spacing w:after="0" w:line="240" w:lineRule="auto"/>
+      </w:pPr>
+      <w:r>
+        <w:separator/>
+      </w:r>
+    </w:p>
+  </w:footnote>
+  <w:footnote w:type="continuationSeparator" w:id="0">
+    <w:p>
+      <w:pPr>
+        <w:spacing w:after="0" w:line="240" w:lineRule="auto"/>
+      </w:pPr>
+      <w:r>
+        <w:continuationSeparator/>
+      </w:r>
+    </w:p>
+  </w:footnote>
+</w:footnotes>
+</file>
+
+<file path=word/header1.xml><?xml version="1.0" encoding="utf-8"?>
+<w:hdr xmlns:wpc="http://schemas.microsoft.com/office/word/2010/wordprocessingCanvas" xmlns:cx="http://schemas.microsoft.com/office/drawing/2014/chartex" xmlns:cx1="http://schemas.microsoft.com/office/drawing/2015/9/8/chartex" xmlns:cx2="http://schemas.microsoft.com/office/drawing/2015/10/21/chartex" xmlns:cx3="http://schemas.microsoft.com/office/drawing/2016/5/9/chartex" xmlns:cx4="http://schemas.microsoft.com/office/drawing/2016/5/10/chartex" xmlns:cx5="http://schemas.microsoft.com/office/drawing/2016/5/11/chartex" xmlns:cx6="http://schemas.microsoft.com/office/drawing/2016/5/12/chartex" xmlns:cx7="http://schemas.microsoft.com/office/drawing/2016/5/13/chartex" xmlns:cx8="http://schemas.microsoft.com/office/drawing/2016/5/14/chartex" xmlns:mc="http://schemas.openxmlformats.org/markup-compatibility/2006" xmlns:aink="http://schemas.microsoft.com/office/drawing/2016/ink" xmlns:am3d="http://schemas.microsoft.com/office/drawing/2017/model3d" xmlns:o="urn:schemas-microsoft-com:office:office" xmlns:oel="http://schemas.microsoft.com/office/2019/extlst" xmlns:r="http://schemas.openxmlformats.org/officeDocument/2006/relationships" xmlns:m="http://schemas.openxmlformats.org/officeDocument/2006/math" xmlns:v="urn:schemas-microsoft-com:vml" xmlns:wp14="http://schemas.microsoft.com/office/word/2010/wordprocessingDrawing" xmlns:wp="http://schemas.openxmlformats.org/drawingml/2006/wordprocessingDrawing" xmlns:w10="urn:schemas-microsoft-com:office:word" xmlns:w="http://schemas.openxmlformats.org/wordprocessingml/2006/main" xmlns:w14="http://schemas.microsoft.com/office/word/2010/wordml" xmlns:w15="http://schemas.microsoft.com/office/word/2012/wordml" xmlns:w16cex="http://schemas.microsoft.com/office/word/2018/wordml/cex" xmlns:w16cid="http://schemas.microsoft.com/office/word/2016/wordml/cid" xmlns:w16="http://schemas.microsoft.com/office/word/2018/wordml" xmlns:w16sdtdh="http://schemas.microsoft.com/office/word/2020/wordml/sdtdatahash" xmlns:w16se="http://schemas.microsoft.com/office/word/2015/wordml/symex" xmlns:wpg="http://schemas.microsoft.com/office/word/2010/wordprocessingGroup" xmlns:wpi="http://schemas.microsoft.com/office/word/2010/wordprocessingInk" xmlns:wne="http://schemas.microsoft.com/office/word/2006/wordml" xmlns:wps="http://schemas.microsoft.com/office/word/2010/wordprocessingShape" mc:Ignorable="w14 w15 w16se w16cid w16 w16cex w16sdtdh wp14">
+  <w:sdt>
+    <w:sdtPr>
+      <w:id w:val="1293020009"/>
+      <w:docPartObj>
+        <w:docPartGallery w:val="Page Numbers (Top of Page)"/>
+        <w:docPartUnique/>
+      </w:docPartObj>
+    </w:sdtPr>
+    <w:sdtEndPr>
+      <w:rPr>
+        <w:rFonts w:ascii="Calibri" w:hAnsi="Calibri" w:cs="Calibri"/>
+        <w:sz w:val="22"/>
+        <w:szCs w:val="22"/>
+      </w:rPr>
+    </w:sdtEndPr>
+    <w:sdtContent>
+      <w:p>
+        <w:pPr>
+          <w:pStyle w:val="Cabealho"/>
+          <w:jc w:val="right"/>
+          <w:rPr>
+            <w:rFonts w:ascii="Calibri" w:hAnsi="Calibri" w:cs="Calibri"/>
+            <w:sz w:val="22"/>
+            <w:szCs w:val="22"/>
+          </w:rPr>
+        </w:pPr>
+        <w:r>
+          <w:rPr>
+            <w:rFonts w:ascii="Calibri" w:hAnsi="Calibri" w:cs="Calibri"/>
+            <w:sz w:val="22"/>
+            <w:szCs w:val="22"/>
+          </w:rPr>
+          <w:fldChar w:fldCharType="begin"/>
+        </w:r>
+        <w:r>
+          <w:rPr>
+            <w:rFonts w:ascii="Calibri" w:hAnsi="Calibri" w:cs="Calibri"/>
+            <w:sz w:val="22"/>
+            <w:szCs w:val="22"/>
+          </w:rPr>
+          <w:instrText>PAGE   \* MERGEFORMAT</w:instrText>
+        </w:r>
+        <w:r>
+          <w:rPr>
+            <w:rFonts w:ascii="Calibri" w:hAnsi="Calibri" w:cs="Calibri"/>
+            <w:sz w:val="22"/>
+            <w:szCs w:val="22"/>
+          </w:rPr>
+          <w:fldChar w:fldCharType="separate"/>
+        </w:r>
+        <w:r>
+          <w:rPr>
+            <w:rFonts w:ascii="Calibri" w:hAnsi="Calibri" w:cs="Calibri"/>
+            <w:sz w:val="22"/>
+            <w:szCs w:val="22"/>
+            <w:lang w:val="pt-BR"/>
+          </w:rPr>
+          <w:t>2</w:t>
+        </w:r>
+        <w:r>
+          <w:rPr>
+            <w:rFonts w:ascii="Calibri" w:hAnsi="Calibri" w:cs="Calibri"/>
+            <w:sz w:val="22"/>
+            <w:szCs w:val="22"/>
+          </w:rPr>
+          <w:fldChar w:fldCharType="end"/>
+        </w:r>
+      </w:p>
+    </w:sdtContent>
+  </w:sdt>
+  <w:p>
+    <w:pPr>
+      <w:pStyle w:val="Cabealho"/>
+    </w:pPr>
+  </w:p>
+</w:hdr>
+</file>
+
+<file path=word/header2.xml><?xml version="1.0" encoding="utf-8"?>
+<w:hdr xmlns:wpc="http://schemas.microsoft.com/office/word/2010/wordprocessingCanvas" xmlns:cx="http://schemas.microsoft.com/office/drawing/2014/chartex" xmlns:cx1="http://schemas.microsoft.com/office/drawing/2015/9/8/chartex" xmlns:cx2="http://schemas.microsoft.com/office/drawing/2015/10/21/chartex" xmlns:cx3="http://schemas.microsoft.com/office/drawing/2016/5/9/chartex" xmlns:cx4="http://schemas.microsoft.com/office/drawing/2016/5/10/chartex" xmlns:cx5="http://schemas.microsoft.com/office/drawing/2016/5/11/chartex" xmlns:cx6="http://schemas.microsoft.com/office/drawing/2016/5/12/chartex" xmlns:cx7="http://schemas.microsoft.com/office/drawing/2016/5/13/chartex" xmlns:cx8="http://schemas.microsoft.com/office/drawing/2016/5/14/chartex" xmlns:mc="http://schemas.openxmlformats.org/markup-compatibility/2006" xmlns:aink="http://schemas.microsoft.com/office/drawing/2016/ink" xmlns:am3d="http://schemas.microsoft.com/office/drawing/2017/model3d" xmlns:o="urn:schemas-microsoft-com:office:office" xmlns:oel="http://schemas.microsoft.com/office/2019/extlst" xmlns:r="http://schemas.openxmlformats.org/officeDocument/2006/relationships" xmlns:m="http://schemas.openxmlformats.org/officeDocument/2006/math" xmlns:v="urn:schemas-microsoft-com:vml" xmlns:wp14="http://schemas.microsoft.com/office/word/2010/wordprocessingDrawing" xmlns:wp="http://schemas.openxmlformats.org/drawingml/2006/wordprocessingDrawing" xmlns:w10="urn:schemas-microsoft-com:office:word" xmlns:w="http://schemas.openxmlformats.org/wordprocessingml/2006/main" xmlns:w14="http://schemas.microsoft.com/office/word/2010/wordml" xmlns:w15="http://schemas.microsoft.com/office/word/2012/wordml" xmlns:w16cex="http://schemas.microsoft.com/office/word/2018/wordml/cex" xmlns:w16cid="http://schemas.microsoft.com/office/word/2016/wordml/cid" xmlns:w16="http://schemas.microsoft.com/office/word/2018/wordml" xmlns:w16sdtdh="http://schemas.microsoft.com/office/word/2020/wordml/sdtdatahash" xmlns:w16se="http://schemas.microsoft.com/office/word/2015/wordml/symex" xmlns:wpg="http://schemas.microsoft.com/office/word/2010/wordprocessingGroup" xmlns:wpi="http://schemas.microsoft.com/office/word/2010/wordprocessingInk" xmlns:wne="http://schemas.microsoft.com/office/word/2006/wordml" xmlns:wps="http://schemas.microsoft.com/office/word/2010/wordprocessingShape" mc:Ignorable="w14 w15 w16se w16cid w16 w16cex w16sdtdh wp14">
+  <w:sdt>
+    <w:sdtPr>
+      <w:id w:val="-1093622965"/>
+      <w:docPartObj>
+        <w:docPartGallery w:val="Page Numbers (Top of Page)"/>
+        <w:docPartUnique/>
+      </w:docPartObj>
+    </w:sdtPr>
+    <w:sdtContent>
+      <w:p>
+        <w:pPr>
+          <w:pStyle w:val="Cabealho"/>
+          <w:jc w:val="right"/>
+        </w:pPr>
+        <w:r>
+          <w:fldChar w:fldCharType="begin"/>
+        </w:r>
+        <w:r>
+          <w:instrText>PAGE   \* MERGEFORMAT</w:instrText>
+        </w:r>
+        <w:r>
+          <w:fldChar w:fldCharType="separate"/>
+        </w:r>
+        <w:r>
+          <w:rPr>
+            <w:lang w:val="pt-BR"/>
+          </w:rPr>
+          <w:t>2</w:t>
+        </w:r>
+        <w:r>
+          <w:fldChar w:fldCharType="end"/>
+        </w:r>
+      </w:p>
+    </w:sdtContent>
+  </w:sdt>
+  <w:p>
+    <w:pPr>
+      <w:pStyle w:val="Cabealho"/>
+    </w:pPr>
+  </w:p>
+</w:hdr>
+</file>
+
+<file path=word/header3.xml><?xml version="1.0" encoding="utf-8"?>
+<w:hdr xmlns:wpc="http://schemas.microsoft.com/office/word/2010/wordprocessingCanvas" xmlns:cx="http://schemas.microsoft.com/office/drawing/2014/chartex" xmlns:cx1="http://schemas.microsoft.com/office/drawing/2015/9/8/chartex" xmlns:cx2="http://schemas.microsoft.com/office/drawing/2015/10/21/chartex" xmlns:cx3="http://schemas.microsoft.com/office/drawing/2016/5/9/chartex" xmlns:cx4="http://schemas.microsoft.com/office/drawing/2016/5/10/chartex" xmlns:cx5="http://schemas.microsoft.com/office/drawing/2016/5/11/chartex" xmlns:cx6="http://schemas.microsoft.com/office/drawing/2016/5/12/chartex" xmlns:cx7="http://schemas.microsoft.com/office/drawing/2016/5/13/chartex" xmlns:cx8="http://schemas.microsoft.com/office/drawing/2016/5/14/chartex" xmlns:mc="http://schemas.openxmlformats.org/markup-compatibility/2006" xmlns:aink="http://schemas.microsoft.com/office/drawing/2016/ink" xmlns:am3d="http://schemas.microsoft.com/office/drawing/2017/model3d" xmlns:o="urn:schemas-microsoft-com:office:office" xmlns:oel="http://schemas.microsoft.com/office/2019/extlst" xmlns:r="http://schemas.openxmlformats.org/officeDocument/2006/relationships" xmlns:m="http://schemas.openxmlformats.org/officeDocument/2006/math" xmlns:v="urn:schemas-microsoft-com:vml" xmlns:wp14="http://schemas.microsoft.com/office/word/2010/wordprocessingDrawing" xmlns:wp="http://schemas.openxmlformats.org/drawingml/2006/wordprocessingDrawing" xmlns:w10="urn:schemas-microsoft-com:office:word" xmlns:w="http://schemas.openxmlformats.org/wordprocessingml/2006/main" xmlns:w14="http://schemas.microsoft.com/office/word/2010/wordml" xmlns:w15="http://schemas.microsoft.com/office/word/2012/wordml" xmlns:w16cex="http://schemas.microsoft.com/office/word/2018/wordml/cex" xmlns:w16cid="http://schemas.microsoft.com/office/word/2016/wordml/cid" xmlns:w16="http://schemas.microsoft.com/office/word/2018/wordml" xmlns:w16sdtdh="http://schemas.microsoft.com/office/word/2020/wordml/sdtdatahash" xmlns:w16se="http://schemas.microsoft.com/office/word/2015/wordml/symex" xmlns:wpg="http://schemas.microsoft.com/office/word/2010/wordprocessingGroup" xmlns:wpi="http://schemas.microsoft.com/office/word/2010/wordprocessingInk" xmlns:wne="http://schemas.microsoft.com/office/word/2006/wordml" xmlns:wps="http://schemas.microsoft.com/office/word/2010/wordprocessingShape" mc:Ignorable="w14 w15 w16se w16cid w16 w16cex w16sdtdh wp14">
+  <w:tbl>
+    <w:tblPr>
+      <w:tblStyle w:val="Tabelacomgrade"/>
+      <w:tblW w:w="9071" w:type="dxa"/>
+      <w:tblLayout w:type="fixed"/>
+      <w:tblCellMar>
+        <w:left w:w="28" w:type="dxa"/>
+        <w:right w:w="28" w:type="dxa"/>
+      </w:tblCellMar>
+      <w:tblLook w:val="04A0" w:firstRow="1" w:lastRow="0" w:firstColumn="1" w:lastColumn="0" w:noHBand="0" w:noVBand="1"/>
+    </w:tblPr>
+    <w:tblGrid>
+      <w:gridCol w:w="1376"/>
+      <w:gridCol w:w="5177"/>
+      <w:gridCol w:w="2518"/>
+    </w:tblGrid>
+    <w:tr>
+      <w:tc>
+        <w:tcPr>
+          <w:tcW w:w="1376" w:type="dxa"/>
+          <w:tcBorders>
+            <w:top w:val="nil"/>
+            <w:left w:val="nil"/>
+            <w:right w:val="nil"/>
+          </w:tcBorders>
+          <w:vAlign w:val="center"/>
+        </w:tcPr>
+        <w:p>
+          <w:pPr>
+            <w:pStyle w:val="Cabealho"/>
+            <w:jc w:val="center"/>
+          </w:pPr>
+          <w:r>
+            <w:rPr>
+              <w:noProof/>
+            </w:rPr>
+            <w:drawing>
+              <wp:inline distT="0" distB="0" distL="0" distR="0" wp14:anchorId="180358D0" wp14:editId="5372EEF1">
+                <wp:extent cx="839470" cy="828040"/>
+                <wp:effectExtent l="0" t="0" r="0" b="0"/>
+                <wp:docPr id="11" name="Imagem 11" descr="Desenho de personagem de desenho animado&#10;&#10;Descrição gerada automaticamente com confiança baixa"/>
+                <wp:cNvGraphicFramePr>
+                  <a:graphicFrameLocks xmlns:a="http://schemas.openxmlformats.org/drawingml/2006/main" noChangeAspect="1"/>
+                </wp:cNvGraphicFramePr>
+                <a:graphic xmlns:a="http://schemas.openxmlformats.org/drawingml/2006/main">
+                  <a:graphicData uri="http://schemas.openxmlformats.org/drawingml/2006/picture">
+                    <pic:pic xmlns:pic="http://schemas.openxmlformats.org/drawingml/2006/picture">
+                      <pic:nvPicPr>
+                        <pic:cNvPr id="2" name="Imagem 2" descr="Desenho de personagem de desenho animado&#10;&#10;Descrição gerada automaticamente com confiança baixa"/>
+                        <pic:cNvPicPr>
+                          <a:picLocks noChangeAspect="1" noChangeArrowheads="1"/>
+                        </pic:cNvPicPr>
+                      </pic:nvPicPr>
+                      <pic:blipFill>
+                        <a:blip r:embed="rId1"/>
+                        <a:stretch>
+                          <a:fillRect/>
+                        </a:stretch>
+                      </pic:blipFill>
+                      <pic:spPr bwMode="auto">
+                        <a:xfrm>
+                          <a:off x="0" y="0"/>
+                          <a:ext cx="839470" cy="828040"/>
+                        </a:xfrm>
+                        <a:prstGeom prst="rect">
+                          <a:avLst/>
+                        </a:prstGeom>
+                      </pic:spPr>
+                    </pic:pic>
+                  </a:graphicData>
+                </a:graphic>
+              </wp:inline>
+            </w:drawing>
+          </w:r>
+        </w:p>
+      </w:tc>
+      <w:tc>
+        <w:tcPr>
+          <w:tcW w:w="5177" w:type="dxa"/>
+          <w:tcBorders>
+            <w:top w:val="nil"/>
+            <w:left w:val="nil"/>
+            <w:right w:val="nil"/>
+          </w:tcBorders>
+        </w:tcPr>
+        <w:p>
+          <w:pPr>
+            <w:pStyle w:val="Cabealho"/>
+            <w:rPr>
+              <w:lang w:val="pt-BR"/>
+            </w:rPr>
+          </w:pPr>
+          <w:r>
+            <w:rPr>
+              <w:lang w:val="pt-BR"/>
+            </w:rPr>
+            <w:t>Ministério da Educação</w:t>
+          </w:r>
+        </w:p>
+        <w:p>
+          <w:pPr>
+            <w:pStyle w:val="Cabealho"/>
+            <w:rPr>
+              <w:lang w:val="pt-BR"/>
+            </w:rPr>
+          </w:pPr>
+          <w:r>
+            <w:rPr>
+              <w:lang w:val="pt-BR"/>
+            </w:rPr>
+            <w:t>Universidade Tecnológica Federal do Paraná</w:t>
+          </w:r>
+        </w:p>
+        <w:p>
+          <w:pPr>
+            <w:pStyle w:val="Cabealho"/>
+            <w:rPr>
+              <w:lang w:val="pt-BR"/>
+            </w:rPr>
+          </w:pPr>
+          <w:r>
+            <w:rPr>
+              <w:i/>
+              <w:iCs/>
+              <w:lang w:val="pt-BR"/>
+            </w:rPr>
+            <w:t>Campus</w:t>
+          </w:r>
+          <w:r>
+            <w:rPr>
+              <w:lang w:val="pt-BR"/>
+            </w:rPr>
+            <w:t xml:space="preserve"> Francisco Beltrão</w:t>
+          </w:r>
+        </w:p>
+        <w:p>
+          <w:pPr>
+            <w:pStyle w:val="Cabealho"/>
+            <w:rPr>
+              <w:lang w:val="pt-BR"/>
+            </w:rPr>
+          </w:pPr>
+          <w:r>
+            <w:rPr>
+              <w:lang w:val="pt-BR"/>
+            </w:rPr>
+            <w:t>Especialização em Métodos Matemáticos Aplicados</w:t>
+          </w:r>
+        </w:p>
+        <w:p>
+          <w:pPr>
+            <w:pStyle w:val="Cabealho"/>
+          </w:pPr>
+          <w:proofErr w:type="spellStart"/>
+          <w:r>
+            <w:t>Séries</w:t>
+          </w:r>
+          <w:proofErr w:type="spellEnd"/>
+          <w:r>
+            <w:t xml:space="preserve"> </w:t>
+          </w:r>
+          <w:proofErr w:type="spellStart"/>
+          <w:r>
+            <w:t>Temporais</w:t>
+          </w:r>
+          <w:proofErr w:type="spellEnd"/>
+        </w:p>
+      </w:tc>
+      <w:tc>
+        <w:tcPr>
+          <w:tcW w:w="2518" w:type="dxa"/>
+          <w:tcBorders>
+            <w:top w:val="nil"/>
+            <w:left w:val="nil"/>
+            <w:right w:val="nil"/>
+          </w:tcBorders>
+          <w:vAlign w:val="center"/>
+        </w:tcPr>
+        <w:p>
+          <w:pPr>
+            <w:pStyle w:val="Cabealho"/>
+            <w:jc w:val="center"/>
+          </w:pPr>
+          <w:r>
+            <w:rPr>
+              <w:noProof/>
+            </w:rPr>
+            <w:drawing>
+              <wp:inline distT="0" distB="0" distL="0" distR="0" wp14:anchorId="7B45630C" wp14:editId="2FF5B8D9">
+                <wp:extent cx="1562100" cy="828040"/>
+                <wp:effectExtent l="0" t="0" r="0" b="0"/>
+                <wp:docPr id="12" name="Imagem 12" descr="Logotipo&#10;&#10;Descrição gerada automaticamente"/>
+                <wp:cNvGraphicFramePr>
+                  <a:graphicFrameLocks xmlns:a="http://schemas.openxmlformats.org/drawingml/2006/main" noChangeAspect="1"/>
+                </wp:cNvGraphicFramePr>
+                <a:graphic xmlns:a="http://schemas.openxmlformats.org/drawingml/2006/main">
+                  <a:graphicData uri="http://schemas.openxmlformats.org/drawingml/2006/picture">
+                    <pic:pic xmlns:pic="http://schemas.openxmlformats.org/drawingml/2006/picture">
+                      <pic:nvPicPr>
+                        <pic:cNvPr id="3" name="Imagem 3" descr="Logotipo&#10;&#10;Descrição gerada automaticamente"/>
+                        <pic:cNvPicPr>
+                          <a:picLocks noChangeAspect="1" noChangeArrowheads="1"/>
+                        </pic:cNvPicPr>
+                      </pic:nvPicPr>
+                      <pic:blipFill>
+                        <a:blip r:embed="rId2"/>
+                        <a:stretch>
+                          <a:fillRect/>
+                        </a:stretch>
+                      </pic:blipFill>
+                      <pic:spPr bwMode="auto">
+                        <a:xfrm>
+                          <a:off x="0" y="0"/>
+                          <a:ext cx="1562100" cy="828040"/>
+                        </a:xfrm>
+                        <a:prstGeom prst="rect">
+                          <a:avLst/>
+                        </a:prstGeom>
+                      </pic:spPr>
+                    </pic:pic>
+                  </a:graphicData>
+                </a:graphic>
+              </wp:inline>
+            </w:drawing>
+          </w:r>
+        </w:p>
+      </w:tc>
+    </w:tr>
+  </w:tbl>
+  <w:p>
+    <w:pPr>
+      <w:pStyle w:val="Cabealho"/>
+    </w:pPr>
+  </w:p>
+</w:hdr>
 </file>
 
 <file path=word/numbering.xml><?xml version="1.0" encoding="utf-8"?>
@@ -5472,6 +6169,7 @@
   <w:style w:type="paragraph" w:default="1" w:styleId="Normal">
     <w:name w:val="Normal"/>
     <w:qFormat/>
+    <w:rsid w:val="008544C0"/>
   </w:style>
   <w:style w:type="paragraph" w:styleId="Ttulo1">
     <w:name w:val="heading 1"/>
@@ -6040,6 +6738,78 @@
       <w:shd w:val="clear" w:color="auto" w:fill="E1DFDD"/>
     </w:rPr>
   </w:style>
+  <w:style w:type="paragraph" w:styleId="Cabealho">
+    <w:name w:val="header"/>
+    <w:basedOn w:val="Normal"/>
+    <w:link w:val="CabealhoChar"/>
+    <w:uiPriority w:val="99"/>
+    <w:unhideWhenUsed/>
+    <w:rsid w:val="008D1601"/>
+    <w:pPr>
+      <w:tabs>
+        <w:tab w:val="center" w:pos="4252"/>
+        <w:tab w:val="right" w:pos="8504"/>
+      </w:tabs>
+      <w:spacing w:after="0" w:line="240" w:lineRule="auto"/>
+    </w:pPr>
+  </w:style>
+  <w:style w:type="character" w:customStyle="1" w:styleId="CabealhoChar">
+    <w:name w:val="Cabeçalho Char"/>
+    <w:basedOn w:val="Fontepargpadro"/>
+    <w:link w:val="Cabealho"/>
+    <w:uiPriority w:val="99"/>
+    <w:qFormat/>
+    <w:rsid w:val="008D1601"/>
+  </w:style>
+  <w:style w:type="paragraph" w:styleId="Rodap">
+    <w:name w:val="footer"/>
+    <w:basedOn w:val="Normal"/>
+    <w:link w:val="RodapChar"/>
+    <w:uiPriority w:val="99"/>
+    <w:unhideWhenUsed/>
+    <w:rsid w:val="008D1601"/>
+    <w:pPr>
+      <w:tabs>
+        <w:tab w:val="center" w:pos="4252"/>
+        <w:tab w:val="right" w:pos="8504"/>
+      </w:tabs>
+      <w:spacing w:after="0" w:line="240" w:lineRule="auto"/>
+    </w:pPr>
+  </w:style>
+  <w:style w:type="character" w:customStyle="1" w:styleId="RodapChar">
+    <w:name w:val="Rodapé Char"/>
+    <w:basedOn w:val="Fontepargpadro"/>
+    <w:link w:val="Rodap"/>
+    <w:uiPriority w:val="99"/>
+    <w:rsid w:val="008D1601"/>
+  </w:style>
+  <w:style w:type="table" w:styleId="Tabelacomgrade">
+    <w:name w:val="Table Grid"/>
+    <w:basedOn w:val="Tabelanormal"/>
+    <w:uiPriority w:val="39"/>
+    <w:rsid w:val="008D1601"/>
+    <w:pPr>
+      <w:suppressAutoHyphens/>
+      <w:spacing w:after="0" w:line="240" w:lineRule="auto"/>
+    </w:pPr>
+    <w:rPr>
+      <w:rFonts w:ascii="Calibri" w:eastAsia="Calibri" w:hAnsi="Calibri" w:cs="Times New Roman"/>
+      <w:kern w:val="0"/>
+      <w:sz w:val="20"/>
+      <w:szCs w:val="20"/>
+      <w14:ligatures w14:val="none"/>
+    </w:rPr>
+    <w:tblPr>
+      <w:tblBorders>
+        <w:top w:val="single" w:sz="4" w:space="0" w:color="auto"/>
+        <w:left w:val="single" w:sz="4" w:space="0" w:color="auto"/>
+        <w:bottom w:val="single" w:sz="4" w:space="0" w:color="auto"/>
+        <w:right w:val="single" w:sz="4" w:space="0" w:color="auto"/>
+        <w:insideH w:val="single" w:sz="4" w:space="0" w:color="auto"/>
+        <w:insideV w:val="single" w:sz="4" w:space="0" w:color="auto"/>
+      </w:tblBorders>
+    </w:tblPr>
+  </w:style>
 </w:styles>
 </file>
 

</xml_diff>